<commit_message>
fix(core): cada ambiente tem a SUA aba, em vez de empilhar abas novas
Relato do dono: ir da produção ao treino e voltar abria uma aba a cada
clique — em poucas idas e voltas o navegador ficava cheio.

- Os cartões do Início deixam de usar target="_blank" e passam a mirar uma
  aba COM NOME (risarte-treino, risarte-sistema, risarte-academy).
- Some o rel="noopener": com ele o navegador ignora o nome e abre uma aba
  nova mesmo assim, que é exatamente o defeito. O destino é sistema nosso
  nos dois lados.
- <NomeDaAba> batiza a aba de cada ambiente ao carregar, para o atalho de
  VOLTA encontrar a aba de origem (a aba aberta pelo endereço ou pelos
  favoritos não tem nome nenhum; e o navegador apaga o nome ao trocar de
  site, então cada ambiente batiza a sua).

Conferido no navegador: três cliques no mesmo cartão, uma aba só.

Co-Authored-By: Claude Opus 5 <noreply@anthropic.com>
</commit_message>
<xml_diff>
--- a/docs/treinamento/Manual-de-Treinamento-riSZon.docx
+++ b/docs/treinamento/Manual-de-Treinamento-riSZon.docx
@@ -8151,7 +8151,25 @@
           <w:sz w:val="21"/>
           <w:szCs w:val="21"/>
         </w:rPr>
-        <w:t xml:space="preserve"> Lá aparecem os atalhos para o treino e para o Academy — eles abrem em outra aba.</w:t>
+        <w:t xml:space="preserve"> Lá aparecem os atalhos para o treino e para o Academy — cada um abre em </w:t>
+      </w:r>
+      <w:r>
+        <w:rPr>
+          <w:b/>
+          <w:bCs/>
+          <w:color w:val="23293D"/>
+          <w:sz w:val="21"/>
+          <w:szCs w:val="21"/>
+        </w:rPr>
+        <w:t xml:space="preserve">uma aba própria</w:t>
+      </w:r>
+      <w:r>
+        <w:rPr>
+          <w:color w:val="23293D"/>
+          <w:sz w:val="21"/>
+          <w:szCs w:val="21"/>
+        </w:rPr>
+        <w:t xml:space="preserve">. Clicar de novo volta para a aba que já está aberta, em vez de abrir outra: dá para ir e voltar o dia inteiro sem encher o navegador.</w:t>
       </w:r>
     </w:p>
     <w:p>

</xml_diff>

<commit_message>
fix(core): a faixa do treino fica visível o tempo todo
Relato do dono: rolando a tela no treino, a faixa amarela sumia — e aí
nada dizia que aquele não era o sistema de verdade. Aviso que some é
aviso que não existe justamente quando alguém está trabalhando.

- A faixa virou `sticky top-0 z-40`.
- A barra de cima e a barra lateral descem a altura dela por
  `--faixa-treino` (globals.css), ligada por `data-ambiente` no body. Na
  produção a medida é zero e nada muda — sem condição espalhada nas telas.
- A lateral também encolhe a mesma altura, senão o rodapé dela (versão e
  Sair) cairia para fora da tela.

Conferido no navegador, em ambiente de treino, rolando a tela: faixa em
y=0, barra em y=28, lateral em y=28 e a assinatura sem ser coberta.

Co-Authored-By: Claude Opus 5 <noreply@anthropic.com>
</commit_message>
<xml_diff>
--- a/docs/treinamento/Manual-de-Treinamento-riSZon.docx
+++ b/docs/treinamento/Manual-de-Treinamento-riSZon.docx
@@ -8059,7 +8059,25 @@
                 <w:sz w:val="20"/>
                 <w:szCs w:val="20"/>
               </w:rPr>
-              <w:t xml:space="preserve">, para aprender sem medo</w:t>
+              <w:t xml:space="preserve">, para aprender sem medo. A </w:t>
+            </w:r>
+            <w:r>
+              <w:rPr>
+                <w:b/>
+                <w:bCs/>
+                <w:color w:val="23293D"/>
+                <w:sz w:val="20"/>
+                <w:szCs w:val="20"/>
+              </w:rPr>
+              <w:t xml:space="preserve">faixa amarela fica no topo o tempo todo</w:t>
+            </w:r>
+            <w:r>
+              <w:rPr>
+                <w:color w:val="23293D"/>
+                <w:sz w:val="20"/>
+                <w:szCs w:val="20"/>
+              </w:rPr>
+              <w:t xml:space="preserve">, mesmo rolando a tela — se ela estiver lá, você não está no sistema de verdade</w:t>
             </w:r>
           </w:p>
         </w:tc>

</xml_diff>

<commit_message>
fix(core): no treino, o nível de carreira do dentista continua editável (0261)
O career_level_id mora no registro da função, que a 0260 trancou no treino
— e é configuração financeira de cada ambiente, não acesso. A trava passa a
deixar a mudança que mexe só nele, e a cópia preserva o nível que já estiver
no treino. Provado no banco do treino: nível muda; função (sozinha ou com
nível) segue recusada.

Co-Authored-By: Claude Opus 5 <noreply@anthropic.com>
</commit_message>
<xml_diff>
--- a/docs/treinamento/Manual-de-Treinamento-riSZon.docx
+++ b/docs/treinamento/Manual-de-Treinamento-riSZon.docx
@@ -8867,6 +8867,34 @@
           <w:szCs w:val="21"/>
         </w:rPr>
         <w:t xml:space="preserve">.</w:t>
+      </w:r>
+    </w:p>
+    <w:p>
+      <w:pPr>
+        <w:pStyle w:val="ListParagraph"/>
+        <w:numPr>
+          <w:ilvl w:val="0"/>
+          <w:numId w:val="7"/>
+        </w:numPr>
+        <w:spacing w:after="80" w:line="270"/>
+      </w:pPr>
+      <w:r>
+        <w:rPr>
+          <w:b/>
+          <w:bCs/>
+          <w:color w:val="23293D"/>
+          <w:sz w:val="21"/>
+          <w:szCs w:val="21"/>
+        </w:rPr>
+        <w:t xml:space="preserve">Exceção: o nível de carreira do dentista</w:t>
+      </w:r>
+      <w:r>
+        <w:rPr>
+          <w:color w:val="23293D"/>
+          <w:sz w:val="21"/>
+          <w:szCs w:val="21"/>
+        </w:rPr>
+        <w:t xml:space="preserve"> (Financeiro → Repasses) é do treino, como as tabelas de repasse: define-se lá mesmo, e a cópia não apaga o que foi definido.</w:t>
       </w:r>
     </w:p>
     <w:p>

</xml_diff>

<commit_message>
fix(core): sincronizar o treino não para em numeração RIS- ocupada por ficha local
A primeira sincronização parou em "gravar a ficha no treino (código 23505)":
o treino tinha 5 fichas criadas lá antes da 0260, com a mesma numeração da
produção para pessoas diferentes (conferido sem expor dado: CPF e e-mail não
batem; nenhum cliente ligado). A cópia passa a renomear a ficha LOCAL que
ocupa o número (-TREINO) antes de gravar a da produção; nada é apagado.
Duas fichas copiadas com o mesmo número param a cópia com aviso.

Co-Authored-By: Claude Opus 5 <noreply@anthropic.com>
</commit_message>
<xml_diff>
--- a/docs/treinamento/Manual-de-Treinamento-riSZon.docx
+++ b/docs/treinamento/Manual-de-Treinamento-riSZon.docx
@@ -180,7 +180,7 @@
           <w:sz w:val="20"/>
           <w:szCs w:val="20"/>
         </w:rPr>
-        <w:t xml:space="preserve">18 de setembro de 2026</w:t>
+        <w:t xml:space="preserve">19 de setembro de 2026</w:t>
       </w:r>
     </w:p>
     <w:p>
@@ -8949,6 +8949,70 @@
           <w:szCs w:val="21"/>
         </w:rPr>
         <w:t xml:space="preserve"> na lista de Risartanos: eles não são pessoas da equipe.</w:t>
+      </w:r>
+    </w:p>
+    <w:p>
+      <w:pPr>
+        <w:pStyle w:val="ListParagraph"/>
+        <w:numPr>
+          <w:ilvl w:val="0"/>
+          <w:numId w:val="7"/>
+        </w:numPr>
+        <w:spacing w:after="80" w:line="270"/>
+      </w:pPr>
+      <w:r>
+        <w:rPr>
+          <w:b/>
+          <w:bCs/>
+          <w:color w:val="23293D"/>
+          <w:sz w:val="21"/>
+          <w:szCs w:val="21"/>
+        </w:rPr>
+        <w:t xml:space="preserve">Fichas criadas no treino antes desta mudança</w:t>
+      </w:r>
+      <w:r>
+        <w:rPr>
+          <w:color w:val="23293D"/>
+          <w:sz w:val="21"/>
+          <w:szCs w:val="21"/>
+        </w:rPr>
+        <w:t xml:space="preserve"> (cadastros de teste) também saem da lista. Se o número delas coincidia com uma ficha do sistema real, elas ganharam o final </w:t>
+      </w:r>
+      <w:r>
+        <w:rPr>
+          <w:b/>
+          <w:bCs/>
+          <w:color w:val="23293D"/>
+          <w:sz w:val="21"/>
+          <w:szCs w:val="21"/>
+        </w:rPr>
+        <w:t xml:space="preserve">-TREINO</w:t>
+      </w:r>
+      <w:r>
+        <w:rPr>
+          <w:color w:val="23293D"/>
+          <w:sz w:val="21"/>
+          <w:szCs w:val="21"/>
+        </w:rPr>
+        <w:t xml:space="preserve"> (ex.: </w:t>
+      </w:r>
+      <w:r>
+        <w:rPr>
+          <w:rFonts w:ascii="Consolas" w:cs="Consolas" w:eastAsia="Consolas" w:hAnsi="Consolas"/>
+          <w:color w:val="1F3253"/>
+          <w:sz w:val="19"/>
+          <w:szCs w:val="19"/>
+          <w:shd w:fill="EFEDE6" w:color="auto" w:val="clear"/>
+        </w:rPr>
+        <w:t xml:space="preserve">RIS-000001-TREINO</w:t>
+      </w:r>
+      <w:r>
+        <w:rPr>
+          <w:color w:val="23293D"/>
+          <w:sz w:val="21"/>
+          <w:szCs w:val="21"/>
+        </w:rPr>
+        <w:t xml:space="preserve">); nada foi apagado.</w:t>
       </w:r>
     </w:p>
     <w:p>

</xml_diff>

<commit_message>
feat(core): tela de novidades com busca e filtros; Administração recolhe na lateral
Pedido do dono (19/09). O Início mostrava as 57 entregas inteiras — "uma
lista muito extensa": ficou com as 3 últimas e ganhou "Ver todas as
novidades". A tela /novidades traz busca por palavra (sem acento/caixa,
filtrando linha a linha), filtro por tipo e por ano e páginas de 10; regras
puras com 11 testes. Na lateral, "Administração" virou botão que abre/fecha,
fechado por padrão, aberto sozinho em /admin e com a barra minimizada.

Co-Authored-By: Claude Opus 5 <noreply@anthropic.com>
</commit_message>
<xml_diff>
--- a/docs/treinamento/Manual-de-Treinamento-riSZon.docx
+++ b/docs/treinamento/Manual-de-Treinamento-riSZon.docx
@@ -180,7 +180,7 @@
           <w:sz w:val="20"/>
           <w:szCs w:val="20"/>
         </w:rPr>
-        <w:t xml:space="preserve">19 de setembro de 2026</w:t>
+        <w:t xml:space="preserve">20 de setembro de 2026</w:t>
       </w:r>
     </w:p>
     <w:p>
@@ -2737,7 +2737,43 @@
           <w:sz w:val="21"/>
           <w:szCs w:val="21"/>
         </w:rPr>
-        <w:t xml:space="preserve"> — as novidades da sua função. Ver </w:t>
+        <w:t xml:space="preserve"> — as </w:t>
+      </w:r>
+      <w:r>
+        <w:rPr>
+          <w:b/>
+          <w:bCs/>
+          <w:color w:val="23293D"/>
+          <w:sz w:val="21"/>
+          <w:szCs w:val="21"/>
+        </w:rPr>
+        <w:t xml:space="preserve">três últimas</w:t>
+      </w:r>
+      <w:r>
+        <w:rPr>
+          <w:color w:val="23293D"/>
+          <w:sz w:val="21"/>
+          <w:szCs w:val="21"/>
+        </w:rPr>
+        <w:t xml:space="preserve"> entregas que alcançam a sua função. A lista completa, com busca e filtros, está em </w:t>
+      </w:r>
+      <w:r>
+        <w:rPr>
+          <w:b/>
+          <w:bCs/>
+          <w:color w:val="23293D"/>
+          <w:sz w:val="21"/>
+          <w:szCs w:val="21"/>
+        </w:rPr>
+        <w:t xml:space="preserve">Ver todas as novidades</w:t>
+      </w:r>
+      <w:r>
+        <w:rPr>
+          <w:color w:val="23293D"/>
+          <w:sz w:val="21"/>
+          <w:szCs w:val="21"/>
+        </w:rPr>
+        <w:t xml:space="preserve"> (ou no ícone ✨ da barra de cima). Ver </w:t>
       </w:r>
       <w:r>
         <w:rPr>
@@ -28900,7 +28936,25 @@
           <w:sz w:val="21"/>
           <w:szCs w:val="21"/>
         </w:rPr>
-        <w:t xml:space="preserve"> só aparece para o Admin Master. Há um botão para </w:t>
+        <w:t xml:space="preserve"> só aparece para o Admin Master e vem </w:t>
+      </w:r>
+      <w:r>
+        <w:rPr>
+          <w:b/>
+          <w:bCs/>
+          <w:color w:val="23293D"/>
+          <w:sz w:val="21"/>
+          <w:szCs w:val="21"/>
+        </w:rPr>
+        <w:t xml:space="preserve">fechado</w:t>
+      </w:r>
+      <w:r>
+        <w:rPr>
+          <w:color w:val="23293D"/>
+          <w:sz w:val="21"/>
+          <w:szCs w:val="21"/>
+        </w:rPr>
+        <w:t xml:space="preserve">: clique no título "Administração" para abrir ou fechar (a seta mostra como está), e o sistema lembra a sua escolha. Numa tela de administração ele abre sozinho. Há também um botão para </w:t>
       </w:r>
       <w:r>
         <w:rPr>
@@ -41411,6 +41465,208 @@
           <w:sz w:val="21"/>
           <w:szCs w:val="21"/>
         </w:rPr>
+        <w:t xml:space="preserve">Onde procurar (desde 19/09/2026).</w:t>
+      </w:r>
+      <w:r>
+        <w:rPr>
+          <w:color w:val="23293D"/>
+          <w:sz w:val="21"/>
+          <w:szCs w:val="21"/>
+        </w:rPr>
+        <w:t xml:space="preserve"> O Início mostra só as </w:t>
+      </w:r>
+      <w:r>
+        <w:rPr>
+          <w:b/>
+          <w:bCs/>
+          <w:color w:val="23293D"/>
+          <w:sz w:val="21"/>
+          <w:szCs w:val="21"/>
+        </w:rPr>
+        <w:t xml:space="preserve">três últimas</w:t>
+      </w:r>
+      <w:r>
+        <w:rPr>
+          <w:color w:val="23293D"/>
+          <w:sz w:val="21"/>
+          <w:szCs w:val="21"/>
+        </w:rPr>
+        <w:t xml:space="preserve"> entregas — antes mostrava todas, e a tela virava uma lista enorme. A lista completa fica na tela </w:t>
+      </w:r>
+      <w:r>
+        <w:rPr>
+          <w:b/>
+          <w:bCs/>
+          <w:color w:val="23293D"/>
+          <w:sz w:val="21"/>
+          <w:szCs w:val="21"/>
+        </w:rPr>
+        <w:t xml:space="preserve">Novidades</w:t>
+      </w:r>
+      <w:r>
+        <w:rPr>
+          <w:color w:val="23293D"/>
+          <w:sz w:val="21"/>
+          <w:szCs w:val="21"/>
+        </w:rPr>
+        <w:t xml:space="preserve">, pelo botão </w:t>
+      </w:r>
+      <w:r>
+        <w:rPr>
+          <w:b/>
+          <w:bCs/>
+          <w:color w:val="23293D"/>
+          <w:sz w:val="21"/>
+          <w:szCs w:val="21"/>
+        </w:rPr>
+        <w:t xml:space="preserve">Ver todas as novidades</w:t>
+      </w:r>
+      <w:r>
+        <w:rPr>
+          <w:color w:val="23293D"/>
+          <w:sz w:val="21"/>
+          <w:szCs w:val="21"/>
+        </w:rPr>
+        <w:t xml:space="preserve"> ou pelo ícone ✨ da barra de cima. Lá você tem:</w:t>
+      </w:r>
+    </w:p>
+    <w:p>
+      <w:pPr>
+        <w:pStyle w:val="ListParagraph"/>
+        <w:numPr>
+          <w:ilvl w:val="0"/>
+          <w:numId w:val="45"/>
+        </w:numPr>
+        <w:spacing w:after="80" w:line="270"/>
+      </w:pPr>
+      <w:r>
+        <w:rPr>
+          <w:b/>
+          <w:bCs/>
+          <w:color w:val="23293D"/>
+          <w:sz w:val="21"/>
+          <w:szCs w:val="21"/>
+        </w:rPr>
+        <w:t xml:space="preserve">busca por palavra</w:t>
+      </w:r>
+      <w:r>
+        <w:rPr>
+          <w:color w:val="23293D"/>
+          <w:sz w:val="21"/>
+          <w:szCs w:val="21"/>
+        </w:rPr>
+        <w:t xml:space="preserve"> (ignora acento e maiúscula: "correcao" acha "correção"), que mostra só as linhas que casam, não a entrega inteira;</w:t>
+      </w:r>
+    </w:p>
+    <w:p>
+      <w:pPr>
+        <w:pStyle w:val="ListParagraph"/>
+        <w:numPr>
+          <w:ilvl w:val="0"/>
+          <w:numId w:val="45"/>
+        </w:numPr>
+        <w:spacing w:after="80" w:line="270"/>
+      </w:pPr>
+      <w:r>
+        <w:rPr>
+          <w:b/>
+          <w:bCs/>
+          <w:color w:val="23293D"/>
+          <w:sz w:val="21"/>
+          <w:szCs w:val="21"/>
+        </w:rPr>
+        <w:t xml:space="preserve">filtro por tipo</w:t>
+      </w:r>
+      <w:r>
+        <w:rPr>
+          <w:color w:val="23293D"/>
+          <w:sz w:val="21"/>
+          <w:szCs w:val="21"/>
+        </w:rPr>
+        <w:t xml:space="preserve"> (Novidade, Melhoria, Correção, Atenção);</w:t>
+      </w:r>
+    </w:p>
+    <w:p>
+      <w:pPr>
+        <w:pStyle w:val="ListParagraph"/>
+        <w:numPr>
+          <w:ilvl w:val="0"/>
+          <w:numId w:val="45"/>
+        </w:numPr>
+        <w:spacing w:after="80" w:line="270"/>
+      </w:pPr>
+      <w:r>
+        <w:rPr>
+          <w:b/>
+          <w:bCs/>
+          <w:color w:val="23293D"/>
+          <w:sz w:val="21"/>
+          <w:szCs w:val="21"/>
+        </w:rPr>
+        <w:t xml:space="preserve">filtro por ano</w:t>
+      </w:r>
+      <w:r>
+        <w:rPr>
+          <w:color w:val="23293D"/>
+          <w:sz w:val="21"/>
+          <w:szCs w:val="21"/>
+        </w:rPr>
+        <w:t xml:space="preserve">;</w:t>
+      </w:r>
+    </w:p>
+    <w:p>
+      <w:pPr>
+        <w:pStyle w:val="ListParagraph"/>
+        <w:numPr>
+          <w:ilvl w:val="0"/>
+          <w:numId w:val="45"/>
+        </w:numPr>
+        <w:spacing w:after="80" w:line="270"/>
+      </w:pPr>
+      <w:r>
+        <w:rPr>
+          <w:b/>
+          <w:bCs/>
+          <w:color w:val="23293D"/>
+          <w:sz w:val="21"/>
+          <w:szCs w:val="21"/>
+        </w:rPr>
+        <w:t xml:space="preserve">páginas</w:t>
+      </w:r>
+      <w:r>
+        <w:rPr>
+          <w:color w:val="23293D"/>
+          <w:sz w:val="21"/>
+          <w:szCs w:val="21"/>
+        </w:rPr>
+        <w:t xml:space="preserve"> de 10 entregas, com "Mais recentes" e "Mais antigas".</w:t>
+      </w:r>
+    </w:p>
+    <w:p>
+      <w:pPr>
+        <w:spacing w:after="140" w:line="280"/>
+      </w:pPr>
+      <w:r>
+        <w:rPr>
+          <w:color w:val="23293D"/>
+          <w:sz w:val="21"/>
+          <w:szCs w:val="21"/>
+        </w:rPr>
+        <w:t xml:space="preserve">Os filtros aplicam-se sozinhos e ficam no endereço: dá para mandar o link de uma busca para outra pessoa.</w:t>
+      </w:r>
+    </w:p>
+    <w:p>
+      <w:pPr>
+        <w:spacing w:after="140" w:line="280"/>
+      </w:pPr>
+      <w:r>
+        <w:rPr>
+          <w:b/>
+          <w:bCs/>
+          <w:color w:val="23293D"/>
+          <w:sz w:val="21"/>
+          <w:szCs w:val="21"/>
+        </w:rPr>
         <w:t xml:space="preserve">Aparece o que alcança a SUA função.</w:t>
       </w:r>
       <w:r>
@@ -43122,7 +43378,7 @@
         <w:pStyle w:val="ListParagraph"/>
         <w:numPr>
           <w:ilvl w:val="0"/>
-          <w:numId w:val="45"/>
+          <w:numId w:val="46"/>
         </w:numPr>
         <w:spacing w:after="80" w:line="270"/>
       </w:pPr>
@@ -43150,7 +43406,7 @@
         <w:pStyle w:val="ListParagraph"/>
         <w:numPr>
           <w:ilvl w:val="0"/>
-          <w:numId w:val="45"/>
+          <w:numId w:val="46"/>
         </w:numPr>
         <w:spacing w:after="80" w:line="270"/>
       </w:pPr>
@@ -43178,7 +43434,7 @@
         <w:pStyle w:val="ListParagraph"/>
         <w:numPr>
           <w:ilvl w:val="0"/>
-          <w:numId w:val="45"/>
+          <w:numId w:val="46"/>
         </w:numPr>
         <w:spacing w:after="80" w:line="270"/>
       </w:pPr>
@@ -43399,7 +43655,7 @@
         <w:pStyle w:val="ListParagraph"/>
         <w:numPr>
           <w:ilvl w:val="0"/>
-          <w:numId w:val="46"/>
+          <w:numId w:val="47"/>
         </w:numPr>
         <w:spacing w:after="80" w:line="270"/>
       </w:pPr>
@@ -43463,7 +43719,7 @@
         <w:pStyle w:val="ListParagraph"/>
         <w:numPr>
           <w:ilvl w:val="0"/>
-          <w:numId w:val="46"/>
+          <w:numId w:val="47"/>
         </w:numPr>
         <w:spacing w:after="80" w:line="270"/>
       </w:pPr>
@@ -45245,7 +45501,7 @@
         <w:pStyle w:val="ListParagraph"/>
         <w:numPr>
           <w:ilvl w:val="0"/>
-          <w:numId w:val="47"/>
+          <w:numId w:val="48"/>
         </w:numPr>
         <w:spacing w:after="80" w:line="270"/>
       </w:pPr>
@@ -45281,7 +45537,7 @@
         <w:pStyle w:val="ListParagraph"/>
         <w:numPr>
           <w:ilvl w:val="0"/>
-          <w:numId w:val="47"/>
+          <w:numId w:val="48"/>
         </w:numPr>
         <w:spacing w:after="80" w:line="270"/>
       </w:pPr>
@@ -45317,7 +45573,7 @@
         <w:pStyle w:val="ListParagraph"/>
         <w:numPr>
           <w:ilvl w:val="0"/>
-          <w:numId w:val="47"/>
+          <w:numId w:val="48"/>
         </w:numPr>
         <w:spacing w:after="80" w:line="270"/>
       </w:pPr>
@@ -45363,7 +45619,7 @@
         <w:pStyle w:val="ListParagraph"/>
         <w:numPr>
           <w:ilvl w:val="0"/>
-          <w:numId w:val="47"/>
+          <w:numId w:val="48"/>
         </w:numPr>
         <w:spacing w:after="80" w:line="270"/>
       </w:pPr>
@@ -46550,7 +46806,7 @@
         <w:pStyle w:val="ListParagraph"/>
         <w:numPr>
           <w:ilvl w:val="0"/>
-          <w:numId w:val="48"/>
+          <w:numId w:val="49"/>
         </w:numPr>
         <w:spacing w:after="80" w:line="270"/>
       </w:pPr>
@@ -46578,7 +46834,7 @@
         <w:pStyle w:val="ListParagraph"/>
         <w:numPr>
           <w:ilvl w:val="0"/>
-          <w:numId w:val="48"/>
+          <w:numId w:val="49"/>
         </w:numPr>
         <w:spacing w:after="80" w:line="270"/>
       </w:pPr>
@@ -46606,7 +46862,7 @@
         <w:pStyle w:val="ListParagraph"/>
         <w:numPr>
           <w:ilvl w:val="0"/>
-          <w:numId w:val="48"/>
+          <w:numId w:val="49"/>
         </w:numPr>
         <w:spacing w:after="80" w:line="270"/>
       </w:pPr>
@@ -46634,7 +46890,7 @@
         <w:pStyle w:val="ListParagraph"/>
         <w:numPr>
           <w:ilvl w:val="0"/>
-          <w:numId w:val="48"/>
+          <w:numId w:val="49"/>
         </w:numPr>
         <w:spacing w:after="80" w:line="270"/>
       </w:pPr>
@@ -47247,6 +47503,12 @@
       <w:startOverride w:val="1"/>
     </w:lvlOverride>
   </w:num>
+  <w:num w:numId="49">
+    <w:abstractNumId w:val="3"/>
+    <w:lvlOverride w:ilvl="0">
+      <w:startOverride w:val="1"/>
+    </w:lvlOverride>
+  </w:num>
 </w:numbering>
 </file>
 

</xml_diff>

<commit_message>
feat(core): relatar problema vale nos dois ambientes — lista, detalhe e resposta (0264)
Decisão do dono (20/09): o relato nasce onde a pessoa está (captura de tela
funcionando no treino) e a visão junta mora no sistema real, que é o único
que alcança os dois bancos. A lista de Problemas mostra os dois com selo
Treino; o relato do treino abre na mesma tela, com conversa e anexos; o Admin
responde dali e a resposta é gravada no treino, onde quem relatou a lê. A
boia soma os dois. A 0264 parte answer_system_report em porta da tela +
answer_system_report_como (só chave de serviço, autor Admin no banco de
destino), para a regra continuar num lugar só.

Co-Authored-By: Claude Opus 5 <noreply@anthropic.com>
</commit_message>
<xml_diff>
--- a/docs/treinamento/Manual-de-Treinamento-riSZon.docx
+++ b/docs/treinamento/Manual-de-Treinamento-riSZon.docx
@@ -41841,6 +41841,232 @@
           <w:sz w:val="21"/>
           <w:szCs w:val="21"/>
         </w:rPr>
+        <w:t xml:space="preserve">Relatar é igual nos dois ambientes (desde 20/09/2026).</w:t>
+      </w:r>
+      <w:r>
+        <w:rPr>
+          <w:color w:val="23293D"/>
+          <w:sz w:val="21"/>
+          <w:szCs w:val="21"/>
+        </w:rPr>
+        <w:t xml:space="preserve"> Se você está no </w:t>
+      </w:r>
+      <w:r>
+        <w:rPr>
+          <w:b/>
+          <w:bCs/>
+          <w:color w:val="23293D"/>
+          <w:sz w:val="21"/>
+          <w:szCs w:val="21"/>
+        </w:rPr>
+        <w:t xml:space="preserve">riSZon Treino</w:t>
+      </w:r>
+      <w:r>
+        <w:rPr>
+          <w:color w:val="23293D"/>
+          <w:sz w:val="21"/>
+          <w:szCs w:val="21"/>
+        </w:rPr>
+        <w:t xml:space="preserve"> e algo dá errado, relate por lá mesmo, pela boia de sempre — com a captura de tela funcionando normalmente. O relato </w:t>
+      </w:r>
+      <w:r>
+        <w:rPr>
+          <w:b/>
+          <w:bCs/>
+          <w:color w:val="23293D"/>
+          <w:sz w:val="21"/>
+          <w:szCs w:val="21"/>
+        </w:rPr>
+        <w:t xml:space="preserve">aparece na lista do sistema real</w:t>
+      </w:r>
+      <w:r>
+        <w:rPr>
+          <w:color w:val="23293D"/>
+          <w:sz w:val="21"/>
+          <w:szCs w:val="21"/>
+        </w:rPr>
+        <w:t xml:space="preserve">, com o selo </w:t>
+      </w:r>
+      <w:r>
+        <w:rPr>
+          <w:b/>
+          <w:bCs/>
+          <w:color w:val="23293D"/>
+          <w:sz w:val="21"/>
+          <w:szCs w:val="21"/>
+        </w:rPr>
+        <w:t xml:space="preserve">Treino</w:t>
+      </w:r>
+      <w:r>
+        <w:rPr>
+          <w:color w:val="23293D"/>
+          <w:sz w:val="21"/>
+          <w:szCs w:val="21"/>
+        </w:rPr>
+        <w:t xml:space="preserve">, e você acompanha tudo num lugar só:</w:t>
+      </w:r>
+    </w:p>
+    <w:p>
+      <w:pPr>
+        <w:pStyle w:val="ListParagraph"/>
+        <w:numPr>
+          <w:ilvl w:val="0"/>
+          <w:numId w:val="46"/>
+        </w:numPr>
+        <w:spacing w:after="80" w:line="270"/>
+      </w:pPr>
+      <w:r>
+        <w:rPr>
+          <w:b/>
+          <w:bCs/>
+          <w:color w:val="23293D"/>
+          <w:sz w:val="21"/>
+          <w:szCs w:val="21"/>
+        </w:rPr>
+        <w:t xml:space="preserve">Para você:</w:t>
+      </w:r>
+      <w:r>
+        <w:rPr>
+          <w:color w:val="23293D"/>
+          <w:sz w:val="21"/>
+          <w:szCs w:val="21"/>
+        </w:rPr>
+        <w:t xml:space="preserve"> na tela Problemas do sistema real estão as suas solicitações dos dois ambientes, cada uma com o selo de onde nasceu. Clique e ela abre.</w:t>
+      </w:r>
+    </w:p>
+    <w:p>
+      <w:pPr>
+        <w:pStyle w:val="ListParagraph"/>
+        <w:numPr>
+          <w:ilvl w:val="0"/>
+          <w:numId w:val="46"/>
+        </w:numPr>
+        <w:spacing w:after="80" w:line="270"/>
+      </w:pPr>
+      <w:r>
+        <w:rPr>
+          <w:b/>
+          <w:bCs/>
+          <w:color w:val="23293D"/>
+          <w:sz w:val="21"/>
+          <w:szCs w:val="21"/>
+        </w:rPr>
+        <w:t xml:space="preserve">Para o Admin Master:</w:t>
+      </w:r>
+      <w:r>
+        <w:rPr>
+          <w:color w:val="23293D"/>
+          <w:sz w:val="21"/>
+          <w:szCs w:val="21"/>
+        </w:rPr>
+        <w:t xml:space="preserve"> a lista e o número da boia contam os dois ambientes. O relato do treino abre na mesma tela, com a conversa e os anexos, e a resposta é gravada no treino — que é onde quem relatou vai lê-la.</w:t>
+      </w:r>
+    </w:p>
+    <w:p>
+      <w:pPr>
+        <w:pStyle w:val="ListParagraph"/>
+        <w:numPr>
+          <w:ilvl w:val="0"/>
+          <w:numId w:val="46"/>
+        </w:numPr>
+        <w:spacing w:after="80" w:line="270"/>
+      </w:pPr>
+      <w:r>
+        <w:rPr>
+          <w:b/>
+          <w:bCs/>
+          <w:color w:val="23293D"/>
+          <w:sz w:val="21"/>
+          <w:szCs w:val="21"/>
+        </w:rPr>
+        <w:t xml:space="preserve">Complementar ou reabrir</w:t>
+      </w:r>
+      <w:r>
+        <w:rPr>
+          <w:color w:val="23293D"/>
+          <w:sz w:val="21"/>
+          <w:szCs w:val="21"/>
+        </w:rPr>
+        <w:t xml:space="preserve"> um relato do treino se faz no treino: a tela do sistema real mostra o link para abri-lo lá.</w:t>
+      </w:r>
+    </w:p>
+    <w:tbl>
+      <w:tblPr>
+        <w:tblW w:type="dxa" w:w="9638"/>
+        <w:tblBorders>
+          <w:top w:val="single" w:color="F5F3EC" w:sz="2"/>
+          <w:left w:val="single" w:color="B98B2E" w:sz="18"/>
+          <w:bottom w:val="single" w:color="F5F3EC" w:sz="2"/>
+          <w:right w:val="single" w:color="F5F3EC" w:sz="2"/>
+          <w:insideH w:val="none" w:color="auto" w:sz="0"/>
+          <w:insideV w:val="none" w:color="auto" w:sz="0"/>
+        </w:tblBorders>
+      </w:tblPr>
+      <w:tblGrid>
+        <w:gridCol w:w="9638"/>
+      </w:tblGrid>
+      <w:tr>
+        <w:tc>
+          <w:tcPr>
+            <w:tcW w:type="dxa" w:w="9638"/>
+            <w:shd w:fill="F5F3EC" w:color="auto" w:val="clear"/>
+            <w:tcMar>
+              <w:top w:type="dxa" w:w="160"/>
+              <w:left w:type="dxa" w:w="220"/>
+              <w:bottom w:type="dxa" w:w="160"/>
+              <w:right w:type="dxa" w:w="200"/>
+            </w:tcMar>
+          </w:tcPr>
+          <w:p>
+            <w:pPr>
+              <w:spacing w:after="140" w:line="280"/>
+            </w:pPr>
+            <w:r>
+              <w:rPr>
+                <w:b/>
+                <w:bCs/>
+                <w:color w:val="23293D"/>
+                <w:sz w:val="21"/>
+                <w:szCs w:val="21"/>
+              </w:rPr>
+              <w:t xml:space="preserve">Por que a lista junta fica no sistema real.</w:t>
+            </w:r>
+            <w:r>
+              <w:rPr>
+                <w:color w:val="23293D"/>
+                <w:sz w:val="21"/>
+                <w:szCs w:val="21"/>
+              </w:rPr>
+              <w:t xml:space="preserve"> O sistema real alcança o treino, mas o treino não alcança o real — e é bom que seja assim, porque o treino é um ambiente aberto para aprender. Por isso o lugar de ver tudo junto é o sistema real.</w:t>
+            </w:r>
+          </w:p>
+        </w:tc>
+      </w:tr>
+    </w:tbl>
+    <w:p>
+      <w:pPr>
+        <w:spacing w:after="140" w:line="120"/>
+      </w:pPr>
+      <w:r>
+        <w:rPr>
+          <w:sz w:val="2"/>
+          <w:szCs w:val="2"/>
+        </w:rPr>
+        <w:t xml:space="preserve"/>
+      </w:r>
+    </w:p>
+    <w:p>
+      <w:pPr>
+        <w:spacing w:after="140" w:line="280"/>
+      </w:pPr>
+      <w:r>
+        <w:rPr>
+          <w:b/>
+          <w:bCs/>
+          <w:color w:val="23293D"/>
+          <w:sz w:val="21"/>
+          <w:szCs w:val="21"/>
+        </w:rPr>
         <w:t xml:space="preserve">Quem vê o quê:</w:t>
       </w:r>
       <w:r>
@@ -43378,7 +43604,7 @@
         <w:pStyle w:val="ListParagraph"/>
         <w:numPr>
           <w:ilvl w:val="0"/>
-          <w:numId w:val="46"/>
+          <w:numId w:val="47"/>
         </w:numPr>
         <w:spacing w:after="80" w:line="270"/>
       </w:pPr>
@@ -43406,7 +43632,7 @@
         <w:pStyle w:val="ListParagraph"/>
         <w:numPr>
           <w:ilvl w:val="0"/>
-          <w:numId w:val="46"/>
+          <w:numId w:val="47"/>
         </w:numPr>
         <w:spacing w:after="80" w:line="270"/>
       </w:pPr>
@@ -43434,7 +43660,7 @@
         <w:pStyle w:val="ListParagraph"/>
         <w:numPr>
           <w:ilvl w:val="0"/>
-          <w:numId w:val="46"/>
+          <w:numId w:val="47"/>
         </w:numPr>
         <w:spacing w:after="80" w:line="270"/>
       </w:pPr>
@@ -43655,7 +43881,7 @@
         <w:pStyle w:val="ListParagraph"/>
         <w:numPr>
           <w:ilvl w:val="0"/>
-          <w:numId w:val="47"/>
+          <w:numId w:val="48"/>
         </w:numPr>
         <w:spacing w:after="80" w:line="270"/>
       </w:pPr>
@@ -43719,7 +43945,7 @@
         <w:pStyle w:val="ListParagraph"/>
         <w:numPr>
           <w:ilvl w:val="0"/>
-          <w:numId w:val="47"/>
+          <w:numId w:val="48"/>
         </w:numPr>
         <w:spacing w:after="80" w:line="270"/>
       </w:pPr>
@@ -45501,7 +45727,7 @@
         <w:pStyle w:val="ListParagraph"/>
         <w:numPr>
           <w:ilvl w:val="0"/>
-          <w:numId w:val="48"/>
+          <w:numId w:val="49"/>
         </w:numPr>
         <w:spacing w:after="80" w:line="270"/>
       </w:pPr>
@@ -45537,7 +45763,7 @@
         <w:pStyle w:val="ListParagraph"/>
         <w:numPr>
           <w:ilvl w:val="0"/>
-          <w:numId w:val="48"/>
+          <w:numId w:val="49"/>
         </w:numPr>
         <w:spacing w:after="80" w:line="270"/>
       </w:pPr>
@@ -45573,7 +45799,7 @@
         <w:pStyle w:val="ListParagraph"/>
         <w:numPr>
           <w:ilvl w:val="0"/>
-          <w:numId w:val="48"/>
+          <w:numId w:val="49"/>
         </w:numPr>
         <w:spacing w:after="80" w:line="270"/>
       </w:pPr>
@@ -45619,7 +45845,7 @@
         <w:pStyle w:val="ListParagraph"/>
         <w:numPr>
           <w:ilvl w:val="0"/>
-          <w:numId w:val="48"/>
+          <w:numId w:val="49"/>
         </w:numPr>
         <w:spacing w:after="80" w:line="270"/>
       </w:pPr>
@@ -46806,7 +47032,7 @@
         <w:pStyle w:val="ListParagraph"/>
         <w:numPr>
           <w:ilvl w:val="0"/>
-          <w:numId w:val="49"/>
+          <w:numId w:val="50"/>
         </w:numPr>
         <w:spacing w:after="80" w:line="270"/>
       </w:pPr>
@@ -46834,7 +47060,7 @@
         <w:pStyle w:val="ListParagraph"/>
         <w:numPr>
           <w:ilvl w:val="0"/>
-          <w:numId w:val="49"/>
+          <w:numId w:val="50"/>
         </w:numPr>
         <w:spacing w:after="80" w:line="270"/>
       </w:pPr>
@@ -46862,7 +47088,7 @@
         <w:pStyle w:val="ListParagraph"/>
         <w:numPr>
           <w:ilvl w:val="0"/>
-          <w:numId w:val="49"/>
+          <w:numId w:val="50"/>
         </w:numPr>
         <w:spacing w:after="80" w:line="270"/>
       </w:pPr>
@@ -46890,7 +47116,7 @@
         <w:pStyle w:val="ListParagraph"/>
         <w:numPr>
           <w:ilvl w:val="0"/>
-          <w:numId w:val="49"/>
+          <w:numId w:val="50"/>
         </w:numPr>
         <w:spacing w:after="80" w:line="270"/>
       </w:pPr>
@@ -47509,6 +47735,12 @@
       <w:startOverride w:val="1"/>
     </w:lvlOverride>
   </w:num>
+  <w:num w:numId="50">
+    <w:abstractNumId w:val="3"/>
+    <w:lvlOverride w:ilvl="0">
+      <w:startOverride w:val="1"/>
+    </w:lvlOverride>
+  </w:num>
 </w:numbering>
 </file>
 

</xml_diff>

<commit_message>
feat(core): painel de relatos consolidado — sistema e treino na mesma conta
Escolha do dono (opção b): a conta saiu do banco (0258) e virou montarPainel
no código, pura e com 17 testes que prendem as regras declaradas na migração.
painel-dados.ts lê os dois bancos com chave de serviço, decide o escopo antes
(rede x unidades) e traduz unidades/pessoas do treino para os ids da produção.
A tela ganhou Os dois / Só o sistema / Só o treino e avisa quando não consegue
ler o treino. Mediana de dois conjuntos não se soma — por isso a conta junta.

Co-Authored-By: Claude Opus 5 <noreply@anthropic.com>
</commit_message>
<xml_diff>
--- a/docs/treinamento/Manual-de-Treinamento-riSZon.docx
+++ b/docs/treinamento/Manual-de-Treinamento-riSZon.docx
@@ -41988,6 +41988,83 @@
           <w:szCs w:val="21"/>
         </w:rPr>
         <w:t xml:space="preserve"> um relato do treino se faz no treino: a tela do sistema real mostra o link para abri-lo lá.</w:t>
+      </w:r>
+    </w:p>
+    <w:p>
+      <w:pPr>
+        <w:spacing w:after="140" w:line="280"/>
+      </w:pPr>
+      <w:r>
+        <w:rPr>
+          <w:b/>
+          <w:bCs/>
+          <w:color w:val="23293D"/>
+          <w:sz w:val="21"/>
+          <w:szCs w:val="21"/>
+        </w:rPr>
+        <w:t xml:space="preserve">O painel de indicadores conta os dois.</w:t>
+      </w:r>
+      <w:r>
+        <w:rPr>
+          <w:color w:val="23293D"/>
+          <w:sz w:val="21"/>
+          <w:szCs w:val="21"/>
+        </w:rPr>
+        <w:t xml:space="preserve"> Em Problemas → </w:t>
+      </w:r>
+      <w:r>
+        <w:rPr>
+          <w:b/>
+          <w:bCs/>
+          <w:color w:val="23293D"/>
+          <w:sz w:val="21"/>
+          <w:szCs w:val="21"/>
+        </w:rPr>
+        <w:t xml:space="preserve">Painel de indicadores</w:t>
+      </w:r>
+      <w:r>
+        <w:rPr>
+          <w:color w:val="23293D"/>
+          <w:sz w:val="21"/>
+          <w:szCs w:val="21"/>
+        </w:rPr>
+        <w:t xml:space="preserve">, os números somam o sistema e o treino, com botões para ver </w:t>
+      </w:r>
+      <w:r>
+        <w:rPr>
+          <w:b/>
+          <w:bCs/>
+          <w:color w:val="23293D"/>
+          <w:sz w:val="21"/>
+          <w:szCs w:val="21"/>
+        </w:rPr>
+        <w:t xml:space="preserve">só o sistema</w:t>
+      </w:r>
+      <w:r>
+        <w:rPr>
+          <w:color w:val="23293D"/>
+          <w:sz w:val="21"/>
+          <w:szCs w:val="21"/>
+        </w:rPr>
+        <w:t xml:space="preserve"> ou </w:t>
+      </w:r>
+      <w:r>
+        <w:rPr>
+          <w:b/>
+          <w:bCs/>
+          <w:color w:val="23293D"/>
+          <w:sz w:val="21"/>
+          <w:szCs w:val="21"/>
+        </w:rPr>
+        <w:t xml:space="preserve">só o treino</w:t>
+      </w:r>
+      <w:r>
+        <w:rPr>
+          <w:color w:val="23293D"/>
+          <w:sz w:val="21"/>
+          <w:szCs w:val="21"/>
+        </w:rPr>
+        <w:t xml:space="preserve">. As regras não mudaram: o período conta pela data em que o relato foi registrado, "aproveitado" é o que foi resolvido, e os relatos do próprio Admin Master ficam fora dos rankings.</w:t>
       </w:r>
     </w:p>
     <w:tbl>

</xml_diff>

<commit_message>
fix(core): quem está só no Início também relata e acompanha problemas
Achado ao provar a régua de visibilidade com um login que não é Admin: a
pessoa em modo portal recebia 307 em /problemas — relatava no treino e não
conseguia acompanhar no sistema real. Agora /problemas e /problemas/OC-xxxxx
entram no modo portal, a boia aparece na barra de cima, e a unidade do relato
vem da ficha quando não há unidade ativa. O painel continua fora.

Co-Authored-By: Claude Opus 5 <noreply@anthropic.com>
</commit_message>
<xml_diff>
--- a/docs/treinamento/Manual-de-Treinamento-riSZon.docx
+++ b/docs/treinamento/Manual-de-Treinamento-riSZon.docx
@@ -41827,6 +41827,29 @@
           <w:szCs w:val="21"/>
         </w:rPr>
         <w:t xml:space="preserve"> Se você relatou e foi respondido, a boia mostra um número até você abrir aquele relato. Se você é Admin Master, ela mostra quantos relatos ainda dependem de você.</w:t>
+      </w:r>
+    </w:p>
+    <w:p>
+      <w:pPr>
+        <w:spacing w:after="140" w:line="280"/>
+      </w:pPr>
+      <w:r>
+        <w:rPr>
+          <w:b/>
+          <w:bCs/>
+          <w:color w:val="23293D"/>
+          <w:sz w:val="21"/>
+          <w:szCs w:val="21"/>
+        </w:rPr>
+        <w:t xml:space="preserve">Quem ainda está só no Início também relata.</w:t>
+      </w:r>
+      <w:r>
+        <w:rPr>
+          <w:color w:val="23293D"/>
+          <w:sz w:val="21"/>
+          <w:szCs w:val="21"/>
+        </w:rPr>
+        <w:t xml:space="preserve"> Mesmo sem o sistema real liberado, a boia aparece na barra de cima e a tela de Problemas abre: a pessoa relata, acompanha a resposta e vê as próprias solicitações. A unidade do relato é a do cadastro dela.</w:t>
       </w:r>
     </w:p>
     <w:p>

</xml_diff>

<commit_message>
feat(core): boas-vindas nos 3 primeiros acessos e textos automáticos em Orientações (0265)
Pedidos do dono (20/09). A 0265 conta as aparições (welcome_count), no máximo
uma por dia — o sistema não guarda contagem de logins, e contar cada abertura
do Início gastaria as três no primeiro dia; quem já tinha visto fica de fora.
Os textos (boas-vindas nas duas versões + guia do treino) passaram a morar em
textos-automaticos.ts, lidos pela janela, pelo guia e pela nova seção "O que o
sistema já diz sozinho" em Administração > Orientações — fonte única, porque
uma cópia divergiria e a tela de conferência passaria a mentir.

Inclui a correção do modo portal (v0.259.1) provada com login não-Admin.

Co-Authored-By: Claude Opus 5 <noreply@anthropic.com>
</commit_message>
<xml_diff>
--- a/docs/treinamento/Manual-de-Treinamento-riSZon.docx
+++ b/docs/treinamento/Manual-de-Treinamento-riSZon.docx
@@ -8658,25 +8658,25 @@
           <w:sz w:val="21"/>
           <w:szCs w:val="21"/>
         </w:rPr>
-        <w:t xml:space="preserve"> No </w:t>
-      </w:r>
-      <w:r>
-        <w:rPr>
-          <w:b/>
-          <w:bCs/>
-          <w:color w:val="23293D"/>
-          <w:sz w:val="21"/>
-          <w:szCs w:val="21"/>
-        </w:rPr>
-        <w:t xml:space="preserve">primeiro login</w:t>
-      </w:r>
-      <w:r>
-        <w:rPr>
-          <w:color w:val="23293D"/>
-          <w:sz w:val="21"/>
-          <w:szCs w:val="21"/>
-        </w:rPr>
-        <w:t xml:space="preserve"> no riSZon aparece uma janela de boas-vindas: o que é o sistema, o próximo passo (para quem ainda está só no Início, é o </w:t>
+        <w:t xml:space="preserve"> Nos </w:t>
+      </w:r>
+      <w:r>
+        <w:rPr>
+          <w:b/>
+          <w:bCs/>
+          <w:color w:val="23293D"/>
+          <w:sz w:val="21"/>
+          <w:szCs w:val="21"/>
+        </w:rPr>
+        <w:t xml:space="preserve">3 primeiros acessos</w:t>
+      </w:r>
+      <w:r>
+        <w:rPr>
+          <w:color w:val="23293D"/>
+          <w:sz w:val="21"/>
+          <w:szCs w:val="21"/>
+        </w:rPr>
+        <w:t xml:space="preserve"> ao riSZon (uma vez por dia) aparece uma janela de boas-vindas: o que é o sistema, o próximo passo (para quem ainda está só no Início, é o </w:t>
       </w:r>
       <w:r>
         <w:rPr>
@@ -8694,25 +8694,108 @@
           <w:sz w:val="21"/>
           <w:szCs w:val="21"/>
         </w:rPr>
-        <w:t xml:space="preserve">), onde trocar a senha e onde está o Manual. Ela aparece </w:t>
-      </w:r>
-      <w:r>
-        <w:rPr>
-          <w:b/>
-          <w:bCs/>
-          <w:color w:val="23293D"/>
-          <w:sz w:val="21"/>
-          <w:szCs w:val="21"/>
-        </w:rPr>
-        <w:t xml:space="preserve">uma vez só</w:t>
-      </w:r>
-      <w:r>
-        <w:rPr>
-          <w:color w:val="23293D"/>
-          <w:sz w:val="21"/>
-          <w:szCs w:val="21"/>
-        </w:rPr>
-        <w:t xml:space="preserve"> — fechou, não volta.</w:t>
+        <w:t xml:space="preserve">), onde trocar a senha e onde está o Manual. Depois do terceiro, ela não volta.</w:t>
+      </w:r>
+    </w:p>
+    <w:tbl>
+      <w:tblPr>
+        <w:tblW w:type="dxa" w:w="9638"/>
+        <w:tblBorders>
+          <w:top w:val="single" w:color="F5F3EC" w:sz="2"/>
+          <w:left w:val="single" w:color="B98B2E" w:sz="18"/>
+          <w:bottom w:val="single" w:color="F5F3EC" w:sz="2"/>
+          <w:right w:val="single" w:color="F5F3EC" w:sz="2"/>
+          <w:insideH w:val="none" w:color="auto" w:sz="0"/>
+          <w:insideV w:val="none" w:color="auto" w:sz="0"/>
+        </w:tblBorders>
+      </w:tblPr>
+      <w:tblGrid>
+        <w:gridCol w:w="9638"/>
+      </w:tblGrid>
+      <w:tr>
+        <w:tc>
+          <w:tcPr>
+            <w:tcW w:type="dxa" w:w="9638"/>
+            <w:shd w:fill="F5F3EC" w:color="auto" w:val="clear"/>
+            <w:tcMar>
+              <w:top w:type="dxa" w:w="160"/>
+              <w:left w:type="dxa" w:w="220"/>
+              <w:bottom w:type="dxa" w:w="160"/>
+              <w:right w:type="dxa" w:w="200"/>
+            </w:tcMar>
+          </w:tcPr>
+          <w:p>
+            <w:pPr>
+              <w:spacing w:after="140" w:line="280"/>
+            </w:pPr>
+            <w:r>
+              <w:rPr>
+                <w:b/>
+                <w:bCs/>
+                <w:color w:val="23293D"/>
+                <w:sz w:val="21"/>
+                <w:szCs w:val="21"/>
+              </w:rPr>
+              <w:t xml:space="preserve">Para o Admin Master:</w:t>
+            </w:r>
+            <w:r>
+              <w:rPr>
+                <w:color w:val="23293D"/>
+                <w:sz w:val="21"/>
+                <w:szCs w:val="21"/>
+              </w:rPr>
+              <w:t xml:space="preserve"> o texto exato dessas mensagens fica em </w:t>
+            </w:r>
+            <w:r>
+              <w:rPr>
+                <w:b/>
+                <w:bCs/>
+                <w:color w:val="23293D"/>
+                <w:sz w:val="21"/>
+                <w:szCs w:val="21"/>
+              </w:rPr>
+              <w:t xml:space="preserve">Administração → Orientações</w:t>
+            </w:r>
+            <w:r>
+              <w:rPr>
+                <w:color w:val="23293D"/>
+                <w:sz w:val="21"/>
+                <w:szCs w:val="21"/>
+              </w:rPr>
+              <w:t xml:space="preserve">, no bloco </w:t>
+            </w:r>
+            <w:r>
+              <w:rPr>
+                <w:i/>
+                <w:iCs/>
+                <w:color w:val="23293D"/>
+                <w:sz w:val="21"/>
+                <w:szCs w:val="21"/>
+              </w:rPr>
+              <w:t xml:space="preserve">O que o sistema já diz sozinho</w:t>
+            </w:r>
+            <w:r>
+              <w:rPr>
+                <w:color w:val="23293D"/>
+                <w:sz w:val="21"/>
+                <w:szCs w:val="21"/>
+              </w:rPr>
+              <w:t xml:space="preserve"> — junto com o guia do treino. É só consulta, para você saber o que a equipe está recebendo sem precisar lembrar de cabeça.</w:t>
+            </w:r>
+          </w:p>
+        </w:tc>
+      </w:tr>
+    </w:tbl>
+    <w:p>
+      <w:pPr>
+        <w:spacing w:after="140" w:line="120"/>
+      </w:pPr>
+      <w:r>
+        <w:rPr>
+          <w:sz w:val="2"/>
+          <w:szCs w:val="2"/>
+        </w:rPr>
+        <w:t xml:space="preserve"/>
       </w:r>
     </w:p>
     <w:p>

</xml_diff>

<commit_message>
docs(core): mensagem pronta para pedir os dados do cadastro ao Risartano novo
Texto para WhatsApp e e-mail montado a partir dos campos que o formulário
exige, com o porquê de cada pedido e o aviso de que o e-mail vira o login.
O manual passa a apontar para ele na seção do cadastro.

Co-Authored-By: Claude Opus 5 <noreply@anthropic.com>
</commit_message>
<xml_diff>
--- a/docs/treinamento/Manual-de-Treinamento-riSZon.docx
+++ b/docs/treinamento/Manual-de-Treinamento-riSZon.docx
@@ -180,7 +180,7 @@
           <w:sz w:val="20"/>
           <w:szCs w:val="20"/>
         </w:rPr>
-        <w:t xml:space="preserve">20 de setembro de 2026</w:t>
+        <w:t xml:space="preserve">21 de setembro de 2026</w:t>
       </w:r>
     </w:p>
     <w:p>
@@ -7810,6 +7810,89 @@
           <w:szCs w:val="21"/>
         </w:rPr>
         <w:t xml:space="preserve"> em vez de oferecer um login — e não existe outro caminho para criar acesso sem a ficha completa.</w:t>
+      </w:r>
+    </w:p>
+    <w:tbl>
+      <w:tblPr>
+        <w:tblW w:type="dxa" w:w="9638"/>
+        <w:tblBorders>
+          <w:top w:val="single" w:color="F5F3EC" w:sz="2"/>
+          <w:left w:val="single" w:color="B98B2E" w:sz="18"/>
+          <w:bottom w:val="single" w:color="F5F3EC" w:sz="2"/>
+          <w:right w:val="single" w:color="F5F3EC" w:sz="2"/>
+          <w:insideH w:val="none" w:color="auto" w:sz="0"/>
+          <w:insideV w:val="none" w:color="auto" w:sz="0"/>
+        </w:tblBorders>
+      </w:tblPr>
+      <w:tblGrid>
+        <w:gridCol w:w="9638"/>
+      </w:tblGrid>
+      <w:tr>
+        <w:tc>
+          <w:tcPr>
+            <w:tcW w:type="dxa" w:w="9638"/>
+            <w:shd w:fill="F5F3EC" w:color="auto" w:val="clear"/>
+            <w:tcMar>
+              <w:top w:type="dxa" w:w="160"/>
+              <w:left w:type="dxa" w:w="220"/>
+              <w:bottom w:type="dxa" w:w="160"/>
+              <w:right w:type="dxa" w:w="200"/>
+            </w:tcMar>
+          </w:tcPr>
+          <w:p>
+            <w:pPr>
+              <w:spacing w:after="140" w:line="280"/>
+            </w:pPr>
+            <w:r>
+              <w:rPr>
+                <w:b/>
+                <w:bCs/>
+                <w:color w:val="23293D"/>
+                <w:sz w:val="21"/>
+                <w:szCs w:val="21"/>
+              </w:rPr>
+              <w:t xml:space="preserve">Antes de cadastrar, peça os dados à pessoa.</w:t>
+            </w:r>
+            <w:r>
+              <w:rPr>
+                <w:color w:val="23293D"/>
+                <w:sz w:val="21"/>
+                <w:szCs w:val="21"/>
+              </w:rPr>
+              <w:t xml:space="preserve"> O texto pronto (WhatsApp e e-mail) está em </w:t>
+            </w:r>
+            <w:r>
+              <w:rPr>
+                <w:rFonts w:ascii="Consolas" w:cs="Consolas" w:eastAsia="Consolas" w:hAnsi="Consolas"/>
+                <w:color w:val="1F3253"/>
+                <w:sz w:val="19"/>
+                <w:szCs w:val="19"/>
+                <w:shd w:fill="EFEDE6" w:color="auto" w:val="clear"/>
+              </w:rPr>
+              <w:t xml:space="preserve">docs/treinamento/mensagem-cadastro-risartano.md</w:t>
+            </w:r>
+            <w:r>
+              <w:rPr>
+                <w:color w:val="23293D"/>
+                <w:sz w:val="21"/>
+                <w:szCs w:val="21"/>
+              </w:rPr>
+              <w:t xml:space="preserve">, com a lista exata do que o formulário exige.</w:t>
+            </w:r>
+          </w:p>
+        </w:tc>
+      </w:tr>
+    </w:tbl>
+    <w:p>
+      <w:pPr>
+        <w:spacing w:after="140" w:line="120"/>
+      </w:pPr>
+      <w:r>
+        <w:rPr>
+          <w:sz w:val="2"/>
+          <w:szCs w:val="2"/>
+        </w:rPr>
+        <w:t xml:space="preserve"/>
       </w:r>
     </w:p>
     <w:p>

</xml_diff>

<commit_message>
feat(core): Meu cadastro no Perfil e função prevista na lista de Risartanos
Duas queixas do dono (21/09). (1) O Perfil mostrava só nome, telefone e as
funções de acesso — nada do que foi preenchido no cadastro; ganhou o bloco
"Meu cadastro", só leitura (ficha de RH não se autodeclara), lendo a própria
ficha por user_id. (2) A lista dizia "sem função definida" para quem ainda não
tem login, mesmo com a função escolhida na ficha: passa a mostrar a unidade e
a função prevista, marcada como prevista — função prevista não é função de
acesso: uma diz o que a pessoa veio fazer, a outra o que o login abre.

Co-Authored-By: Claude Opus 5 <noreply@anthropic.com>
</commit_message>
<xml_diff>
--- a/docs/treinamento/Manual-de-Treinamento-riSZon.docx
+++ b/docs/treinamento/Manual-de-Treinamento-riSZon.docx
@@ -6786,8 +6786,8 @@
         <w:tblLayout w:type="fixed"/>
       </w:tblPr>
       <w:tblGrid>
-        <w:gridCol w:w="3279"/>
-        <w:gridCol w:w="6359"/>
+        <w:gridCol w:w="2983"/>
+        <w:gridCol w:w="6655"/>
       </w:tblGrid>
       <w:tr>
         <w:trPr>
@@ -6795,7 +6795,7 @@
         </w:trPr>
         <w:tc>
           <w:tcPr>
-            <w:tcW w:type="dxa" w:w="3279"/>
+            <w:tcW w:type="dxa" w:w="2983"/>
             <w:shd w:fill="1F3253" w:color="auto" w:val="clear"/>
             <w:tcMar>
               <w:top w:type="dxa" w:w="90"/>
@@ -6823,7 +6823,7 @@
         </w:tc>
         <w:tc>
           <w:tcPr>
-            <w:tcW w:type="dxa" w:w="6359"/>
+            <w:tcW w:type="dxa" w:w="6655"/>
             <w:shd w:fill="1F3253" w:color="auto" w:val="clear"/>
             <w:tcMar>
               <w:top w:type="dxa" w:w="90"/>
@@ -6853,7 +6853,7 @@
       <w:tr>
         <w:tc>
           <w:tcPr>
-            <w:tcW w:type="dxa" w:w="3279"/>
+            <w:tcW w:type="dxa" w:w="2983"/>
             <w:tcMar>
               <w:top w:type="dxa" w:w="90"/>
               <w:left w:type="dxa" w:w="110"/>
@@ -6880,7 +6880,7 @@
         </w:tc>
         <w:tc>
           <w:tcPr>
-            <w:tcW w:type="dxa" w:w="6359"/>
+            <w:tcW w:type="dxa" w:w="6655"/>
             <w:tcMar>
               <w:top w:type="dxa" w:w="90"/>
               <w:left w:type="dxa" w:w="110"/>
@@ -6907,7 +6907,7 @@
       <w:tr>
         <w:tc>
           <w:tcPr>
-            <w:tcW w:type="dxa" w:w="3279"/>
+            <w:tcW w:type="dxa" w:w="2983"/>
             <w:shd w:fill="F7F6F2" w:color="auto" w:val="clear"/>
             <w:tcMar>
               <w:top w:type="dxa" w:w="90"/>
@@ -6935,7 +6935,7 @@
         </w:tc>
         <w:tc>
           <w:tcPr>
-            <w:tcW w:type="dxa" w:w="6359"/>
+            <w:tcW w:type="dxa" w:w="6655"/>
             <w:shd w:fill="F7F6F2" w:color="auto" w:val="clear"/>
             <w:tcMar>
               <w:top w:type="dxa" w:w="90"/>
@@ -6955,7 +6955,25 @@
                 <w:sz w:val="20"/>
                 <w:szCs w:val="20"/>
               </w:rPr>
-              <w:t xml:space="preserve">está no cadastro, mas não tem login</w:t>
+              <w:t xml:space="preserve">está no cadastro, mas não tem login (a linha mostra a unidade e a </w:t>
+            </w:r>
+            <w:r>
+              <w:rPr>
+                <w:b/>
+                <w:bCs/>
+                <w:color w:val="23293D"/>
+                <w:sz w:val="20"/>
+                <w:szCs w:val="20"/>
+              </w:rPr>
+              <w:t xml:space="preserve">função prevista</w:t>
+            </w:r>
+            <w:r>
+              <w:rPr>
+                <w:color w:val="23293D"/>
+                <w:sz w:val="20"/>
+                <w:szCs w:val="20"/>
+              </w:rPr>
+              <w:t xml:space="preserve"> no cadastro)</w:t>
             </w:r>
           </w:p>
         </w:tc>
@@ -6963,7 +6981,7 @@
       <w:tr>
         <w:tc>
           <w:tcPr>
-            <w:tcW w:type="dxa" w:w="3279"/>
+            <w:tcW w:type="dxa" w:w="2983"/>
             <w:tcMar>
               <w:top w:type="dxa" w:w="90"/>
               <w:left w:type="dxa" w:w="110"/>
@@ -6990,7 +7008,7 @@
         </w:tc>
         <w:tc>
           <w:tcPr>
-            <w:tcW w:type="dxa" w:w="6359"/>
+            <w:tcW w:type="dxa" w:w="6655"/>
             <w:tcMar>
               <w:top w:type="dxa" w:w="90"/>
               <w:left w:type="dxa" w:w="110"/>
@@ -7017,7 +7035,7 @@
       <w:tr>
         <w:tc>
           <w:tcPr>
-            <w:tcW w:type="dxa" w:w="3279"/>
+            <w:tcW w:type="dxa" w:w="2983"/>
             <w:shd w:fill="F7F6F2" w:color="auto" w:val="clear"/>
             <w:tcMar>
               <w:top w:type="dxa" w:w="90"/>
@@ -7045,7 +7063,7 @@
         </w:tc>
         <w:tc>
           <w:tcPr>
-            <w:tcW w:type="dxa" w:w="6359"/>
+            <w:tcW w:type="dxa" w:w="6655"/>
             <w:shd w:fill="F7F6F2" w:color="auto" w:val="clear"/>
             <w:tcMar>
               <w:top w:type="dxa" w:w="90"/>
@@ -7091,7 +7109,7 @@
       <w:tr>
         <w:tc>
           <w:tcPr>
-            <w:tcW w:type="dxa" w:w="3279"/>
+            <w:tcW w:type="dxa" w:w="2983"/>
             <w:tcMar>
               <w:top w:type="dxa" w:w="90"/>
               <w:left w:type="dxa" w:w="110"/>
@@ -7118,7 +7136,7 @@
         </w:tc>
         <w:tc>
           <w:tcPr>
-            <w:tcW w:type="dxa" w:w="6359"/>
+            <w:tcW w:type="dxa" w:w="6655"/>
             <w:tcMar>
               <w:top w:type="dxa" w:w="90"/>
               <w:left w:type="dxa" w:w="110"/>
@@ -7988,6 +8006,83 @@
           <w:szCs w:val="21"/>
         </w:rPr>
         <w:t xml:space="preserve">.</w:t>
+      </w:r>
+    </w:p>
+    <w:p>
+      <w:pPr>
+        <w:spacing w:after="140" w:line="280"/>
+      </w:pPr>
+      <w:r>
+        <w:rPr>
+          <w:b/>
+          <w:bCs/>
+          <w:color w:val="23293D"/>
+          <w:sz w:val="21"/>
+          <w:szCs w:val="21"/>
+        </w:rPr>
+        <w:t xml:space="preserve">Cada pessoa vê o próprio cadastro.</w:t>
+      </w:r>
+      <w:r>
+        <w:rPr>
+          <w:color w:val="23293D"/>
+          <w:sz w:val="21"/>
+          <w:szCs w:val="21"/>
+        </w:rPr>
+        <w:t xml:space="preserve"> No </w:t>
+      </w:r>
+      <w:r>
+        <w:rPr>
+          <w:b/>
+          <w:bCs/>
+          <w:color w:val="23293D"/>
+          <w:sz w:val="21"/>
+          <w:szCs w:val="21"/>
+        </w:rPr>
+        <w:t xml:space="preserve">Perfil</w:t>
+      </w:r>
+      <w:r>
+        <w:rPr>
+          <w:color w:val="23293D"/>
+          <w:sz w:val="21"/>
+          <w:szCs w:val="21"/>
+        </w:rPr>
+        <w:t xml:space="preserve"> (clique no seu nome, no rodapé do menu), o bloco </w:t>
+      </w:r>
+      <w:r>
+        <w:rPr>
+          <w:b/>
+          <w:bCs/>
+          <w:color w:val="23293D"/>
+          <w:sz w:val="21"/>
+          <w:szCs w:val="21"/>
+        </w:rPr>
+        <w:t xml:space="preserve">Meu cadastro</w:t>
+      </w:r>
+      <w:r>
+        <w:rPr>
+          <w:color w:val="23293D"/>
+          <w:sz w:val="21"/>
+          <w:szCs w:val="21"/>
+        </w:rPr>
+        <w:t xml:space="preserve"> mostra o que a Risarte tem sobre você: foto, código, unidade, função, regime de contrato, contato, endereço e dados pessoais. É </w:t>
+      </w:r>
+      <w:r>
+        <w:rPr>
+          <w:b/>
+          <w:bCs/>
+          <w:color w:val="23293D"/>
+          <w:sz w:val="21"/>
+          <w:szCs w:val="21"/>
+        </w:rPr>
+        <w:t xml:space="preserve">só leitura</w:t>
+      </w:r>
+      <w:r>
+        <w:rPr>
+          <w:color w:val="23293D"/>
+          <w:sz w:val="21"/>
+          <w:szCs w:val="21"/>
+        </w:rPr>
+        <w:t xml:space="preserve"> — ficha de RH não se corrige sozinha; se algo estiver errado, fale com a gestão da sua unidade. O que você mesmo altera (nome de tratamento, telefone e senha) continua logo acima, na mesma tela.</w:t>
       </w:r>
     </w:p>
     <w:p>

</xml_diff>

<commit_message>
docs(core): o manual do riSZon aponta para o manual do Empresarial (v0.276.0)
O módulo Empresarial ganhou manual próprio (commit anterior, v0.63.0). Sem
este ponteiro, quem procurasse "titular" ou "carência" no manual do sistema
não acharia nada e concluiria que não está documentado.

- O mapa da interface, na linha do Empresarial, diz onde está o manual dele.
- Entrada no registro de novidades (a regra 0c exige, e o teste cobra).
- Word regerado — é ele que circula com a equipe.

Commit separado e rotulado de propósito: mexe em documento e versão do NÚCLEO,
e a §0 do CLAUDE.md proíbe misturar os dois projetos no mesmo commit.

Co-Authored-By: Claude Opus 5 <noreply@anthropic.com>
</commit_message>
<xml_diff>
--- a/docs/treinamento/Manual-de-Treinamento-riSZon.docx
+++ b/docs/treinamento/Manual-de-Treinamento-riSZon.docx
@@ -180,7 +180,7 @@
           <w:sz w:val="20"/>
           <w:szCs w:val="20"/>
         </w:rPr>
-        <w:t xml:space="preserve">23 de setembro de 2026</w:t>
+        <w:t xml:space="preserve">24 de setembro de 2026</w:t>
       </w:r>
     </w:p>
     <w:p>
@@ -13132,9 +13132,9 @@
         <w:tblLayout w:type="fixed"/>
       </w:tblPr>
       <w:tblGrid>
-        <w:gridCol w:w="2651"/>
-        <w:gridCol w:w="2390"/>
-        <w:gridCol w:w="4597"/>
+        <w:gridCol w:w="2627"/>
+        <w:gridCol w:w="2375"/>
+        <w:gridCol w:w="4636"/>
       </w:tblGrid>
       <w:tr>
         <w:trPr>
@@ -13142,7 +13142,7 @@
         </w:trPr>
         <w:tc>
           <w:tcPr>
-            <w:tcW w:type="dxa" w:w="2651"/>
+            <w:tcW w:type="dxa" w:w="2627"/>
             <w:shd w:fill="1F3253" w:color="auto" w:val="clear"/>
             <w:tcMar>
               <w:top w:type="dxa" w:w="90"/>
@@ -13170,7 +13170,7 @@
         </w:tc>
         <w:tc>
           <w:tcPr>
-            <w:tcW w:type="dxa" w:w="2390"/>
+            <w:tcW w:type="dxa" w:w="2375"/>
             <w:shd w:fill="1F3253" w:color="auto" w:val="clear"/>
             <w:tcMar>
               <w:top w:type="dxa" w:w="90"/>
@@ -13198,7 +13198,7 @@
         </w:tc>
         <w:tc>
           <w:tcPr>
-            <w:tcW w:type="dxa" w:w="4597"/>
+            <w:tcW w:type="dxa" w:w="4636"/>
             <w:shd w:fill="1F3253" w:color="auto" w:val="clear"/>
             <w:tcMar>
               <w:top w:type="dxa" w:w="90"/>
@@ -13228,7 +13228,7 @@
       <w:tr>
         <w:tc>
           <w:tcPr>
-            <w:tcW w:type="dxa" w:w="2651"/>
+            <w:tcW w:type="dxa" w:w="2627"/>
             <w:tcMar>
               <w:top w:type="dxa" w:w="90"/>
               <w:left w:type="dxa" w:w="110"/>
@@ -13253,7 +13253,7 @@
         </w:tc>
         <w:tc>
           <w:tcPr>
-            <w:tcW w:type="dxa" w:w="2390"/>
+            <w:tcW w:type="dxa" w:w="2375"/>
             <w:tcMar>
               <w:top w:type="dxa" w:w="90"/>
               <w:left w:type="dxa" w:w="110"/>
@@ -13280,7 +13280,7 @@
         </w:tc>
         <w:tc>
           <w:tcPr>
-            <w:tcW w:type="dxa" w:w="4597"/>
+            <w:tcW w:type="dxa" w:w="4636"/>
             <w:tcMar>
               <w:top w:type="dxa" w:w="90"/>
               <w:left w:type="dxa" w:w="110"/>
@@ -13307,7 +13307,7 @@
       <w:tr>
         <w:tc>
           <w:tcPr>
-            <w:tcW w:type="dxa" w:w="2651"/>
+            <w:tcW w:type="dxa" w:w="2627"/>
             <w:shd w:fill="F7F6F2" w:color="auto" w:val="clear"/>
             <w:tcMar>
               <w:top w:type="dxa" w:w="90"/>
@@ -13333,7 +13333,7 @@
         </w:tc>
         <w:tc>
           <w:tcPr>
-            <w:tcW w:type="dxa" w:w="2390"/>
+            <w:tcW w:type="dxa" w:w="2375"/>
             <w:shd w:fill="F7F6F2" w:color="auto" w:val="clear"/>
             <w:tcMar>
               <w:top w:type="dxa" w:w="90"/>
@@ -13361,7 +13361,7 @@
         </w:tc>
         <w:tc>
           <w:tcPr>
-            <w:tcW w:type="dxa" w:w="4597"/>
+            <w:tcW w:type="dxa" w:w="4636"/>
             <w:shd w:fill="F7F6F2" w:color="auto" w:val="clear"/>
             <w:tcMar>
               <w:top w:type="dxa" w:w="90"/>
@@ -13389,7 +13389,7 @@
       <w:tr>
         <w:tc>
           <w:tcPr>
-            <w:tcW w:type="dxa" w:w="2651"/>
+            <w:tcW w:type="dxa" w:w="2627"/>
             <w:tcMar>
               <w:top w:type="dxa" w:w="90"/>
               <w:left w:type="dxa" w:w="110"/>
@@ -13414,7 +13414,7 @@
         </w:tc>
         <w:tc>
           <w:tcPr>
-            <w:tcW w:type="dxa" w:w="2390"/>
+            <w:tcW w:type="dxa" w:w="2375"/>
             <w:tcMar>
               <w:top w:type="dxa" w:w="90"/>
               <w:left w:type="dxa" w:w="110"/>
@@ -13441,7 +13441,7 @@
         </w:tc>
         <w:tc>
           <w:tcPr>
-            <w:tcW w:type="dxa" w:w="4597"/>
+            <w:tcW w:type="dxa" w:w="4636"/>
             <w:tcMar>
               <w:top w:type="dxa" w:w="90"/>
               <w:left w:type="dxa" w:w="110"/>
@@ -13468,7 +13468,7 @@
       <w:tr>
         <w:tc>
           <w:tcPr>
-            <w:tcW w:type="dxa" w:w="2651"/>
+            <w:tcW w:type="dxa" w:w="2627"/>
             <w:shd w:fill="F7F6F2" w:color="auto" w:val="clear"/>
             <w:tcMar>
               <w:top w:type="dxa" w:w="90"/>
@@ -13494,7 +13494,7 @@
         </w:tc>
         <w:tc>
           <w:tcPr>
-            <w:tcW w:type="dxa" w:w="2390"/>
+            <w:tcW w:type="dxa" w:w="2375"/>
             <w:shd w:fill="F7F6F2" w:color="auto" w:val="clear"/>
             <w:tcMar>
               <w:top w:type="dxa" w:w="90"/>
@@ -13522,7 +13522,7 @@
         </w:tc>
         <w:tc>
           <w:tcPr>
-            <w:tcW w:type="dxa" w:w="4597"/>
+            <w:tcW w:type="dxa" w:w="4636"/>
             <w:shd w:fill="F7F6F2" w:color="auto" w:val="clear"/>
             <w:tcMar>
               <w:top w:type="dxa" w:w="90"/>
@@ -13550,7 +13550,7 @@
       <w:tr>
         <w:tc>
           <w:tcPr>
-            <w:tcW w:type="dxa" w:w="2651"/>
+            <w:tcW w:type="dxa" w:w="2627"/>
             <w:tcMar>
               <w:top w:type="dxa" w:w="90"/>
               <w:left w:type="dxa" w:w="110"/>
@@ -13575,7 +13575,7 @@
         </w:tc>
         <w:tc>
           <w:tcPr>
-            <w:tcW w:type="dxa" w:w="2390"/>
+            <w:tcW w:type="dxa" w:w="2375"/>
             <w:tcMar>
               <w:top w:type="dxa" w:w="90"/>
               <w:left w:type="dxa" w:w="110"/>
@@ -13602,7 +13602,7 @@
         </w:tc>
         <w:tc>
           <w:tcPr>
-            <w:tcW w:type="dxa" w:w="4597"/>
+            <w:tcW w:type="dxa" w:w="4636"/>
             <w:tcMar>
               <w:top w:type="dxa" w:w="90"/>
               <w:left w:type="dxa" w:w="110"/>
@@ -13629,7 +13629,7 @@
       <w:tr>
         <w:tc>
           <w:tcPr>
-            <w:tcW w:type="dxa" w:w="2651"/>
+            <w:tcW w:type="dxa" w:w="2627"/>
             <w:shd w:fill="F7F6F2" w:color="auto" w:val="clear"/>
             <w:tcMar>
               <w:top w:type="dxa" w:w="90"/>
@@ -13655,7 +13655,7 @@
         </w:tc>
         <w:tc>
           <w:tcPr>
-            <w:tcW w:type="dxa" w:w="2390"/>
+            <w:tcW w:type="dxa" w:w="2375"/>
             <w:shd w:fill="F7F6F2" w:color="auto" w:val="clear"/>
             <w:tcMar>
               <w:top w:type="dxa" w:w="90"/>
@@ -13683,7 +13683,7 @@
         </w:tc>
         <w:tc>
           <w:tcPr>
-            <w:tcW w:type="dxa" w:w="4597"/>
+            <w:tcW w:type="dxa" w:w="4636"/>
             <w:shd w:fill="F7F6F2" w:color="auto" w:val="clear"/>
             <w:tcMar>
               <w:top w:type="dxa" w:w="90"/>
@@ -13711,7 +13711,7 @@
       <w:tr>
         <w:tc>
           <w:tcPr>
-            <w:tcW w:type="dxa" w:w="2651"/>
+            <w:tcW w:type="dxa" w:w="2627"/>
             <w:tcMar>
               <w:top w:type="dxa" w:w="90"/>
               <w:left w:type="dxa" w:w="110"/>
@@ -13736,7 +13736,7 @@
         </w:tc>
         <w:tc>
           <w:tcPr>
-            <w:tcW w:type="dxa" w:w="2390"/>
+            <w:tcW w:type="dxa" w:w="2375"/>
             <w:tcMar>
               <w:top w:type="dxa" w:w="90"/>
               <w:left w:type="dxa" w:w="110"/>
@@ -13763,7 +13763,7 @@
         </w:tc>
         <w:tc>
           <w:tcPr>
-            <w:tcW w:type="dxa" w:w="4597"/>
+            <w:tcW w:type="dxa" w:w="4636"/>
             <w:tcMar>
               <w:top w:type="dxa" w:w="90"/>
               <w:left w:type="dxa" w:w="110"/>
@@ -13790,7 +13790,7 @@
       <w:tr>
         <w:tc>
           <w:tcPr>
-            <w:tcW w:type="dxa" w:w="2651"/>
+            <w:tcW w:type="dxa" w:w="2627"/>
             <w:shd w:fill="F7F6F2" w:color="auto" w:val="clear"/>
             <w:tcMar>
               <w:top w:type="dxa" w:w="90"/>
@@ -13816,7 +13816,7 @@
         </w:tc>
         <w:tc>
           <w:tcPr>
-            <w:tcW w:type="dxa" w:w="2390"/>
+            <w:tcW w:type="dxa" w:w="2375"/>
             <w:shd w:fill="F7F6F2" w:color="auto" w:val="clear"/>
             <w:tcMar>
               <w:top w:type="dxa" w:w="90"/>
@@ -13844,7 +13844,7 @@
         </w:tc>
         <w:tc>
           <w:tcPr>
-            <w:tcW w:type="dxa" w:w="4597"/>
+            <w:tcW w:type="dxa" w:w="4636"/>
             <w:shd w:fill="F7F6F2" w:color="auto" w:val="clear"/>
             <w:tcMar>
               <w:top w:type="dxa" w:w="90"/>
@@ -13906,7 +13906,7 @@
       <w:tr>
         <w:tc>
           <w:tcPr>
-            <w:tcW w:type="dxa" w:w="2651"/>
+            <w:tcW w:type="dxa" w:w="2627"/>
             <w:tcMar>
               <w:top w:type="dxa" w:w="90"/>
               <w:left w:type="dxa" w:w="110"/>
@@ -13931,7 +13931,7 @@
         </w:tc>
         <w:tc>
           <w:tcPr>
-            <w:tcW w:type="dxa" w:w="2390"/>
+            <w:tcW w:type="dxa" w:w="2375"/>
             <w:tcMar>
               <w:top w:type="dxa" w:w="90"/>
               <w:left w:type="dxa" w:w="110"/>
@@ -13958,7 +13958,7 @@
         </w:tc>
         <w:tc>
           <w:tcPr>
-            <w:tcW w:type="dxa" w:w="4597"/>
+            <w:tcW w:type="dxa" w:w="4636"/>
             <w:tcMar>
               <w:top w:type="dxa" w:w="90"/>
               <w:left w:type="dxa" w:w="110"/>
@@ -13985,7 +13985,7 @@
       <w:tr>
         <w:tc>
           <w:tcPr>
-            <w:tcW w:type="dxa" w:w="2651"/>
+            <w:tcW w:type="dxa" w:w="2627"/>
             <w:shd w:fill="F7F6F2" w:color="auto" w:val="clear"/>
             <w:tcMar>
               <w:top w:type="dxa" w:w="90"/>
@@ -14011,7 +14011,7 @@
         </w:tc>
         <w:tc>
           <w:tcPr>
-            <w:tcW w:type="dxa" w:w="2390"/>
+            <w:tcW w:type="dxa" w:w="2375"/>
             <w:shd w:fill="F7F6F2" w:color="auto" w:val="clear"/>
             <w:tcMar>
               <w:top w:type="dxa" w:w="90"/>
@@ -14039,7 +14039,7 @@
         </w:tc>
         <w:tc>
           <w:tcPr>
-            <w:tcW w:type="dxa" w:w="4597"/>
+            <w:tcW w:type="dxa" w:w="4636"/>
             <w:shd w:fill="F7F6F2" w:color="auto" w:val="clear"/>
             <w:tcMar>
               <w:top w:type="dxa" w:w="90"/>
@@ -14067,7 +14067,7 @@
       <w:tr>
         <w:tc>
           <w:tcPr>
-            <w:tcW w:type="dxa" w:w="2651"/>
+            <w:tcW w:type="dxa" w:w="2627"/>
             <w:tcMar>
               <w:top w:type="dxa" w:w="90"/>
               <w:left w:type="dxa" w:w="110"/>
@@ -14092,7 +14092,7 @@
         </w:tc>
         <w:tc>
           <w:tcPr>
-            <w:tcW w:type="dxa" w:w="2390"/>
+            <w:tcW w:type="dxa" w:w="2375"/>
             <w:tcMar>
               <w:top w:type="dxa" w:w="90"/>
               <w:left w:type="dxa" w:w="110"/>
@@ -14119,7 +14119,7 @@
         </w:tc>
         <w:tc>
           <w:tcPr>
-            <w:tcW w:type="dxa" w:w="4597"/>
+            <w:tcW w:type="dxa" w:w="4636"/>
             <w:tcMar>
               <w:top w:type="dxa" w:w="90"/>
               <w:left w:type="dxa" w:w="110"/>
@@ -14146,7 +14146,7 @@
       <w:tr>
         <w:tc>
           <w:tcPr>
-            <w:tcW w:type="dxa" w:w="2651"/>
+            <w:tcW w:type="dxa" w:w="2627"/>
             <w:shd w:fill="F7F6F2" w:color="auto" w:val="clear"/>
             <w:tcMar>
               <w:top w:type="dxa" w:w="90"/>
@@ -14172,7 +14172,7 @@
         </w:tc>
         <w:tc>
           <w:tcPr>
-            <w:tcW w:type="dxa" w:w="2390"/>
+            <w:tcW w:type="dxa" w:w="2375"/>
             <w:shd w:fill="F7F6F2" w:color="auto" w:val="clear"/>
             <w:tcMar>
               <w:top w:type="dxa" w:w="90"/>
@@ -14200,7 +14200,7 @@
         </w:tc>
         <w:tc>
           <w:tcPr>
-            <w:tcW w:type="dxa" w:w="4597"/>
+            <w:tcW w:type="dxa" w:w="4636"/>
             <w:shd w:fill="F7F6F2" w:color="auto" w:val="clear"/>
             <w:tcMar>
               <w:top w:type="dxa" w:w="90"/>
@@ -14310,52 +14310,44 @@
                 <w:sz w:val="20"/>
                 <w:szCs w:val="20"/>
               </w:rPr>
-              <w:t xml:space="preserve">: a fila de ligação da recepção/SDR em cada empresa</w:t>
-            </w:r>
-          </w:p>
-        </w:tc>
-      </w:tr>
-      <w:tr>
-        <w:tc>
-          <w:tcPr>
-            <w:tcW w:type="dxa" w:w="2651"/>
-            <w:tcMar>
-              <w:top w:type="dxa" w:w="90"/>
-              <w:left w:type="dxa" w:w="110"/>
-              <w:bottom w:type="dxa" w:w="90"/>
-              <w:right w:type="dxa" w:w="110"/>
-            </w:tcMar>
-            <w:vAlign w:val="center"/>
-          </w:tcPr>
-          <w:p>
-            <w:pPr>
-              <w:spacing w:after="0" w:line="250"/>
-            </w:pPr>
-            <w:r>
-              <w:rPr>
-                <w:color w:val="23293D"/>
-                <w:sz w:val="20"/>
-                <w:szCs w:val="20"/>
-              </w:rPr>
-              <w:t xml:space="preserve">Risartanos</w:t>
-            </w:r>
-          </w:p>
-        </w:tc>
-        <w:tc>
-          <w:tcPr>
-            <w:tcW w:type="dxa" w:w="2390"/>
-            <w:tcMar>
-              <w:top w:type="dxa" w:w="90"/>
-              <w:left w:type="dxa" w:w="110"/>
-              <w:bottom w:type="dxa" w:w="90"/>
-              <w:right w:type="dxa" w:w="110"/>
-            </w:tcMar>
-            <w:vAlign w:val="center"/>
-          </w:tcPr>
-          <w:p>
-            <w:pPr>
-              <w:spacing w:after="0" w:line="250"/>
-            </w:pPr>
+              <w:t xml:space="preserve">: a fila de ligação da recepção/SDR em cada empresa. ⚠️ </w:t>
+            </w:r>
+            <w:r>
+              <w:rPr>
+                <w:b/>
+                <w:bCs/>
+                <w:color w:val="23293D"/>
+                <w:sz w:val="20"/>
+                <w:szCs w:val="20"/>
+              </w:rPr>
+              <w:t xml:space="preserve">Este módulo tem MANUAL PRÓPRIO</w:t>
+            </w:r>
+            <w:r>
+              <w:rPr>
+                <w:color w:val="23293D"/>
+                <w:sz w:val="20"/>
+                <w:szCs w:val="20"/>
+              </w:rPr>
+              <w:t xml:space="preserve">, no botão </w:t>
+            </w:r>
+            <w:r>
+              <w:rPr>
+                <w:b/>
+                <w:bCs/>
+                <w:color w:val="23293D"/>
+                <w:sz w:val="20"/>
+                <w:szCs w:val="20"/>
+              </w:rPr>
+              <w:t xml:space="preserve">Manual</w:t>
+            </w:r>
+            <w:r>
+              <w:rPr>
+                <w:color w:val="23293D"/>
+                <w:sz w:val="20"/>
+                <w:szCs w:val="20"/>
+              </w:rPr>
+              <w:t xml:space="preserve"> dentro dele (ou </w:t>
+            </w:r>
             <w:r>
               <w:rPr>
                 <w:rFonts w:ascii="Consolas" w:cs="Consolas" w:eastAsia="Consolas" w:hAnsi="Consolas"/>
@@ -14364,66 +14356,15 @@
                 <w:szCs w:val="18"/>
                 <w:shd w:fill="EFEDE6" w:color="auto" w:val="clear"/>
               </w:rPr>
-              <w:t xml:space="preserve">/risartanos</w:t>
-            </w:r>
-          </w:p>
-        </w:tc>
-        <w:tc>
-          <w:tcPr>
-            <w:tcW w:type="dxa" w:w="4597"/>
-            <w:tcMar>
-              <w:top w:type="dxa" w:w="90"/>
-              <w:left w:type="dxa" w:w="110"/>
-              <w:bottom w:type="dxa" w:w="90"/>
-              <w:right w:type="dxa" w:w="110"/>
-            </w:tcMar>
-            <w:vAlign w:val="center"/>
-          </w:tcPr>
-          <w:p>
-            <w:pPr>
-              <w:spacing w:after="0" w:line="250"/>
-            </w:pPr>
-            <w:r>
-              <w:rPr>
-                <w:color w:val="23293D"/>
-                <w:sz w:val="20"/>
-                <w:szCs w:val="20"/>
-              </w:rPr>
-              <w:t xml:space="preserve">A equipe: cadastro, unidades e </w:t>
-            </w:r>
-            <w:r>
-              <w:rPr>
-                <w:b/>
-                <w:bCs/>
-                <w:color w:val="23293D"/>
-                <w:sz w:val="20"/>
-                <w:szCs w:val="20"/>
-              </w:rPr>
-              <w:t xml:space="preserve">acesso ao sistema</w:t>
-            </w:r>
-            <w:r>
-              <w:rPr>
-                <w:color w:val="23293D"/>
-                <w:sz w:val="20"/>
-                <w:szCs w:val="20"/>
-              </w:rPr>
-              <w:t xml:space="preserve"> na mesma ficha (ver </w:t>
-            </w:r>
-            <w:r>
-              <w:rPr>
-                <w:color w:val="1F3253"/>
-                <w:sz w:val="20"/>
-                <w:szCs w:val="20"/>
-              </w:rPr>
-              <w:t xml:space="preserve">seção 2.5</w:t>
-            </w:r>
-            <w:r>
-              <w:rPr>
-                <w:color w:val="23293D"/>
-                <w:sz w:val="20"/>
-                <w:szCs w:val="20"/>
-              </w:rPr>
-              <w:t xml:space="preserve">)</w:t>
+              <w:t xml:space="preserve">/empresarial/manual</w:t>
+            </w:r>
+            <w:r>
+              <w:rPr>
+                <w:color w:val="23293D"/>
+                <w:sz w:val="20"/>
+                <w:szCs w:val="20"/>
+              </w:rPr>
+              <w:t xml:space="preserve">): titular, faixa, carência, proposta, termo de inclusão e cobrança estão explicados lá, não aqui</w:t>
             </w:r>
           </w:p>
         </w:tc>
@@ -14431,34 +14372,32 @@
       <w:tr>
         <w:tc>
           <w:tcPr>
-            <w:tcW w:type="dxa" w:w="2651"/>
-            <w:shd w:fill="F7F6F2" w:color="auto" w:val="clear"/>
-            <w:tcMar>
-              <w:top w:type="dxa" w:w="90"/>
-              <w:left w:type="dxa" w:w="110"/>
-              <w:bottom w:type="dxa" w:w="90"/>
-              <w:right w:type="dxa" w:w="110"/>
-            </w:tcMar>
-            <w:vAlign w:val="center"/>
-          </w:tcPr>
-          <w:p>
-            <w:pPr>
-              <w:spacing w:after="0" w:line="250"/>
-            </w:pPr>
-            <w:r>
-              <w:rPr>
-                <w:color w:val="23293D"/>
-                <w:sz w:val="20"/>
-                <w:szCs w:val="20"/>
-              </w:rPr>
-              <w:t xml:space="preserve">Relatórios</w:t>
-            </w:r>
-          </w:p>
-        </w:tc>
-        <w:tc>
-          <w:tcPr>
-            <w:tcW w:type="dxa" w:w="2390"/>
-            <w:shd w:fill="F7F6F2" w:color="auto" w:val="clear"/>
+            <w:tcW w:type="dxa" w:w="2627"/>
+            <w:tcMar>
+              <w:top w:type="dxa" w:w="90"/>
+              <w:left w:type="dxa" w:w="110"/>
+              <w:bottom w:type="dxa" w:w="90"/>
+              <w:right w:type="dxa" w:w="110"/>
+            </w:tcMar>
+            <w:vAlign w:val="center"/>
+          </w:tcPr>
+          <w:p>
+            <w:pPr>
+              <w:spacing w:after="0" w:line="250"/>
+            </w:pPr>
+            <w:r>
+              <w:rPr>
+                <w:color w:val="23293D"/>
+                <w:sz w:val="20"/>
+                <w:szCs w:val="20"/>
+              </w:rPr>
+              <w:t xml:space="preserve">Risartanos</w:t>
+            </w:r>
+          </w:p>
+        </w:tc>
+        <w:tc>
+          <w:tcPr>
+            <w:tcW w:type="dxa" w:w="2375"/>
             <w:tcMar>
               <w:top w:type="dxa" w:w="90"/>
               <w:left w:type="dxa" w:w="110"/>
@@ -14479,33 +14418,66 @@
                 <w:szCs w:val="18"/>
                 <w:shd w:fill="EFEDE6" w:color="auto" w:val="clear"/>
               </w:rPr>
-              <w:t xml:space="preserve">/relatorios</w:t>
-            </w:r>
-          </w:p>
-        </w:tc>
-        <w:tc>
-          <w:tcPr>
-            <w:tcW w:type="dxa" w:w="4597"/>
-            <w:shd w:fill="F7F6F2" w:color="auto" w:val="clear"/>
-            <w:tcMar>
-              <w:top w:type="dxa" w:w="90"/>
-              <w:left w:type="dxa" w:w="110"/>
-              <w:bottom w:type="dxa" w:w="90"/>
-              <w:right w:type="dxa" w:w="110"/>
-            </w:tcMar>
-            <w:vAlign w:val="center"/>
-          </w:tcPr>
-          <w:p>
-            <w:pPr>
-              <w:spacing w:after="0" w:line="250"/>
-            </w:pPr>
-            <w:r>
-              <w:rPr>
-                <w:color w:val="23293D"/>
-                <w:sz w:val="20"/>
-                <w:szCs w:val="20"/>
-              </w:rPr>
-              <w:t xml:space="preserve">Indicadores de agenda, rede e produtividade</w:t>
+              <w:t xml:space="preserve">/risartanos</w:t>
+            </w:r>
+          </w:p>
+        </w:tc>
+        <w:tc>
+          <w:tcPr>
+            <w:tcW w:type="dxa" w:w="4636"/>
+            <w:tcMar>
+              <w:top w:type="dxa" w:w="90"/>
+              <w:left w:type="dxa" w:w="110"/>
+              <w:bottom w:type="dxa" w:w="90"/>
+              <w:right w:type="dxa" w:w="110"/>
+            </w:tcMar>
+            <w:vAlign w:val="center"/>
+          </w:tcPr>
+          <w:p>
+            <w:pPr>
+              <w:spacing w:after="0" w:line="250"/>
+            </w:pPr>
+            <w:r>
+              <w:rPr>
+                <w:color w:val="23293D"/>
+                <w:sz w:val="20"/>
+                <w:szCs w:val="20"/>
+              </w:rPr>
+              <w:t xml:space="preserve">A equipe: cadastro, unidades e </w:t>
+            </w:r>
+            <w:r>
+              <w:rPr>
+                <w:b/>
+                <w:bCs/>
+                <w:color w:val="23293D"/>
+                <w:sz w:val="20"/>
+                <w:szCs w:val="20"/>
+              </w:rPr>
+              <w:t xml:space="preserve">acesso ao sistema</w:t>
+            </w:r>
+            <w:r>
+              <w:rPr>
+                <w:color w:val="23293D"/>
+                <w:sz w:val="20"/>
+                <w:szCs w:val="20"/>
+              </w:rPr>
+              <w:t xml:space="preserve"> na mesma ficha (ver </w:t>
+            </w:r>
+            <w:r>
+              <w:rPr>
+                <w:color w:val="1F3253"/>
+                <w:sz w:val="20"/>
+                <w:szCs w:val="20"/>
+              </w:rPr>
+              <w:t xml:space="preserve">seção 2.5</w:t>
+            </w:r>
+            <w:r>
+              <w:rPr>
+                <w:color w:val="23293D"/>
+                <w:sz w:val="20"/>
+                <w:szCs w:val="20"/>
+              </w:rPr>
+              <w:t xml:space="preserve">)</w:t>
             </w:r>
           </w:p>
         </w:tc>
@@ -14513,32 +14485,34 @@
       <w:tr>
         <w:tc>
           <w:tcPr>
-            <w:tcW w:type="dxa" w:w="2651"/>
-            <w:tcMar>
-              <w:top w:type="dxa" w:w="90"/>
-              <w:left w:type="dxa" w:w="110"/>
-              <w:bottom w:type="dxa" w:w="90"/>
-              <w:right w:type="dxa" w:w="110"/>
-            </w:tcMar>
-            <w:vAlign w:val="center"/>
-          </w:tcPr>
-          <w:p>
-            <w:pPr>
-              <w:spacing w:after="0" w:line="250"/>
-            </w:pPr>
-            <w:r>
-              <w:rPr>
-                <w:color w:val="23293D"/>
-                <w:sz w:val="20"/>
-                <w:szCs w:val="20"/>
-              </w:rPr>
-              <w:t xml:space="preserve">Manual</w:t>
-            </w:r>
-          </w:p>
-        </w:tc>
-        <w:tc>
-          <w:tcPr>
-            <w:tcW w:type="dxa" w:w="2390"/>
+            <w:tcW w:type="dxa" w:w="2627"/>
+            <w:shd w:fill="F7F6F2" w:color="auto" w:val="clear"/>
+            <w:tcMar>
+              <w:top w:type="dxa" w:w="90"/>
+              <w:left w:type="dxa" w:w="110"/>
+              <w:bottom w:type="dxa" w:w="90"/>
+              <w:right w:type="dxa" w:w="110"/>
+            </w:tcMar>
+            <w:vAlign w:val="center"/>
+          </w:tcPr>
+          <w:p>
+            <w:pPr>
+              <w:spacing w:after="0" w:line="250"/>
+            </w:pPr>
+            <w:r>
+              <w:rPr>
+                <w:color w:val="23293D"/>
+                <w:sz w:val="20"/>
+                <w:szCs w:val="20"/>
+              </w:rPr>
+              <w:t xml:space="preserve">Relatórios</w:t>
+            </w:r>
+          </w:p>
+        </w:tc>
+        <w:tc>
+          <w:tcPr>
+            <w:tcW w:type="dxa" w:w="2375"/>
+            <w:shd w:fill="F7F6F2" w:color="auto" w:val="clear"/>
             <w:tcMar>
               <w:top w:type="dxa" w:w="90"/>
               <w:left w:type="dxa" w:w="110"/>
@@ -14559,32 +14533,33 @@
                 <w:szCs w:val="18"/>
                 <w:shd w:fill="EFEDE6" w:color="auto" w:val="clear"/>
               </w:rPr>
-              <w:t xml:space="preserve">/manual</w:t>
-            </w:r>
-          </w:p>
-        </w:tc>
-        <w:tc>
-          <w:tcPr>
-            <w:tcW w:type="dxa" w:w="4597"/>
-            <w:tcMar>
-              <w:top w:type="dxa" w:w="90"/>
-              <w:left w:type="dxa" w:w="110"/>
-              <w:bottom w:type="dxa" w:w="90"/>
-              <w:right w:type="dxa" w:w="110"/>
-            </w:tcMar>
-            <w:vAlign w:val="center"/>
-          </w:tcPr>
-          <w:p>
-            <w:pPr>
-              <w:spacing w:after="0" w:line="250"/>
-            </w:pPr>
-            <w:r>
-              <w:rPr>
-                <w:color w:val="23293D"/>
-                <w:sz w:val="20"/>
-                <w:szCs w:val="20"/>
-              </w:rPr>
-              <w:t xml:space="preserve">Este manual, sempre na versão do sistema no ar</w:t>
+              <w:t xml:space="preserve">/relatorios</w:t>
+            </w:r>
+          </w:p>
+        </w:tc>
+        <w:tc>
+          <w:tcPr>
+            <w:tcW w:type="dxa" w:w="4636"/>
+            <w:shd w:fill="F7F6F2" w:color="auto" w:val="clear"/>
+            <w:tcMar>
+              <w:top w:type="dxa" w:w="90"/>
+              <w:left w:type="dxa" w:w="110"/>
+              <w:bottom w:type="dxa" w:w="90"/>
+              <w:right w:type="dxa" w:w="110"/>
+            </w:tcMar>
+            <w:vAlign w:val="center"/>
+          </w:tcPr>
+          <w:p>
+            <w:pPr>
+              <w:spacing w:after="0" w:line="250"/>
+            </w:pPr>
+            <w:r>
+              <w:rPr>
+                <w:color w:val="23293D"/>
+                <w:sz w:val="20"/>
+                <w:szCs w:val="20"/>
+              </w:rPr>
+              <w:t xml:space="preserve">Indicadores de agenda, rede e produtividade</w:t>
             </w:r>
           </w:p>
         </w:tc>
@@ -14592,34 +14567,32 @@
       <w:tr>
         <w:tc>
           <w:tcPr>
-            <w:tcW w:type="dxa" w:w="2651"/>
-            <w:shd w:fill="F7F6F2" w:color="auto" w:val="clear"/>
-            <w:tcMar>
-              <w:top w:type="dxa" w:w="90"/>
-              <w:left w:type="dxa" w:w="110"/>
-              <w:bottom w:type="dxa" w:w="90"/>
-              <w:right w:type="dxa" w:w="110"/>
-            </w:tcMar>
-            <w:vAlign w:val="center"/>
-          </w:tcPr>
-          <w:p>
-            <w:pPr>
-              <w:spacing w:after="0" w:line="250"/>
-            </w:pPr>
-            <w:r>
-              <w:rPr>
-                <w:color w:val="23293D"/>
-                <w:sz w:val="20"/>
-                <w:szCs w:val="20"/>
-              </w:rPr>
-              <w:t xml:space="preserve">Alertas</w:t>
-            </w:r>
-          </w:p>
-        </w:tc>
-        <w:tc>
-          <w:tcPr>
-            <w:tcW w:type="dxa" w:w="2390"/>
-            <w:shd w:fill="F7F6F2" w:color="auto" w:val="clear"/>
+            <w:tcW w:type="dxa" w:w="2627"/>
+            <w:tcMar>
+              <w:top w:type="dxa" w:w="90"/>
+              <w:left w:type="dxa" w:w="110"/>
+              <w:bottom w:type="dxa" w:w="90"/>
+              <w:right w:type="dxa" w:w="110"/>
+            </w:tcMar>
+            <w:vAlign w:val="center"/>
+          </w:tcPr>
+          <w:p>
+            <w:pPr>
+              <w:spacing w:after="0" w:line="250"/>
+            </w:pPr>
+            <w:r>
+              <w:rPr>
+                <w:color w:val="23293D"/>
+                <w:sz w:val="20"/>
+                <w:szCs w:val="20"/>
+              </w:rPr>
+              <w:t xml:space="preserve">Manual</w:t>
+            </w:r>
+          </w:p>
+        </w:tc>
+        <w:tc>
+          <w:tcPr>
+            <w:tcW w:type="dxa" w:w="2375"/>
             <w:tcMar>
               <w:top w:type="dxa" w:w="90"/>
               <w:left w:type="dxa" w:w="110"/>
@@ -14640,33 +14613,32 @@
                 <w:szCs w:val="18"/>
                 <w:shd w:fill="EFEDE6" w:color="auto" w:val="clear"/>
               </w:rPr>
-              <w:t xml:space="preserve">/alertas</w:t>
-            </w:r>
-          </w:p>
-        </w:tc>
-        <w:tc>
-          <w:tcPr>
-            <w:tcW w:type="dxa" w:w="4597"/>
-            <w:shd w:fill="F7F6F2" w:color="auto" w:val="clear"/>
-            <w:tcMar>
-              <w:top w:type="dxa" w:w="90"/>
-              <w:left w:type="dxa" w:w="110"/>
-              <w:bottom w:type="dxa" w:w="90"/>
-              <w:right w:type="dxa" w:w="110"/>
-            </w:tcMar>
-            <w:vAlign w:val="center"/>
-          </w:tcPr>
-          <w:p>
-            <w:pPr>
-              <w:spacing w:after="0" w:line="250"/>
-            </w:pPr>
-            <w:r>
-              <w:rPr>
-                <w:color w:val="23293D"/>
-                <w:sz w:val="20"/>
-                <w:szCs w:val="20"/>
-              </w:rPr>
-              <w:t xml:space="preserve">O que o sistema está avisando, e o relógio</w:t>
+              <w:t xml:space="preserve">/manual</w:t>
+            </w:r>
+          </w:p>
+        </w:tc>
+        <w:tc>
+          <w:tcPr>
+            <w:tcW w:type="dxa" w:w="4636"/>
+            <w:tcMar>
+              <w:top w:type="dxa" w:w="90"/>
+              <w:left w:type="dxa" w:w="110"/>
+              <w:bottom w:type="dxa" w:w="90"/>
+              <w:right w:type="dxa" w:w="110"/>
+            </w:tcMar>
+            <w:vAlign w:val="center"/>
+          </w:tcPr>
+          <w:p>
+            <w:pPr>
+              <w:spacing w:after="0" w:line="250"/>
+            </w:pPr>
+            <w:r>
+              <w:rPr>
+                <w:color w:val="23293D"/>
+                <w:sz w:val="20"/>
+                <w:szCs w:val="20"/>
+              </w:rPr>
+              <w:t xml:space="preserve">Este manual, sempre na versão do sistema no ar</w:t>
             </w:r>
           </w:p>
         </w:tc>
@@ -14674,32 +14646,34 @@
       <w:tr>
         <w:tc>
           <w:tcPr>
-            <w:tcW w:type="dxa" w:w="2651"/>
-            <w:tcMar>
-              <w:top w:type="dxa" w:w="90"/>
-              <w:left w:type="dxa" w:w="110"/>
-              <w:bottom w:type="dxa" w:w="90"/>
-              <w:right w:type="dxa" w:w="110"/>
-            </w:tcMar>
-            <w:vAlign w:val="center"/>
-          </w:tcPr>
-          <w:p>
-            <w:pPr>
-              <w:spacing w:after="0" w:line="250"/>
-            </w:pPr>
-            <w:r>
-              <w:rPr>
-                <w:color w:val="23293D"/>
-                <w:sz w:val="20"/>
-                <w:szCs w:val="20"/>
-              </w:rPr>
-              <w:t xml:space="preserve">Problemas</w:t>
-            </w:r>
-          </w:p>
-        </w:tc>
-        <w:tc>
-          <w:tcPr>
-            <w:tcW w:type="dxa" w:w="2390"/>
+            <w:tcW w:type="dxa" w:w="2627"/>
+            <w:shd w:fill="F7F6F2" w:color="auto" w:val="clear"/>
+            <w:tcMar>
+              <w:top w:type="dxa" w:w="90"/>
+              <w:left w:type="dxa" w:w="110"/>
+              <w:bottom w:type="dxa" w:w="90"/>
+              <w:right w:type="dxa" w:w="110"/>
+            </w:tcMar>
+            <w:vAlign w:val="center"/>
+          </w:tcPr>
+          <w:p>
+            <w:pPr>
+              <w:spacing w:after="0" w:line="250"/>
+            </w:pPr>
+            <w:r>
+              <w:rPr>
+                <w:color w:val="23293D"/>
+                <w:sz w:val="20"/>
+                <w:szCs w:val="20"/>
+              </w:rPr>
+              <w:t xml:space="preserve">Alertas</w:t>
+            </w:r>
+          </w:p>
+        </w:tc>
+        <w:tc>
+          <w:tcPr>
+            <w:tcW w:type="dxa" w:w="2375"/>
+            <w:shd w:fill="F7F6F2" w:color="auto" w:val="clear"/>
             <w:tcMar>
               <w:top w:type="dxa" w:w="90"/>
               <w:left w:type="dxa" w:w="110"/>
@@ -14720,32 +14694,33 @@
                 <w:szCs w:val="18"/>
                 <w:shd w:fill="EFEDE6" w:color="auto" w:val="clear"/>
               </w:rPr>
-              <w:t xml:space="preserve">/problemas</w:t>
-            </w:r>
-          </w:p>
-        </w:tc>
-        <w:tc>
-          <w:tcPr>
-            <w:tcW w:type="dxa" w:w="4597"/>
-            <w:tcMar>
-              <w:top w:type="dxa" w:w="90"/>
-              <w:left w:type="dxa" w:w="110"/>
-              <w:bottom w:type="dxa" w:w="90"/>
-              <w:right w:type="dxa" w:w="110"/>
-            </w:tcMar>
-            <w:vAlign w:val="center"/>
-          </w:tcPr>
-          <w:p>
-            <w:pPr>
-              <w:spacing w:after="0" w:line="250"/>
-            </w:pPr>
-            <w:r>
-              <w:rPr>
-                <w:color w:val="23293D"/>
-                <w:sz w:val="20"/>
-                <w:szCs w:val="20"/>
-              </w:rPr>
-              <w:t xml:space="preserve">Relatar e acompanhar problemas, dúvidas e sugestões</w:t>
+              <w:t xml:space="preserve">/alertas</w:t>
+            </w:r>
+          </w:p>
+        </w:tc>
+        <w:tc>
+          <w:tcPr>
+            <w:tcW w:type="dxa" w:w="4636"/>
+            <w:shd w:fill="F7F6F2" w:color="auto" w:val="clear"/>
+            <w:tcMar>
+              <w:top w:type="dxa" w:w="90"/>
+              <w:left w:type="dxa" w:w="110"/>
+              <w:bottom w:type="dxa" w:w="90"/>
+              <w:right w:type="dxa" w:w="110"/>
+            </w:tcMar>
+            <w:vAlign w:val="center"/>
+          </w:tcPr>
+          <w:p>
+            <w:pPr>
+              <w:spacing w:after="0" w:line="250"/>
+            </w:pPr>
+            <w:r>
+              <w:rPr>
+                <w:color w:val="23293D"/>
+                <w:sz w:val="20"/>
+                <w:szCs w:val="20"/>
+              </w:rPr>
+              <w:t xml:space="preserve">O que o sistema está avisando, e o relógio</w:t>
             </w:r>
           </w:p>
         </w:tc>
@@ -14753,34 +14728,32 @@
       <w:tr>
         <w:tc>
           <w:tcPr>
-            <w:tcW w:type="dxa" w:w="2651"/>
-            <w:shd w:fill="F7F6F2" w:color="auto" w:val="clear"/>
-            <w:tcMar>
-              <w:top w:type="dxa" w:w="90"/>
-              <w:left w:type="dxa" w:w="110"/>
-              <w:bottom w:type="dxa" w:w="90"/>
-              <w:right w:type="dxa" w:w="110"/>
-            </w:tcMar>
-            <w:vAlign w:val="center"/>
-          </w:tcPr>
-          <w:p>
-            <w:pPr>
-              <w:spacing w:after="0" w:line="250"/>
-            </w:pPr>
-            <w:r>
-              <w:rPr>
-                <w:color w:val="23293D"/>
-                <w:sz w:val="20"/>
-                <w:szCs w:val="20"/>
-              </w:rPr>
-              <w:t xml:space="preserve">Administração</w:t>
-            </w:r>
-          </w:p>
-        </w:tc>
-        <w:tc>
-          <w:tcPr>
-            <w:tcW w:type="dxa" w:w="2390"/>
-            <w:shd w:fill="F7F6F2" w:color="auto" w:val="clear"/>
+            <w:tcW w:type="dxa" w:w="2627"/>
+            <w:tcMar>
+              <w:top w:type="dxa" w:w="90"/>
+              <w:left w:type="dxa" w:w="110"/>
+              <w:bottom w:type="dxa" w:w="90"/>
+              <w:right w:type="dxa" w:w="110"/>
+            </w:tcMar>
+            <w:vAlign w:val="center"/>
+          </w:tcPr>
+          <w:p>
+            <w:pPr>
+              <w:spacing w:after="0" w:line="250"/>
+            </w:pPr>
+            <w:r>
+              <w:rPr>
+                <w:color w:val="23293D"/>
+                <w:sz w:val="20"/>
+                <w:szCs w:val="20"/>
+              </w:rPr>
+              <w:t xml:space="preserve">Problemas</w:t>
+            </w:r>
+          </w:p>
+        </w:tc>
+        <w:tc>
+          <w:tcPr>
+            <w:tcW w:type="dxa" w:w="2375"/>
             <w:tcMar>
               <w:top w:type="dxa" w:w="90"/>
               <w:left w:type="dxa" w:w="110"/>
@@ -14801,13 +14774,94 @@
                 <w:szCs w:val="18"/>
                 <w:shd w:fill="EFEDE6" w:color="auto" w:val="clear"/>
               </w:rPr>
+              <w:t xml:space="preserve">/problemas</w:t>
+            </w:r>
+          </w:p>
+        </w:tc>
+        <w:tc>
+          <w:tcPr>
+            <w:tcW w:type="dxa" w:w="4636"/>
+            <w:tcMar>
+              <w:top w:type="dxa" w:w="90"/>
+              <w:left w:type="dxa" w:w="110"/>
+              <w:bottom w:type="dxa" w:w="90"/>
+              <w:right w:type="dxa" w:w="110"/>
+            </w:tcMar>
+            <w:vAlign w:val="center"/>
+          </w:tcPr>
+          <w:p>
+            <w:pPr>
+              <w:spacing w:after="0" w:line="250"/>
+            </w:pPr>
+            <w:r>
+              <w:rPr>
+                <w:color w:val="23293D"/>
+                <w:sz w:val="20"/>
+                <w:szCs w:val="20"/>
+              </w:rPr>
+              <w:t xml:space="preserve">Relatar e acompanhar problemas, dúvidas e sugestões</w:t>
+            </w:r>
+          </w:p>
+        </w:tc>
+      </w:tr>
+      <w:tr>
+        <w:tc>
+          <w:tcPr>
+            <w:tcW w:type="dxa" w:w="2627"/>
+            <w:shd w:fill="F7F6F2" w:color="auto" w:val="clear"/>
+            <w:tcMar>
+              <w:top w:type="dxa" w:w="90"/>
+              <w:left w:type="dxa" w:w="110"/>
+              <w:bottom w:type="dxa" w:w="90"/>
+              <w:right w:type="dxa" w:w="110"/>
+            </w:tcMar>
+            <w:vAlign w:val="center"/>
+          </w:tcPr>
+          <w:p>
+            <w:pPr>
+              <w:spacing w:after="0" w:line="250"/>
+            </w:pPr>
+            <w:r>
+              <w:rPr>
+                <w:color w:val="23293D"/>
+                <w:sz w:val="20"/>
+                <w:szCs w:val="20"/>
+              </w:rPr>
+              <w:t xml:space="preserve">Administração</w:t>
+            </w:r>
+          </w:p>
+        </w:tc>
+        <w:tc>
+          <w:tcPr>
+            <w:tcW w:type="dxa" w:w="2375"/>
+            <w:shd w:fill="F7F6F2" w:color="auto" w:val="clear"/>
+            <w:tcMar>
+              <w:top w:type="dxa" w:w="90"/>
+              <w:left w:type="dxa" w:w="110"/>
+              <w:bottom w:type="dxa" w:w="90"/>
+              <w:right w:type="dxa" w:w="110"/>
+            </w:tcMar>
+            <w:vAlign w:val="center"/>
+          </w:tcPr>
+          <w:p>
+            <w:pPr>
+              <w:spacing w:after="0" w:line="250"/>
+            </w:pPr>
+            <w:r>
+              <w:rPr>
+                <w:rFonts w:ascii="Consolas" w:cs="Consolas" w:eastAsia="Consolas" w:hAnsi="Consolas"/>
+                <w:color w:val="1F3253"/>
+                <w:sz w:val="18"/>
+                <w:szCs w:val="18"/>
+                <w:shd w:fill="EFEDE6" w:color="auto" w:val="clear"/>
+              </w:rPr>
               <w:t xml:space="preserve">/admin/*</w:t>
             </w:r>
           </w:p>
         </w:tc>
         <w:tc>
           <w:tcPr>
-            <w:tcW w:type="dxa" w:w="4597"/>
+            <w:tcW w:type="dxa" w:w="4636"/>
             <w:shd w:fill="F7F6F2" w:color="auto" w:val="clear"/>
             <w:tcMar>
               <w:top w:type="dxa" w:w="90"/>

</xml_diff>

<commit_message>
feat(core): confirmar a presença do paciente no Atendimento (OC-00076, v0.299.0)
Relato da recepção: a confirmação só existia na janela da agenda. Conferido:
o cartão "A chegar" tinha Registrar chegada e o menu (faltou / cancelou /
trocar profissional), sem Confirmar — e nem mostrava quem já confirmou.

Decisões do dono (27/09/2026): botão visível "Confirmar" para quem está
agendado; selo verde "Confirmado" depois. Mesma ação (updateAppointmentStatus)
e mesma permissão da agenda — nenhuma regra nova, sem migração.

- Conferido no treino como recepção de teste: Confirmar → aviso → selo
  "Confirmado" e o botão sumiu; no banco, status confirmed. Agendamento de
  teste cancelado depois (fica no treino como cancelado).
- Manual 6.1 (Tarefa 3; e o "Já agendei" que o OC-00080 tirou, ainda citado
  nos erros frequentes), EV-132, novidade 0.299.0.

Co-Authored-By: Claude Opus 5.5 <noreply@anthropic.com>
</commit_message>
<xml_diff>
--- a/docs/treinamento/Manual-de-Treinamento-riSZon.docx
+++ b/docs/treinamento/Manual-de-Treinamento-riSZon.docx
@@ -29893,47 +29893,75 @@
       </w:pPr>
       <w:r>
         <w:rPr>
-          <w:color w:val="23293D"/>
-          <w:sz w:val="21"/>
-          <w:szCs w:val="21"/>
-        </w:rPr>
-        <w:t xml:space="preserve">Botão </w:t>
-      </w:r>
-      <w:r>
-        <w:rPr>
-          <w:b/>
-          <w:bCs/>
-          <w:color w:val="23293D"/>
-          <w:sz w:val="21"/>
-          <w:szCs w:val="21"/>
-        </w:rPr>
-        <w:t xml:space="preserve">Registrar chegada</w:t>
-      </w:r>
-      <w:r>
-        <w:rPr>
-          <w:color w:val="23293D"/>
-          <w:sz w:val="21"/>
-          <w:szCs w:val="21"/>
-        </w:rPr>
-        <w:t xml:space="preserve"> → confira profissional, horário e sala com o paciente na frente → </w:t>
-      </w:r>
-      <w:r>
-        <w:rPr>
-          <w:b/>
-          <w:bCs/>
-          <w:color w:val="23293D"/>
-          <w:sz w:val="21"/>
-          <w:szCs w:val="21"/>
-        </w:rPr>
-        <w:t xml:space="preserve">Confirmar chegada</w:t>
-      </w:r>
-      <w:r>
-        <w:rPr>
-          <w:color w:val="23293D"/>
-          <w:sz w:val="21"/>
-          <w:szCs w:val="21"/>
-        </w:rPr>
-        <w:t xml:space="preserve">.</w:t>
+          <w:b/>
+          <w:bCs/>
+          <w:color w:val="23293D"/>
+          <w:sz w:val="21"/>
+          <w:szCs w:val="21"/>
+        </w:rPr>
+        <w:t xml:space="preserve">Confirmar a presença</w:t>
+      </w:r>
+      <w:r>
+        <w:rPr>
+          <w:color w:val="23293D"/>
+          <w:sz w:val="21"/>
+          <w:szCs w:val="21"/>
+        </w:rPr>
+        <w:t xml:space="preserve"> (quando o paciente confirma por telefone ou mensagem): no cartão </w:t>
+      </w:r>
+      <w:r>
+        <w:rPr>
+          <w:b/>
+          <w:bCs/>
+          <w:color w:val="23293D"/>
+          <w:sz w:val="21"/>
+          <w:szCs w:val="21"/>
+        </w:rPr>
+        <w:t xml:space="preserve">A chegar</w:t>
+      </w:r>
+      <w:r>
+        <w:rPr>
+          <w:color w:val="23293D"/>
+          <w:sz w:val="21"/>
+          <w:szCs w:val="21"/>
+        </w:rPr>
+        <w:t xml:space="preserve">, botão </w:t>
+      </w:r>
+      <w:r>
+        <w:rPr>
+          <w:b/>
+          <w:bCs/>
+          <w:color w:val="23293D"/>
+          <w:sz w:val="21"/>
+          <w:szCs w:val="21"/>
+        </w:rPr>
+        <w:t xml:space="preserve">Confirmar</w:t>
+      </w:r>
+      <w:r>
+        <w:rPr>
+          <w:color w:val="23293D"/>
+          <w:sz w:val="21"/>
+          <w:szCs w:val="21"/>
+        </w:rPr>
+        <w:t xml:space="preserve">. O cartão ganha o selo verde </w:t>
+      </w:r>
+      <w:r>
+        <w:rPr>
+          <w:b/>
+          <w:bCs/>
+          <w:color w:val="23293D"/>
+          <w:sz w:val="21"/>
+          <w:szCs w:val="21"/>
+        </w:rPr>
+        <w:t xml:space="preserve">Confirmado</w:t>
+      </w:r>
+      <w:r>
+        <w:rPr>
+          <w:color w:val="23293D"/>
+          <w:sz w:val="21"/>
+          <w:szCs w:val="21"/>
+        </w:rPr>
+        <w:t xml:space="preserve"> e o botão some — é a mesma situação "Confirmado" da agenda. (Relato OC-00076.)</w:t>
       </w:r>
     </w:p>
     <w:p>
@@ -29947,6 +29975,60 @@
       </w:pPr>
       <w:r>
         <w:rPr>
+          <w:color w:val="23293D"/>
+          <w:sz w:val="21"/>
+          <w:szCs w:val="21"/>
+        </w:rPr>
+        <w:t xml:space="preserve">Botão </w:t>
+      </w:r>
+      <w:r>
+        <w:rPr>
+          <w:b/>
+          <w:bCs/>
+          <w:color w:val="23293D"/>
+          <w:sz w:val="21"/>
+          <w:szCs w:val="21"/>
+        </w:rPr>
+        <w:t xml:space="preserve">Registrar chegada</w:t>
+      </w:r>
+      <w:r>
+        <w:rPr>
+          <w:color w:val="23293D"/>
+          <w:sz w:val="21"/>
+          <w:szCs w:val="21"/>
+        </w:rPr>
+        <w:t xml:space="preserve"> → confira profissional, horário e sala com o paciente na frente → </w:t>
+      </w:r>
+      <w:r>
+        <w:rPr>
+          <w:b/>
+          <w:bCs/>
+          <w:color w:val="23293D"/>
+          <w:sz w:val="21"/>
+          <w:szCs w:val="21"/>
+        </w:rPr>
+        <w:t xml:space="preserve">Confirmar chegada</w:t>
+      </w:r>
+      <w:r>
+        <w:rPr>
+          <w:color w:val="23293D"/>
+          <w:sz w:val="21"/>
+          <w:szCs w:val="21"/>
+        </w:rPr>
+        <w:t xml:space="preserve">.</w:t>
+      </w:r>
+    </w:p>
+    <w:p>
+      <w:pPr>
+        <w:pStyle w:val="ListParagraph"/>
+        <w:numPr>
+          <w:ilvl w:val="0"/>
+          <w:numId w:val="38"/>
+        </w:numPr>
+        <w:spacing w:after="80" w:line="270"/>
+      </w:pPr>
+      <w:r>
+        <w:rPr>
           <w:b/>
           <w:bCs/>
           <w:color w:val="23293D"/>
@@ -29962,6 +30044,143 @@
           <w:szCs w:val="21"/>
         </w:rPr>
         <w:t xml:space="preserve">, não a recepção.</w:t>
+      </w:r>
+    </w:p>
+    <w:tbl>
+      <w:tblPr>
+        <w:tblW w:type="dxa" w:w="9638"/>
+        <w:tblBorders>
+          <w:top w:val="single" w:color="F5F3EC" w:sz="2"/>
+          <w:left w:val="single" w:color="B98B2E" w:sz="18"/>
+          <w:bottom w:val="single" w:color="F5F3EC" w:sz="2"/>
+          <w:right w:val="single" w:color="F5F3EC" w:sz="2"/>
+          <w:insideH w:val="none" w:color="auto" w:sz="0"/>
+          <w:insideV w:val="none" w:color="auto" w:sz="0"/>
+        </w:tblBorders>
+      </w:tblPr>
+      <w:tblGrid>
+        <w:gridCol w:w="9638"/>
+      </w:tblGrid>
+      <w:tr>
+        <w:tc>
+          <w:tcPr>
+            <w:tcW w:type="dxa" w:w="9638"/>
+            <w:shd w:fill="F5F3EC" w:color="auto" w:val="clear"/>
+            <w:tcMar>
+              <w:top w:type="dxa" w:w="160"/>
+              <w:left w:type="dxa" w:w="220"/>
+              <w:bottom w:type="dxa" w:w="160"/>
+              <w:right w:type="dxa" w:w="200"/>
+            </w:tcMar>
+          </w:tcPr>
+          <w:p>
+            <w:pPr>
+              <w:spacing w:after="140" w:line="280"/>
+            </w:pPr>
+            <w:r>
+              <w:rPr>
+                <w:b/>
+                <w:bCs/>
+                <w:color w:val="23293D"/>
+                <w:sz w:val="21"/>
+                <w:szCs w:val="21"/>
+              </w:rPr>
+              <w:t xml:space="preserve">O Atendimento mostra os atendimentos de HOJE</w:t>
+            </w:r>
+            <w:r>
+              <w:rPr>
+                <w:color w:val="23293D"/>
+                <w:sz w:val="21"/>
+                <w:szCs w:val="21"/>
+              </w:rPr>
+              <w:t xml:space="preserve"> (e as pendências de dias anteriores). A confirmação feita na véspera continua pela </w:t>
+            </w:r>
+            <w:r>
+              <w:rPr>
+                <w:b/>
+                <w:bCs/>
+                <w:color w:val="23293D"/>
+                <w:sz w:val="21"/>
+                <w:szCs w:val="21"/>
+              </w:rPr>
+              <w:t xml:space="preserve">Agenda</w:t>
+            </w:r>
+            <w:r>
+              <w:rPr>
+                <w:color w:val="23293D"/>
+                <w:sz w:val="21"/>
+                <w:szCs w:val="21"/>
+              </w:rPr>
+              <w:t xml:space="preserve">: clique no agendamento → </w:t>
+            </w:r>
+            <w:r>
+              <w:rPr>
+                <w:b/>
+                <w:bCs/>
+                <w:color w:val="23293D"/>
+                <w:sz w:val="21"/>
+                <w:szCs w:val="21"/>
+              </w:rPr>
+              <w:t xml:space="preserve">Confirmado</w:t>
+            </w:r>
+            <w:r>
+              <w:rPr>
+                <w:color w:val="23293D"/>
+                <w:sz w:val="21"/>
+                <w:szCs w:val="21"/>
+              </w:rPr>
+              <w:t xml:space="preserve">. Não confunda </w:t>
+            </w:r>
+            <w:r>
+              <w:rPr>
+                <w:b/>
+                <w:bCs/>
+                <w:color w:val="23293D"/>
+                <w:sz w:val="21"/>
+                <w:szCs w:val="21"/>
+              </w:rPr>
+              <w:t xml:space="preserve">Confirmar</w:t>
+            </w:r>
+            <w:r>
+              <w:rPr>
+                <w:color w:val="23293D"/>
+                <w:sz w:val="21"/>
+                <w:szCs w:val="21"/>
+              </w:rPr>
+              <w:t xml:space="preserve"> (o paciente disse que vem) com </w:t>
+            </w:r>
+            <w:r>
+              <w:rPr>
+                <w:b/>
+                <w:bCs/>
+                <w:color w:val="23293D"/>
+                <w:sz w:val="21"/>
+                <w:szCs w:val="21"/>
+              </w:rPr>
+              <w:t xml:space="preserve">Confirmar chegada</w:t>
+            </w:r>
+            <w:r>
+              <w:rPr>
+                <w:color w:val="23293D"/>
+                <w:sz w:val="21"/>
+                <w:szCs w:val="21"/>
+              </w:rPr>
+              <w:t xml:space="preserve"> (o paciente está na sua frente).</w:t>
+            </w:r>
+          </w:p>
+        </w:tc>
+      </w:tr>
+    </w:tbl>
+    <w:p>
+      <w:pPr>
+        <w:spacing w:after="140" w:line="120"/>
+      </w:pPr>
+      <w:r>
+        <w:rPr>
+          <w:sz w:val="2"/>
+          <w:szCs w:val="2"/>
+        </w:rPr>
+        <w:t xml:space="preserve"/>
       </w:r>
     </w:p>
     <w:p>
@@ -30048,25 +30267,7 @@
           <w:sz w:val="21"/>
           <w:szCs w:val="21"/>
         </w:rPr>
-        <w:t xml:space="preserve"> tentar cadastrar sem CPF; agendar fora do horário da unidade; fechar o aviso modal de "agendar apresentação" clicando em </w:t>
-      </w:r>
-      <w:r>
-        <w:rPr>
-          <w:i/>
-          <w:iCs/>
-          <w:color w:val="23293D"/>
-          <w:sz w:val="21"/>
-          <w:szCs w:val="21"/>
-        </w:rPr>
-        <w:t xml:space="preserve">"Já agendei"</w:t>
-      </w:r>
-      <w:r>
-        <w:rPr>
-          <w:color w:val="23293D"/>
-          <w:sz w:val="21"/>
-          <w:szCs w:val="21"/>
-        </w:rPr>
-        <w:t xml:space="preserve"> sem ter agendado — isso afirma um fato que não aconteceu.</w:t>
+        <w:t xml:space="preserve"> tentar cadastrar sem CPF; agendar fora do horário da unidade; fechar o aviso de "agendar apresentação" achando que ele some — ele só sai quando a apresentação é agendada (Fechar adia 15 minutos).</w:t>
       </w:r>
     </w:p>
     <w:p>

</xml_diff>

<commit_message>
feat(core): o Comercial vê a apresentação confirmada (v0.299.1)
Pergunta do dono na sequência do OC-00076: a confirmação feita pela recepção
não aparecia para o consultor — o painel e a ficha comercial buscavam a
apresentação "agendada ou confirmada" sem ler a situação.

- PresentationTracker ganhou presentationConfirmed e o selo verde
  "Confirmado" ao lado da data; comercial/page.tsx e [clientId]/page.tsx
  passaram a ler status. Sem regra nova, sem migração.
- Tipos, testes e montagem verdes. ⏳ Falta ver na tela: o treino não tem
  nenhum cartão comercial (EV-133 registra isso).
- Manual 6.5 (Consultor), novidade 0.299.1.

Co-Authored-By: Claude Opus 5.5 <noreply@anthropic.com>
</commit_message>
<xml_diff>
--- a/docs/treinamento/Manual-de-Treinamento-riSZon.docx
+++ b/docs/treinamento/Manual-de-Treinamento-riSZon.docx
@@ -32599,6 +32599,60 @@
           <w:szCs w:val="21"/>
         </w:rPr>
         <w:t xml:space="preserve">, que é o caso que trava o funil;</w:t>
+      </w:r>
+    </w:p>
+    <w:p>
+      <w:pPr>
+        <w:pStyle w:val="ListParagraph"/>
+        <w:numPr>
+          <w:ilvl w:val="0"/>
+          <w:numId w:val="42"/>
+        </w:numPr>
+        <w:spacing w:after="80" w:line="270"/>
+      </w:pPr>
+      <w:r>
+        <w:rPr>
+          <w:color w:val="23293D"/>
+          <w:sz w:val="21"/>
+          <w:szCs w:val="21"/>
+        </w:rPr>
+        <w:t xml:space="preserve">o selo verde </w:t>
+      </w:r>
+      <w:r>
+        <w:rPr>
+          <w:b/>
+          <w:bCs/>
+          <w:color w:val="23293D"/>
+          <w:sz w:val="21"/>
+          <w:szCs w:val="21"/>
+        </w:rPr>
+        <w:t xml:space="preserve">Confirmado</w:t>
+      </w:r>
+      <w:r>
+        <w:rPr>
+          <w:color w:val="23293D"/>
+          <w:sz w:val="21"/>
+          <w:szCs w:val="21"/>
+        </w:rPr>
+        <w:t xml:space="preserve"> quando a Recepção confirmou a presença do cliente (na Agenda ou no Atendimento). </w:t>
+      </w:r>
+      <w:r>
+        <w:rPr>
+          <w:b/>
+          <w:bCs/>
+          <w:color w:val="23293D"/>
+          <w:sz w:val="21"/>
+          <w:szCs w:val="21"/>
+        </w:rPr>
+        <w:t xml:space="preserve">Sem o selo</w:t>
+      </w:r>
+      <w:r>
+        <w:rPr>
+          <w:color w:val="23293D"/>
+          <w:sz w:val="21"/>
+          <w:szCs w:val="21"/>
+        </w:rPr>
+        <w:t xml:space="preserve">, a apresentação está marcada mas ninguém confirmou ainda — vale uma mensagem antes;</w:t>
       </w:r>
     </w:p>
     <w:p>

</xml_diff>

<commit_message>
fix(core): o "Abrir" do aviso abre o prontuário, e na aba do assunto (OC-00093, v0.302.0)
O "Abrir" de um aviso NÃO LIDO só marcava como lido: o router.refresh()
do marcar recarregava /notificacoes por cima da navegação. Agora marca,
espera e navega (sem refresh), mostrando "Abrindo…".

Aviso de cliente abre o prontuário na aba do assunto: mapa por título em
notifications.ts (abaDoAviso/linkDoAviso), aprovado pelo dono, tirado das
27 funções do banco que criam avisos. ProntuarioTabs aceita initialTab
(?aba=); sem a aba, abre na primeira; a barra rola até a aba aberta.
Sem migração: avisos antigos (/clientes/<id>) também abrem na aba certa.

Réguas provadas quebrando o código: aba do mapa que não existe na tela;
refresh de volta no Abrir.

Co-Authored-By: Claude Opus 5.5 <noreply@anthropic.com>
</commit_message>
<xml_diff>
--- a/docs/treinamento/Manual-de-Treinamento-riSZon.docx
+++ b/docs/treinamento/Manual-de-Treinamento-riSZon.docx
@@ -180,7 +180,7 @@
           <w:sz w:val="20"/>
           <w:szCs w:val="20"/>
         </w:rPr>
-        <w:t xml:space="preserve">28 de setembro de 2026</w:t>
+        <w:t xml:space="preserve">05 de outubro de 2026</w:t>
       </w:r>
     </w:p>
     <w:p>
@@ -15049,6 +15049,215 @@
                 <w:szCs w:val="21"/>
               </w:rPr>
               <w:t xml:space="preserve"> — não basta entrar na lista. Contar a fila inteira para quem não responde seria pendurar no seu ícone um número sobre o qual você não pode fazer nada.</w:t>
+            </w:r>
+          </w:p>
+        </w:tc>
+      </w:tr>
+    </w:tbl>
+    <w:p>
+      <w:pPr>
+        <w:spacing w:after="140" w:line="120"/>
+      </w:pPr>
+      <w:r>
+        <w:rPr>
+          <w:sz w:val="2"/>
+          <w:szCs w:val="2"/>
+        </w:rPr>
+        <w:t xml:space="preserve"/>
+      </w:r>
+    </w:p>
+    <w:tbl>
+      <w:tblPr>
+        <w:tblW w:type="dxa" w:w="9638"/>
+        <w:tblBorders>
+          <w:top w:val="single" w:color="F5F3EC" w:sz="2"/>
+          <w:left w:val="single" w:color="B98B2E" w:sz="18"/>
+          <w:bottom w:val="single" w:color="F5F3EC" w:sz="2"/>
+          <w:right w:val="single" w:color="F5F3EC" w:sz="2"/>
+          <w:insideH w:val="none" w:color="auto" w:sz="0"/>
+          <w:insideV w:val="none" w:color="auto" w:sz="0"/>
+        </w:tblBorders>
+      </w:tblPr>
+      <w:tblGrid>
+        <w:gridCol w:w="9638"/>
+      </w:tblGrid>
+      <w:tr>
+        <w:tc>
+          <w:tcPr>
+            <w:tcW w:type="dxa" w:w="9638"/>
+            <w:shd w:fill="F5F3EC" w:color="auto" w:val="clear"/>
+            <w:tcMar>
+              <w:top w:type="dxa" w:w="160"/>
+              <w:left w:type="dxa" w:w="220"/>
+              <w:bottom w:type="dxa" w:w="160"/>
+              <w:right w:type="dxa" w:w="200"/>
+            </w:tcMar>
+          </w:tcPr>
+          <w:p>
+            <w:pPr>
+              <w:spacing w:after="140" w:line="280"/>
+            </w:pPr>
+            <w:r>
+              <w:rPr>
+                <w:b/>
+                <w:bCs/>
+                <w:color w:val="23293D"/>
+                <w:sz w:val="21"/>
+                <w:szCs w:val="21"/>
+              </w:rPr>
+              <w:t xml:space="preserve">O "Abrir" do aviso leva direto ao assunto.</w:t>
+            </w:r>
+            <w:r>
+              <w:rPr>
+                <w:color w:val="23293D"/>
+                <w:sz w:val="21"/>
+                <w:szCs w:val="21"/>
+              </w:rPr>
+              <w:t xml:space="preserve"> Na tela de Notificações, o </w:t>
+            </w:r>
+            <w:r>
+              <w:rPr>
+                <w:b/>
+                <w:bCs/>
+                <w:color w:val="23293D"/>
+                <w:sz w:val="21"/>
+                <w:szCs w:val="21"/>
+              </w:rPr>
+              <w:t xml:space="preserve">Abrir</w:t>
+            </w:r>
+            <w:r>
+              <w:rPr>
+                <w:color w:val="23293D"/>
+                <w:sz w:val="21"/>
+                <w:szCs w:val="21"/>
+              </w:rPr>
+              <w:t xml:space="preserve"> de um aviso sobre um cliente abre o prontuário </w:t>
+            </w:r>
+            <w:r>
+              <w:rPr>
+                <w:b/>
+                <w:bCs/>
+                <w:color w:val="23293D"/>
+                <w:sz w:val="21"/>
+                <w:szCs w:val="21"/>
+              </w:rPr>
+              <w:t xml:space="preserve">na aba do assunto</w:t>
+            </w:r>
+            <w:r>
+              <w:rPr>
+                <w:color w:val="23293D"/>
+                <w:sz w:val="21"/>
+                <w:szCs w:val="21"/>
+              </w:rPr>
+              <w:t xml:space="preserve"> — "Pedido respondido" cai em </w:t>
+            </w:r>
+            <w:r>
+              <w:rPr>
+                <w:b/>
+                <w:bCs/>
+                <w:color w:val="23293D"/>
+                <w:sz w:val="21"/>
+                <w:szCs w:val="21"/>
+              </w:rPr>
+              <w:t xml:space="preserve">Pedidos</w:t>
+            </w:r>
+            <w:r>
+              <w:rPr>
+                <w:color w:val="23293D"/>
+                <w:sz w:val="21"/>
+                <w:szCs w:val="21"/>
+              </w:rPr>
+              <w:t xml:space="preserve">, "Plano aprovado" em </w:t>
+            </w:r>
+            <w:r>
+              <w:rPr>
+                <w:b/>
+                <w:bCs/>
+                <w:color w:val="23293D"/>
+                <w:sz w:val="21"/>
+                <w:szCs w:val="21"/>
+              </w:rPr>
+              <w:t xml:space="preserve">Plano</w:t>
+            </w:r>
+            <w:r>
+              <w:rPr>
+                <w:color w:val="23293D"/>
+                <w:sz w:val="21"/>
+                <w:szCs w:val="21"/>
+              </w:rPr>
+              <w:t xml:space="preserve">, "Sessão atrasada" em </w:t>
+            </w:r>
+            <w:r>
+              <w:rPr>
+                <w:b/>
+                <w:bCs/>
+                <w:color w:val="23293D"/>
+                <w:sz w:val="21"/>
+                <w:szCs w:val="21"/>
+              </w:rPr>
+              <w:t xml:space="preserve">Sessões &amp; Procedimentos</w:t>
+            </w:r>
+            <w:r>
+              <w:rPr>
+                <w:color w:val="23293D"/>
+                <w:sz w:val="21"/>
+                <w:szCs w:val="21"/>
+              </w:rPr>
+              <w:t xml:space="preserve">, renegociação em </w:t>
+            </w:r>
+            <w:r>
+              <w:rPr>
+                <w:b/>
+                <w:bCs/>
+                <w:color w:val="23293D"/>
+                <w:sz w:val="21"/>
+                <w:szCs w:val="21"/>
+              </w:rPr>
+              <w:t xml:space="preserve">Financeiro</w:t>
+            </w:r>
+            <w:r>
+              <w:rPr>
+                <w:color w:val="23293D"/>
+                <w:sz w:val="21"/>
+                <w:szCs w:val="21"/>
+              </w:rPr>
+              <w:t xml:space="preserve">, compartilhamento e transferência em </w:t>
+            </w:r>
+            <w:r>
+              <w:rPr>
+                <w:b/>
+                <w:bCs/>
+                <w:color w:val="23293D"/>
+                <w:sz w:val="21"/>
+                <w:szCs w:val="21"/>
+              </w:rPr>
+              <w:t xml:space="preserve">Histórico</w:t>
+            </w:r>
+            <w:r>
+              <w:rPr>
+                <w:color w:val="23293D"/>
+                <w:sz w:val="21"/>
+                <w:szCs w:val="21"/>
+              </w:rPr>
+              <w:t xml:space="preserve">, mudança de fase em </w:t>
+            </w:r>
+            <w:r>
+              <w:rPr>
+                <w:b/>
+                <w:bCs/>
+                <w:color w:val="23293D"/>
+                <w:sz w:val="21"/>
+                <w:szCs w:val="21"/>
+              </w:rPr>
+              <w:t xml:space="preserve">Jornada</w:t>
+            </w:r>
+            <w:r>
+              <w:rPr>
+                <w:color w:val="23293D"/>
+                <w:sz w:val="21"/>
+                <w:szCs w:val="21"/>
+              </w:rPr>
+              <w:t xml:space="preserve">. Se a sua função não tem aquela aba, o prontuário abre na primeira. Abrir um aviso não lido também o marca como lido (o botão mostra "Abrindo…" enquanto isso). As decisões pendentes ("necessita reavaliação?") não têm aba: a caixa delas fica no topo do prontuário, acima das abas.</w:t>
             </w:r>
           </w:p>
         </w:tc>

</xml_diff>

<commit_message>
fix(core): aprovar o plano — botões à vista e o caminho até eles (OC-00092, AP25, AP26, v0.303.0)
O Coordenador não achava onde aprovar o plano. Duas causas:

- Aprovar/Reprovar ficam dentro de cada opção, e para quem não edita todas
  nasciam recolhidas. Agora quem AVALIA um plano aguardando aprovação vê
  todas abertas (decisão do dono). A regra virou opcaoAbertaPorPadrao, em
  planning.ts, usada pelo desenho e pelo clique.
- O cartão "Planos aguardando sua aprovação" do Início apontava para
  /planejamento, que devolve quem não é Planner. Agora abre /planos no
  filtro e na unidade ativa (o número do cartão bate com a lista).

"Ficha" e "Ver plano" de /planos abrem o prontuário na aba Plano. Manual
6.2 com o passo a passo. Réguas provadas quebrando o código.

E2E (03-planejamento, apoio) ajustado ao novo padrão e NÃO rodado: a
suíte limpa o banco de treino.

Co-Authored-By: Claude Opus 5.5 <noreply@anthropic.com>
</commit_message>
<xml_diff>
--- a/docs/treinamento/Manual-de-Treinamento-riSZon.docx
+++ b/docs/treinamento/Manual-de-Treinamento-riSZon.docx
@@ -180,7 +180,7 @@
           <w:sz w:val="20"/>
           <w:szCs w:val="20"/>
         </w:rPr>
-        <w:t xml:space="preserve">05 de outubro de 2026</w:t>
+        <w:t xml:space="preserve">07 de outubro de 2026</w:t>
       </w:r>
     </w:p>
     <w:p>
@@ -31405,15 +31405,312 @@
           <w:sz w:val="21"/>
           <w:szCs w:val="21"/>
         </w:rPr>
-        <w:t xml:space="preserve">Segunda tarefa — aprovar plano:</w:t>
-      </w:r>
-      <w:r>
-        <w:rPr>
-          <w:color w:val="23293D"/>
-          <w:sz w:val="21"/>
-          <w:szCs w:val="21"/>
-        </w:rPr>
-        <w:t xml:space="preserve"> na ficha, aba </w:t>
+        <w:t xml:space="preserve">Segunda tarefa — aprovar plano.</w:t>
+      </w:r>
+    </w:p>
+    <w:p>
+      <w:pPr>
+        <w:spacing w:after="140" w:line="280"/>
+      </w:pPr>
+      <w:r>
+        <w:rPr>
+          <w:i/>
+          <w:iCs/>
+          <w:color w:val="23293D"/>
+          <w:sz w:val="21"/>
+          <w:szCs w:val="21"/>
+        </w:rPr>
+        <w:t xml:space="preserve">Onde ver se há plano esperando por você</w:t>
+      </w:r>
+      <w:r>
+        <w:rPr>
+          <w:color w:val="23293D"/>
+          <w:sz w:val="21"/>
+          <w:szCs w:val="21"/>
+        </w:rPr>
+        <w:t xml:space="preserve"> (qualquer um dos três serve):</w:t>
+      </w:r>
+    </w:p>
+    <w:p>
+      <w:pPr>
+        <w:pStyle w:val="ListParagraph"/>
+        <w:numPr>
+          <w:ilvl w:val="0"/>
+          <w:numId w:val="41"/>
+        </w:numPr>
+        <w:spacing w:after="80" w:line="270"/>
+      </w:pPr>
+      <w:r>
+        <w:rPr>
+          <w:b/>
+          <w:bCs/>
+          <w:color w:val="23293D"/>
+          <w:sz w:val="21"/>
+          <w:szCs w:val="21"/>
+        </w:rPr>
+        <w:t xml:space="preserve">Início</w:t>
+      </w:r>
+      <w:r>
+        <w:rPr>
+          <w:color w:val="23293D"/>
+          <w:sz w:val="21"/>
+          <w:szCs w:val="21"/>
+        </w:rPr>
+        <w:t xml:space="preserve"> → cartão </w:t>
+      </w:r>
+      <w:r>
+        <w:rPr>
+          <w:b/>
+          <w:bCs/>
+          <w:color w:val="23293D"/>
+          <w:sz w:val="21"/>
+          <w:szCs w:val="21"/>
+        </w:rPr>
+        <w:t xml:space="preserve">Planos aguardando sua aprovação</w:t>
+      </w:r>
+      <w:r>
+        <w:rPr>
+          <w:color w:val="23293D"/>
+          <w:sz w:val="21"/>
+          <w:szCs w:val="21"/>
+        </w:rPr>
+        <w:t xml:space="preserve"> (só aparece quando há algum) → </w:t>
+      </w:r>
+      <w:r>
+        <w:rPr>
+          <w:b/>
+          <w:bCs/>
+          <w:color w:val="23293D"/>
+          <w:sz w:val="21"/>
+          <w:szCs w:val="21"/>
+        </w:rPr>
+        <w:t xml:space="preserve">Abrir</w:t>
+      </w:r>
+      <w:r>
+        <w:rPr>
+          <w:color w:val="23293D"/>
+          <w:sz w:val="21"/>
+          <w:szCs w:val="21"/>
+        </w:rPr>
+        <w:t xml:space="preserve">. Ele leva a </w:t>
+      </w:r>
+      <w:r>
+        <w:rPr>
+          <w:b/>
+          <w:bCs/>
+          <w:color w:val="23293D"/>
+          <w:sz w:val="21"/>
+          <w:szCs w:val="21"/>
+        </w:rPr>
+        <w:t xml:space="preserve">Planos de Tratamento</w:t>
+      </w:r>
+      <w:r>
+        <w:rPr>
+          <w:color w:val="23293D"/>
+          <w:sz w:val="21"/>
+          <w:szCs w:val="21"/>
+        </w:rPr>
+        <w:t xml:space="preserve">, já filtrado.</w:t>
+      </w:r>
+    </w:p>
+    <w:p>
+      <w:pPr>
+        <w:pStyle w:val="ListParagraph"/>
+        <w:numPr>
+          <w:ilvl w:val="0"/>
+          <w:numId w:val="41"/>
+        </w:numPr>
+        <w:spacing w:after="80" w:line="270"/>
+      </w:pPr>
+      <w:r>
+        <w:rPr>
+          <w:color w:val="23293D"/>
+          <w:sz w:val="21"/>
+          <w:szCs w:val="21"/>
+        </w:rPr>
+        <w:t xml:space="preserve">Menu </w:t>
+      </w:r>
+      <w:r>
+        <w:rPr>
+          <w:b/>
+          <w:bCs/>
+          <w:color w:val="23293D"/>
+          <w:sz w:val="21"/>
+          <w:szCs w:val="21"/>
+        </w:rPr>
+        <w:t xml:space="preserve">Planos de Tratamento</w:t>
+      </w:r>
+      <w:r>
+        <w:rPr>
+          <w:color w:val="23293D"/>
+          <w:sz w:val="21"/>
+          <w:szCs w:val="21"/>
+        </w:rPr>
+        <w:t xml:space="preserve"> → filtro </w:t>
+      </w:r>
+      <w:r>
+        <w:rPr>
+          <w:b/>
+          <w:bCs/>
+          <w:color w:val="23293D"/>
+          <w:sz w:val="21"/>
+          <w:szCs w:val="21"/>
+        </w:rPr>
+        <w:t xml:space="preserve">Aguardando aprovação</w:t>
+      </w:r>
+      <w:r>
+        <w:rPr>
+          <w:color w:val="23293D"/>
+          <w:sz w:val="21"/>
+          <w:szCs w:val="21"/>
+        </w:rPr>
+        <w:t xml:space="preserve"> → </w:t>
+      </w:r>
+      <w:r>
+        <w:rPr>
+          <w:b/>
+          <w:bCs/>
+          <w:color w:val="23293D"/>
+          <w:sz w:val="21"/>
+          <w:szCs w:val="21"/>
+        </w:rPr>
+        <w:t xml:space="preserve">Ficha</w:t>
+      </w:r>
+      <w:r>
+        <w:rPr>
+          <w:color w:val="23293D"/>
+          <w:sz w:val="21"/>
+          <w:szCs w:val="21"/>
+        </w:rPr>
+        <w:t xml:space="preserve"> na linha do cliente.</w:t>
+      </w:r>
+    </w:p>
+    <w:p>
+      <w:pPr>
+        <w:pStyle w:val="ListParagraph"/>
+        <w:numPr>
+          <w:ilvl w:val="0"/>
+          <w:numId w:val="41"/>
+        </w:numPr>
+        <w:spacing w:after="80" w:line="270"/>
+      </w:pPr>
+      <w:r>
+        <w:rPr>
+          <w:b/>
+          <w:bCs/>
+          <w:color w:val="23293D"/>
+          <w:sz w:val="21"/>
+          <w:szCs w:val="21"/>
+        </w:rPr>
+        <w:t xml:space="preserve">Sino</w:t>
+      </w:r>
+      <w:r>
+        <w:rPr>
+          <w:color w:val="23293D"/>
+          <w:sz w:val="21"/>
+          <w:szCs w:val="21"/>
+        </w:rPr>
+        <w:t xml:space="preserve"> → aviso </w:t>
+      </w:r>
+      <w:r>
+        <w:rPr>
+          <w:b/>
+          <w:bCs/>
+          <w:color w:val="23293D"/>
+          <w:sz w:val="21"/>
+          <w:szCs w:val="21"/>
+        </w:rPr>
+        <w:t xml:space="preserve">Plano aguardando aprovação</w:t>
+      </w:r>
+      <w:r>
+        <w:rPr>
+          <w:color w:val="23293D"/>
+          <w:sz w:val="21"/>
+          <w:szCs w:val="21"/>
+        </w:rPr>
+        <w:t xml:space="preserve"> → </w:t>
+      </w:r>
+      <w:r>
+        <w:rPr>
+          <w:b/>
+          <w:bCs/>
+          <w:color w:val="23293D"/>
+          <w:sz w:val="21"/>
+          <w:szCs w:val="21"/>
+        </w:rPr>
+        <w:t xml:space="preserve">Abrir</w:t>
+      </w:r>
+      <w:r>
+        <w:rPr>
+          <w:color w:val="23293D"/>
+          <w:sz w:val="21"/>
+          <w:szCs w:val="21"/>
+        </w:rPr>
+        <w:t xml:space="preserve">.</w:t>
+      </w:r>
+    </w:p>
+    <w:p>
+      <w:pPr>
+        <w:spacing w:after="140" w:line="280"/>
+      </w:pPr>
+      <w:r>
+        <w:rPr>
+          <w:color w:val="23293D"/>
+          <w:sz w:val="21"/>
+          <w:szCs w:val="21"/>
+        </w:rPr>
+        <w:t xml:space="preserve">Por qualquer um deles, o prontuário do cliente abre </w:t>
+      </w:r>
+      <w:r>
+        <w:rPr>
+          <w:b/>
+          <w:bCs/>
+          <w:color w:val="23293D"/>
+          <w:sz w:val="21"/>
+          <w:szCs w:val="21"/>
+        </w:rPr>
+        <w:t xml:space="preserve">direto na aba Plano</w:t>
+      </w:r>
+      <w:r>
+        <w:rPr>
+          <w:color w:val="23293D"/>
+          <w:sz w:val="21"/>
+          <w:szCs w:val="21"/>
+        </w:rPr>
+        <w:t xml:space="preserve">.</w:t>
+      </w:r>
+    </w:p>
+    <w:p>
+      <w:pPr>
+        <w:spacing w:after="140" w:line="280"/>
+      </w:pPr>
+      <w:r>
+        <w:rPr>
+          <w:i/>
+          <w:iCs/>
+          <w:color w:val="23293D"/>
+          <w:sz w:val="21"/>
+          <w:szCs w:val="21"/>
+        </w:rPr>
+        <w:t xml:space="preserve">Como aprovar:</w:t>
+      </w:r>
+    </w:p>
+    <w:p>
+      <w:pPr>
+        <w:pStyle w:val="ListParagraph"/>
+        <w:numPr>
+          <w:ilvl w:val="0"/>
+          <w:numId w:val="42"/>
+        </w:numPr>
+        <w:spacing w:after="80" w:line="270"/>
+      </w:pPr>
+      <w:r>
+        <w:rPr>
+          <w:color w:val="23293D"/>
+          <w:sz w:val="21"/>
+          <w:szCs w:val="21"/>
+        </w:rPr>
+        <w:t xml:space="preserve">Na aba </w:t>
       </w:r>
       <w:r>
         <w:rPr>
@@ -31431,7 +31728,61 @@
           <w:sz w:val="21"/>
           <w:szCs w:val="21"/>
         </w:rPr>
-        <w:t xml:space="preserve"> → expandir a opção → </w:t>
+        <w:t xml:space="preserve">, as opções de tratamento já aparecem </w:t>
+      </w:r>
+      <w:r>
+        <w:rPr>
+          <w:b/>
+          <w:bCs/>
+          <w:color w:val="23293D"/>
+          <w:sz w:val="21"/>
+          <w:szCs w:val="21"/>
+        </w:rPr>
+        <w:t xml:space="preserve">abertas</w:t>
+      </w:r>
+      <w:r>
+        <w:rPr>
+          <w:color w:val="23293D"/>
+          <w:sz w:val="21"/>
+          <w:szCs w:val="21"/>
+        </w:rPr>
+        <w:t xml:space="preserve"> enquanto o plano aguarda a sua aprovação (se alguma estiver recolhida, clique na setinha ao lado do nome).</w:t>
+      </w:r>
+    </w:p>
+    <w:p>
+      <w:pPr>
+        <w:pStyle w:val="ListParagraph"/>
+        <w:numPr>
+          <w:ilvl w:val="0"/>
+          <w:numId w:val="42"/>
+        </w:numPr>
+        <w:spacing w:after="80" w:line="270"/>
+      </w:pPr>
+      <w:r>
+        <w:rPr>
+          <w:color w:val="23293D"/>
+          <w:sz w:val="21"/>
+          <w:szCs w:val="21"/>
+        </w:rPr>
+        <w:t xml:space="preserve">Leia os procedimentos de cada opção. No fim de cada uma ficam o campo </w:t>
+      </w:r>
+      <w:r>
+        <w:rPr>
+          <w:b/>
+          <w:bCs/>
+          <w:color w:val="23293D"/>
+          <w:sz w:val="21"/>
+          <w:szCs w:val="21"/>
+        </w:rPr>
+        <w:t xml:space="preserve">Considerações</w:t>
+      </w:r>
+      <w:r>
+        <w:rPr>
+          <w:color w:val="23293D"/>
+          <w:sz w:val="21"/>
+          <w:szCs w:val="21"/>
+        </w:rPr>
+        <w:t xml:space="preserve"> e os botões </w:t>
       </w:r>
       <w:r>
         <w:rPr>
@@ -31449,7 +31800,7 @@
           <w:sz w:val="21"/>
           <w:szCs w:val="21"/>
         </w:rPr>
-        <w:t xml:space="preserve"> ou </w:t>
+        <w:t xml:space="preserve"> e </w:t>
       </w:r>
       <w:r>
         <w:rPr>
@@ -31468,6 +31819,96 @@
           <w:szCs w:val="21"/>
         </w:rPr>
         <w:t xml:space="preserve">.</w:t>
+      </w:r>
+    </w:p>
+    <w:p>
+      <w:pPr>
+        <w:pStyle w:val="ListParagraph"/>
+        <w:numPr>
+          <w:ilvl w:val="0"/>
+          <w:numId w:val="42"/>
+        </w:numPr>
+        <w:spacing w:after="80" w:line="270"/>
+      </w:pPr>
+      <w:r>
+        <w:rPr>
+          <w:color w:val="23293D"/>
+          <w:sz w:val="21"/>
+          <w:szCs w:val="21"/>
+        </w:rPr>
+        <w:t xml:space="preserve">Decida </w:t>
+      </w:r>
+      <w:r>
+        <w:rPr>
+          <w:b/>
+          <w:bCs/>
+          <w:color w:val="23293D"/>
+          <w:sz w:val="21"/>
+          <w:szCs w:val="21"/>
+        </w:rPr>
+        <w:t xml:space="preserve">todas</w:t>
+      </w:r>
+      <w:r>
+        <w:rPr>
+          <w:color w:val="23293D"/>
+          <w:sz w:val="21"/>
+          <w:szCs w:val="21"/>
+        </w:rPr>
+        <w:t xml:space="preserve"> as opções — cada uma precisa da sua decisão.</w:t>
+      </w:r>
+    </w:p>
+    <w:p>
+      <w:pPr>
+        <w:pStyle w:val="ListParagraph"/>
+        <w:numPr>
+          <w:ilvl w:val="0"/>
+          <w:numId w:val="42"/>
+        </w:numPr>
+        <w:spacing w:after="80" w:line="270"/>
+      </w:pPr>
+      <w:r>
+        <w:rPr>
+          <w:color w:val="23293D"/>
+          <w:sz w:val="21"/>
+          <w:szCs w:val="21"/>
+        </w:rPr>
+        <w:t xml:space="preserve">Com todas decididas e </w:t>
+      </w:r>
+      <w:r>
+        <w:rPr>
+          <w:b/>
+          <w:bCs/>
+          <w:color w:val="23293D"/>
+          <w:sz w:val="21"/>
+          <w:szCs w:val="21"/>
+        </w:rPr>
+        <w:t xml:space="preserve">pelo menos uma aprovada</w:t>
+      </w:r>
+      <w:r>
+        <w:rPr>
+          <w:color w:val="23293D"/>
+          <w:sz w:val="21"/>
+          <w:szCs w:val="21"/>
+        </w:rPr>
+        <w:t xml:space="preserve">, o plano fica aprovado e o Planner envia ao Comercial. Se </w:t>
+      </w:r>
+      <w:r>
+        <w:rPr>
+          <w:b/>
+          <w:bCs/>
+          <w:color w:val="23293D"/>
+          <w:sz w:val="21"/>
+          <w:szCs w:val="21"/>
+        </w:rPr>
+        <w:t xml:space="preserve">todas</w:t>
+      </w:r>
+      <w:r>
+        <w:rPr>
+          <w:color w:val="23293D"/>
+          <w:sz w:val="21"/>
+          <w:szCs w:val="21"/>
+        </w:rPr>
+        <w:t xml:space="preserve"> forem reprovadas, volta ao Planner para revisão.</w:t>
       </w:r>
     </w:p>
     <w:tbl>
@@ -31517,7 +31958,7 @@
                 <w:sz w:val="21"/>
                 <w:szCs w:val="21"/>
               </w:rPr>
-              <w:t xml:space="preserve"> — o sistema não deixa reprovar em branco (migração 0042).</w:t>
+              <w:t xml:space="preserve"> — o sistema não deixa reprovar em branco (migração 0042). É o que orienta o Planner a corrigir.</w:t>
             </w:r>
           </w:p>
         </w:tc>
@@ -31533,47 +31974,6 @@
           <w:szCs w:val="2"/>
         </w:rPr>
         <w:t xml:space="preserve"/>
-      </w:r>
-    </w:p>
-    <w:p>
-      <w:pPr>
-        <w:spacing w:after="140" w:line="280"/>
-      </w:pPr>
-      <w:r>
-        <w:rPr>
-          <w:b/>
-          <w:bCs/>
-          <w:color w:val="23293D"/>
-          <w:sz w:val="21"/>
-          <w:szCs w:val="21"/>
-        </w:rPr>
-        <w:t xml:space="preserve">Cuidado:</w:t>
-      </w:r>
-      <w:r>
-        <w:rPr>
-          <w:color w:val="23293D"/>
-          <w:sz w:val="21"/>
-          <w:szCs w:val="21"/>
-        </w:rPr>
-        <w:t xml:space="preserve"> você vê </w:t>
-      </w:r>
-      <w:r>
-        <w:rPr>
-          <w:b/>
-          <w:bCs/>
-          <w:color w:val="23293D"/>
-          <w:sz w:val="21"/>
-          <w:szCs w:val="21"/>
-        </w:rPr>
-        <w:t xml:space="preserve">o total</w:t>
-      </w:r>
-      <w:r>
-        <w:rPr>
-          <w:color w:val="23293D"/>
-          <w:sz w:val="21"/>
-          <w:szCs w:val="21"/>
-        </w:rPr>
-        <w:t xml:space="preserve"> de cada opção, não o preço item a item. Isso é proposital: sua aprovação é clínica, não comercial.</w:t>
       </w:r>
     </w:p>
     <w:tbl>
@@ -31615,7 +32015,7 @@
                 <w:sz w:val="21"/>
                 <w:szCs w:val="21"/>
               </w:rPr>
-              <w:t xml:space="preserve">A faixa atrapalhando? Mova ou encolha.</w:t>
+              <w:t xml:space="preserve">Abriu a aba Plano e não há botão de aprovar?</w:t>
             </w:r>
             <w:r>
               <w:rPr>
@@ -31623,7 +32023,7 @@
                 <w:sz w:val="21"/>
                 <w:szCs w:val="21"/>
               </w:rPr>
-              <w:t xml:space="preserve"> Ela aparece no </w:t>
+              <w:t xml:space="preserve"> Um destes três: o Planner </w:t>
             </w:r>
             <w:r>
               <w:rPr>
@@ -31633,7 +32033,7 @@
                 <w:sz w:val="21"/>
                 <w:szCs w:val="21"/>
               </w:rPr>
-              <w:t xml:space="preserve">canto de baixo à direita</w:t>
+              <w:t xml:space="preserve">ainda não enviou</w:t>
             </w:r>
             <w:r>
               <w:rPr>
@@ -31641,7 +32041,7 @@
                 <w:sz w:val="21"/>
                 <w:szCs w:val="21"/>
               </w:rPr>
-              <w:t xml:space="preserve">. Arraste pela </w:t>
+              <w:t xml:space="preserve"> o plano para aprovação (a situação do plano não diz "Aguardando aprovação do Coordenador"); o plano </w:t>
             </w:r>
             <w:r>
               <w:rPr>
@@ -31651,7 +32051,7 @@
                 <w:sz w:val="21"/>
                 <w:szCs w:val="21"/>
               </w:rPr>
-              <w:t xml:space="preserve">alça</w:t>
+              <w:t xml:space="preserve">já foi avaliado</w:t>
             </w:r>
             <w:r>
               <w:rPr>
@@ -31659,7 +32059,7 @@
                 <w:sz w:val="21"/>
                 <w:szCs w:val="21"/>
               </w:rPr>
-              <w:t xml:space="preserve"> (o pontilhado à esquerda) para onde preferir, ou clique no </w:t>
+              <w:t xml:space="preserve">; ou você está em </w:t>
             </w:r>
             <w:r>
               <w:rPr>
@@ -31669,7 +32069,7 @@
                 <w:sz w:val="21"/>
                 <w:szCs w:val="21"/>
               </w:rPr>
-              <w:t xml:space="preserve">tracinho</w:t>
+              <w:t xml:space="preserve">outra unidade</w:t>
             </w:r>
             <w:r>
               <w:rPr>
@@ -31677,43 +32077,7 @@
                 <w:sz w:val="21"/>
                 <w:szCs w:val="21"/>
               </w:rPr>
-              <w:t xml:space="preserve"> para encolhê-la a uma etiqueta pequena com o tempo. O sistema lembra onde você deixou, </w:t>
-            </w:r>
-            <w:r>
-              <w:rPr>
-                <w:b/>
-                <w:bCs/>
-                <w:color w:val="23293D"/>
-                <w:sz w:val="21"/>
-                <w:szCs w:val="21"/>
-              </w:rPr>
-              <w:t xml:space="preserve">neste computador</w:t>
-            </w:r>
-            <w:r>
-              <w:rPr>
-                <w:color w:val="23293D"/>
-                <w:sz w:val="21"/>
-                <w:szCs w:val="21"/>
-              </w:rPr>
-              <w:t xml:space="preserve">, para a próxima consulta. O que ela </w:t>
-            </w:r>
-            <w:r>
-              <w:rPr>
-                <w:b/>
-                <w:bCs/>
-                <w:color w:val="23293D"/>
-                <w:sz w:val="21"/>
-                <w:szCs w:val="21"/>
-              </w:rPr>
-              <w:t xml:space="preserve">não</w:t>
-            </w:r>
-            <w:r>
-              <w:rPr>
-                <w:color w:val="23293D"/>
-                <w:sz w:val="21"/>
-                <w:szCs w:val="21"/>
-              </w:rPr>
-              <w:t xml:space="preserve"> faz é fechar: enquanto grava, o ponto vermelho e o tempo continuam à vista — é o que garante que ninguém seja gravado sem saber.</w:t>
+              <w:t xml:space="preserve"> que não a do cliente (confira no alto do menu).</w:t>
             </w:r>
           </w:p>
         </w:tc>
@@ -31729,6 +32093,47 @@
           <w:szCs w:val="2"/>
         </w:rPr>
         <w:t xml:space="preserve"/>
+      </w:r>
+    </w:p>
+    <w:p>
+      <w:pPr>
+        <w:spacing w:after="140" w:line="280"/>
+      </w:pPr>
+      <w:r>
+        <w:rPr>
+          <w:b/>
+          <w:bCs/>
+          <w:color w:val="23293D"/>
+          <w:sz w:val="21"/>
+          <w:szCs w:val="21"/>
+        </w:rPr>
+        <w:t xml:space="preserve">Cuidado:</w:t>
+      </w:r>
+      <w:r>
+        <w:rPr>
+          <w:color w:val="23293D"/>
+          <w:sz w:val="21"/>
+          <w:szCs w:val="21"/>
+        </w:rPr>
+        <w:t xml:space="preserve"> você vê </w:t>
+      </w:r>
+      <w:r>
+        <w:rPr>
+          <w:b/>
+          <w:bCs/>
+          <w:color w:val="23293D"/>
+          <w:sz w:val="21"/>
+          <w:szCs w:val="21"/>
+        </w:rPr>
+        <w:t xml:space="preserve">o total</w:t>
+      </w:r>
+      <w:r>
+        <w:rPr>
+          <w:color w:val="23293D"/>
+          <w:sz w:val="21"/>
+          <w:szCs w:val="21"/>
+        </w:rPr>
+        <w:t xml:space="preserve"> de cada opção, não o preço item a item. Isso é proposital: sua aprovação é clínica, não comercial.</w:t>
       </w:r>
     </w:p>
     <w:tbl>
@@ -31770,7 +32175,7 @@
                 <w:sz w:val="21"/>
                 <w:szCs w:val="21"/>
               </w:rPr>
-              <w:t xml:space="preserve">Esqueceu de apertar "Chamar"? O sistema resolve (v0.272.0).</w:t>
+              <w:t xml:space="preserve">A faixa atrapalhando? Mova ou encolha.</w:t>
             </w:r>
             <w:r>
               <w:rPr>
@@ -31778,7 +32183,7 @@
                 <w:sz w:val="21"/>
                 <w:szCs w:val="21"/>
               </w:rPr>
-              <w:t xml:space="preserve"> Se você for direto para a ficha e começar a trabalhar, o </w:t>
+              <w:t xml:space="preserve"> Ela aparece no </w:t>
             </w:r>
             <w:r>
               <w:rPr>
@@ -31788,7 +32193,7 @@
                 <w:sz w:val="21"/>
                 <w:szCs w:val="21"/>
               </w:rPr>
-              <w:t xml:space="preserve">primeiro registro</w:t>
+              <w:t xml:space="preserve">canto de baixo à direita</w:t>
             </w:r>
             <w:r>
               <w:rPr>
@@ -31796,7 +32201,7 @@
                 <w:sz w:val="21"/>
                 <w:szCs w:val="21"/>
               </w:rPr>
-              <w:t xml:space="preserve"> — a gravação, a anamnese, uma foto ou uma consideração — já coloca o paciente como </w:t>
+              <w:t xml:space="preserve">. Arraste pela </w:t>
             </w:r>
             <w:r>
               <w:rPr>
@@ -31806,7 +32211,7 @@
                 <w:sz w:val="21"/>
                 <w:szCs w:val="21"/>
               </w:rPr>
-              <w:t xml:space="preserve">Em atendimento</w:t>
+              <w:t xml:space="preserve">alça</w:t>
             </w:r>
             <w:r>
               <w:rPr>
@@ -31814,7 +32219,7 @@
                 <w:sz w:val="21"/>
                 <w:szCs w:val="21"/>
               </w:rPr>
-              <w:t xml:space="preserve">. E quando você </w:t>
+              <w:t xml:space="preserve"> (o pontilhado à esquerda) para onde preferir, ou clique no </w:t>
             </w:r>
             <w:r>
               <w:rPr>
@@ -31824,7 +32229,7 @@
                 <w:sz w:val="21"/>
                 <w:szCs w:val="21"/>
               </w:rPr>
-              <w:t xml:space="preserve">Enviar ao Centro de Planejamento</w:t>
+              <w:t xml:space="preserve">tracinho</w:t>
             </w:r>
             <w:r>
               <w:rPr>
@@ -31832,7 +32237,7 @@
                 <w:sz w:val="21"/>
                 <w:szCs w:val="21"/>
               </w:rPr>
-              <w:t xml:space="preserve"> (ou </w:t>
+              <w:t xml:space="preserve"> para encolhê-la a uma etiqueta pequena com o tempo. O sistema lembra onde você deixou, </w:t>
             </w:r>
             <w:r>
               <w:rPr>
@@ -31842,7 +32247,7 @@
                 <w:sz w:val="21"/>
                 <w:szCs w:val="21"/>
               </w:rPr>
-              <w:t xml:space="preserve">Concluir a reavaliação</w:t>
+              <w:t xml:space="preserve">neste computador</w:t>
             </w:r>
             <w:r>
               <w:rPr>
@@ -31850,7 +32255,7 @@
                 <w:sz w:val="21"/>
                 <w:szCs w:val="21"/>
               </w:rPr>
-              <w:t xml:space="preserve">), o atendimento é </w:t>
+              <w:t xml:space="preserve">, para a próxima consulta. O que ela </w:t>
             </w:r>
             <w:r>
               <w:rPr>
@@ -31860,7 +32265,7 @@
                 <w:sz w:val="21"/>
                 <w:szCs w:val="21"/>
               </w:rPr>
-              <w:t xml:space="preserve">encerrado</w:t>
+              <w:t xml:space="preserve">não</w:t>
             </w:r>
             <w:r>
               <w:rPr>
@@ -31868,74 +32273,7 @@
                 <w:sz w:val="21"/>
                 <w:szCs w:val="21"/>
               </w:rPr>
-              <w:t xml:space="preserve"> sozinho.</w:t>
-            </w:r>
-          </w:p>
-          <w:p>
-            <w:pPr>
-              <w:spacing w:after="140" w:line="280"/>
-            </w:pPr>
-            <w:r>
-              <w:rPr>
-                <w:color w:val="23293D"/>
-                <w:sz w:val="21"/>
-                <w:szCs w:val="21"/>
-              </w:rPr>
-              <w:t xml:space="preserve">Duas coisas que ele </w:t>
-            </w:r>
-            <w:r>
-              <w:rPr>
-                <w:b/>
-                <w:bCs/>
-                <w:color w:val="23293D"/>
-                <w:sz w:val="21"/>
-                <w:szCs w:val="21"/>
-              </w:rPr>
-              <w:t xml:space="preserve">não</w:t>
-            </w:r>
-            <w:r>
-              <w:rPr>
-                <w:color w:val="23293D"/>
-                <w:sz w:val="21"/>
-                <w:szCs w:val="21"/>
-              </w:rPr>
-              <w:t xml:space="preserve"> faz, de propósito: </w:t>
-            </w:r>
-            <w:r>
-              <w:rPr>
-                <w:b/>
-                <w:bCs/>
-                <w:color w:val="23293D"/>
-                <w:sz w:val="21"/>
-                <w:szCs w:val="21"/>
-              </w:rPr>
-              <w:t xml:space="preserve">abrir a ficha não chama ninguém</w:t>
-            </w:r>
-            <w:r>
-              <w:rPr>
-                <w:color w:val="23293D"/>
-                <w:sz w:val="21"/>
-                <w:szCs w:val="21"/>
-              </w:rPr>
-              <w:t xml:space="preserve"> (olhar não é atender), e quem </w:t>
-            </w:r>
-            <w:r>
-              <w:rPr>
-                <w:b/>
-                <w:bCs/>
-                <w:color w:val="23293D"/>
-                <w:sz w:val="21"/>
-                <w:szCs w:val="21"/>
-              </w:rPr>
-              <w:t xml:space="preserve">não passou pela recepção</w:t>
-            </w:r>
-            <w:r>
-              <w:rPr>
-                <w:color w:val="23293D"/>
-                <w:sz w:val="21"/>
-                <w:szCs w:val="21"/>
-              </w:rPr>
-              <w:t xml:space="preserve"> continua fora — é o check-in que move a fase do cliente na jornada, e pular esse passo esconderia a passagem.</w:t>
+              <w:t xml:space="preserve"> faz é fechar: enquanto grava, o ponto vermelho e o tempo continuam à vista — é o que garante que ninguém seja gravado sem saber.</w:t>
             </w:r>
           </w:p>
         </w:tc>
@@ -31992,7 +32330,7 @@
                 <w:sz w:val="21"/>
                 <w:szCs w:val="21"/>
               </w:rPr>
-              <w:t xml:space="preserve">A gravação cuida de si mesma.</w:t>
+              <w:t xml:space="preserve">Esqueceu de apertar "Chamar"? O sistema resolve (v0.272.0).</w:t>
             </w:r>
             <w:r>
               <w:rPr>
@@ -32000,7 +32338,7 @@
                 <w:sz w:val="21"/>
                 <w:szCs w:val="21"/>
               </w:rPr>
-              <w:t xml:space="preserve"> Ela </w:t>
+              <w:t xml:space="preserve"> Se você for direto para a ficha e começar a trabalhar, o </w:t>
             </w:r>
             <w:r>
               <w:rPr>
@@ -32010,7 +32348,7 @@
                 <w:sz w:val="21"/>
                 <w:szCs w:val="21"/>
               </w:rPr>
-              <w:t xml:space="preserve">começa</w:t>
+              <w:t xml:space="preserve">primeiro registro</w:t>
             </w:r>
             <w:r>
               <w:rPr>
@@ -32018,7 +32356,7 @@
                 <w:sz w:val="21"/>
                 <w:szCs w:val="21"/>
               </w:rPr>
-              <w:t xml:space="preserve"> quando você chama o paciente para uma avaliação ou reavaliação e </w:t>
+              <w:t xml:space="preserve"> — a gravação, a anamnese, uma foto ou uma consideração — já coloca o paciente como </w:t>
             </w:r>
             <w:r>
               <w:rPr>
@@ -32028,7 +32366,7 @@
                 <w:sz w:val="21"/>
                 <w:szCs w:val="21"/>
               </w:rPr>
-              <w:t xml:space="preserve">para</w:t>
+              <w:t xml:space="preserve">Em atendimento</w:t>
             </w:r>
             <w:r>
               <w:rPr>
@@ -32036,7 +32374,7 @@
                 <w:sz w:val="21"/>
                 <w:szCs w:val="21"/>
               </w:rPr>
-              <w:t xml:space="preserve"> quando você envia ao Planejamento, conclui a reavaliação ou encerra sem enviar — não existe mais o risco de esquecer de ligar ou de desligar. E se a avaliação for enviada por </w:t>
+              <w:t xml:space="preserve">. E quando você </w:t>
             </w:r>
             <w:r>
               <w:rPr>
@@ -32046,7 +32384,7 @@
                 <w:sz w:val="21"/>
                 <w:szCs w:val="21"/>
               </w:rPr>
-              <w:t xml:space="preserve">outra pessoa</w:t>
+              <w:t xml:space="preserve">Enviar ao Centro de Planejamento</w:t>
             </w:r>
             <w:r>
               <w:rPr>
@@ -32054,7 +32392,7 @@
                 <w:sz w:val="21"/>
                 <w:szCs w:val="21"/>
               </w:rPr>
-              <w:t xml:space="preserve"> ou em </w:t>
+              <w:t xml:space="preserve"> (ou </w:t>
             </w:r>
             <w:r>
               <w:rPr>
@@ -32064,7 +32402,7 @@
                 <w:sz w:val="21"/>
                 <w:szCs w:val="21"/>
               </w:rPr>
-              <w:t xml:space="preserve">outra aba</w:t>
+              <w:t xml:space="preserve">Concluir a reavaliação</w:t>
             </w:r>
             <w:r>
               <w:rPr>
@@ -32072,7 +32410,7 @@
                 <w:sz w:val="21"/>
                 <w:szCs w:val="21"/>
               </w:rPr>
-              <w:t xml:space="preserve">, a gravação percebe em até um minuto que o paciente mudou de fase, e para e salva sozinha — inclusive a iniciada pelo botão </w:t>
+              <w:t xml:space="preserve">), o atendimento é </w:t>
             </w:r>
             <w:r>
               <w:rPr>
@@ -32082,7 +32420,7 @@
                 <w:sz w:val="21"/>
                 <w:szCs w:val="21"/>
               </w:rPr>
-              <w:t xml:space="preserve">Gravar a consulta</w:t>
+              <w:t xml:space="preserve">encerrado</w:t>
             </w:r>
             <w:r>
               <w:rPr>
@@ -32090,13 +32428,21 @@
                 <w:sz w:val="21"/>
                 <w:szCs w:val="21"/>
               </w:rPr>
-              <w:t xml:space="preserve"> da ficha. A faixa do rodapé mostra o tempo e continua lá enquanto você navega: pode abrir a anamnese, subir fotos, ver o histórico, que a gravação não é cortada.</w:t>
+              <w:t xml:space="preserve"> sozinho.</w:t>
             </w:r>
           </w:p>
           <w:p>
             <w:pPr>
               <w:spacing w:after="140" w:line="280"/>
             </w:pPr>
+            <w:r>
+              <w:rPr>
+                <w:color w:val="23293D"/>
+                <w:sz w:val="21"/>
+                <w:szCs w:val="21"/>
+              </w:rPr>
+              <w:t xml:space="preserve">Duas coisas que ele </w:t>
+            </w:r>
             <w:r>
               <w:rPr>
                 <w:b/>
@@ -32105,7 +32451,7 @@
                 <w:sz w:val="21"/>
                 <w:szCs w:val="21"/>
               </w:rPr>
-              <w:t xml:space="preserve">Na primeira vez em cada computador</w:t>
+              <w:t xml:space="preserve">não</w:t>
             </w:r>
             <w:r>
               <w:rPr>
@@ -32113,7 +32459,7 @@
                 <w:sz w:val="21"/>
                 <w:szCs w:val="21"/>
               </w:rPr>
-              <w:t xml:space="preserve">, o navegador pede permissão para o microfone — permita. Se você negar (ou se o microfone estiver desligado), o sistema avisa </w:t>
+              <w:t xml:space="preserve"> faz, de propósito: </w:t>
             </w:r>
             <w:r>
               <w:rPr>
@@ -32123,7 +32469,7 @@
                 <w:sz w:val="21"/>
                 <w:szCs w:val="21"/>
               </w:rPr>
-              <w:t xml:space="preserve">em destaque</w:t>
+              <w:t xml:space="preserve">abrir a ficha não chama ninguém</w:t>
             </w:r>
             <w:r>
               <w:rPr>
@@ -32131,7 +32477,7 @@
                 <w:sz w:val="21"/>
                 <w:szCs w:val="21"/>
               </w:rPr>
-              <w:t xml:space="preserve"> que a consulta não está sendo gravada; ele não finge que gravou. Nesse caso, resolva o microfone e use o botão </w:t>
+              <w:t xml:space="preserve"> (olhar não é atender), e quem </w:t>
             </w:r>
             <w:r>
               <w:rPr>
@@ -32141,7 +32487,7 @@
                 <w:sz w:val="21"/>
                 <w:szCs w:val="21"/>
               </w:rPr>
-              <w:t xml:space="preserve">Gravar a consulta</w:t>
+              <w:t xml:space="preserve">não passou pela recepção</w:t>
             </w:r>
             <w:r>
               <w:rPr>
@@ -32149,71 +32495,7 @@
                 <w:sz w:val="21"/>
                 <w:szCs w:val="21"/>
               </w:rPr>
-              <w:t xml:space="preserve">, na tela de avaliação.</w:t>
-            </w:r>
-          </w:p>
-          <w:p>
-            <w:pPr>
-              <w:spacing w:after="140" w:line="280"/>
-            </w:pPr>
-            <w:r>
-              <w:rPr>
-                <w:b/>
-                <w:bCs/>
-                <w:color w:val="23293D"/>
-                <w:sz w:val="21"/>
-                <w:szCs w:val="21"/>
-              </w:rPr>
-              <w:t xml:space="preserve">Se o paciente pedir para parar</w:t>
-            </w:r>
-            <w:r>
-              <w:rPr>
-                <w:color w:val="23293D"/>
-                <w:sz w:val="21"/>
-                <w:szCs w:val="21"/>
-              </w:rPr>
-              <w:t xml:space="preserve">, use </w:t>
-            </w:r>
-            <w:r>
-              <w:rPr>
-                <w:b/>
-                <w:bCs/>
-                <w:color w:val="23293D"/>
-                <w:sz w:val="21"/>
-                <w:szCs w:val="21"/>
-              </w:rPr>
-              <w:t xml:space="preserve">Parar e salvar</w:t>
-            </w:r>
-            <w:r>
-              <w:rPr>
-                <w:color w:val="23293D"/>
-                <w:sz w:val="21"/>
-                <w:szCs w:val="21"/>
-              </w:rPr>
-              <w:t xml:space="preserve"> na faixa: o que já foi gravado é guardado na ficha, e nada mais é registrado a partir dali.</w:t>
-            </w:r>
-          </w:p>
-          <w:p>
-            <w:pPr>
-              <w:spacing w:after="140" w:line="280"/>
-            </w:pPr>
-            <w:r>
-              <w:rPr>
-                <w:b/>
-                <w:bCs/>
-                <w:color w:val="23293D"/>
-                <w:sz w:val="21"/>
-                <w:szCs w:val="21"/>
-              </w:rPr>
-              <w:t xml:space="preserve">Sessões de tratamento, urgências e retornos não são gravados automaticamente</w:t>
-            </w:r>
-            <w:r>
-              <w:rPr>
-                <w:color w:val="23293D"/>
-                <w:sz w:val="21"/>
-                <w:szCs w:val="21"/>
-              </w:rPr>
-              <w:t xml:space="preserve"> — só avaliação e reavaliação, que são as que viram transcrição e resumo para o planejamento.</w:t>
+              <w:t xml:space="preserve"> continua fora — é o check-in que move a fase do cliente na jornada, e pular esse passo esconderia a passagem.</w:t>
             </w:r>
           </w:p>
         </w:tc>
@@ -32229,990 +32511,6 @@
           <w:szCs w:val="2"/>
         </w:rPr>
         <w:t xml:space="preserve"/>
-      </w:r>
-    </w:p>
-    <w:p>
-      <w:pPr>
-        <w:spacing w:after="140" w:line="280"/>
-      </w:pPr>
-      <w:r>
-        <w:rPr>
-          <w:b/>
-          <w:bCs/>
-          <w:color w:val="23293D"/>
-          <w:sz w:val="21"/>
-          <w:szCs w:val="21"/>
-        </w:rPr>
-        <w:t xml:space="preserve">Terceira tarefa — a reavaliação:</w:t>
-      </w:r>
-      <w:r>
-        <w:rPr>
-          <w:color w:val="23293D"/>
-          <w:sz w:val="21"/>
-          <w:szCs w:val="21"/>
-        </w:rPr>
-        <w:t xml:space="preserve"> quando o paciente volta para a revisão e </w:t>
-      </w:r>
-      <w:r>
-        <w:rPr>
-          <w:b/>
-          <w:bCs/>
-          <w:color w:val="23293D"/>
-          <w:sz w:val="21"/>
-          <w:szCs w:val="21"/>
-        </w:rPr>
-        <w:t xml:space="preserve">não precisa de plano novo</w:t>
-      </w:r>
-      <w:r>
-        <w:rPr>
-          <w:color w:val="23293D"/>
-          <w:sz w:val="21"/>
-          <w:szCs w:val="21"/>
-        </w:rPr>
-        <w:t xml:space="preserve">, use </w:t>
-      </w:r>
-      <w:r>
-        <w:rPr>
-          <w:b/>
-          <w:bCs/>
-          <w:color w:val="23293D"/>
-          <w:sz w:val="21"/>
-          <w:szCs w:val="21"/>
-        </w:rPr>
-        <w:t xml:space="preserve">Concluir a reavaliação</w:t>
-      </w:r>
-      <w:r>
-        <w:rPr>
-          <w:color w:val="23293D"/>
-          <w:sz w:val="21"/>
-          <w:szCs w:val="21"/>
-        </w:rPr>
-        <w:t xml:space="preserve"> na mesma tela de avaliação. Ele vai para o </w:t>
-      </w:r>
-      <w:r>
-        <w:rPr>
-          <w:b/>
-          <w:bCs/>
-          <w:color w:val="23293D"/>
-          <w:sz w:val="21"/>
-          <w:szCs w:val="21"/>
-        </w:rPr>
-        <w:t xml:space="preserve">Acompanhamento</w:t>
-      </w:r>
-      <w:r>
-        <w:rPr>
-          <w:color w:val="23293D"/>
-          <w:sz w:val="21"/>
-          <w:szCs w:val="21"/>
-        </w:rPr>
-        <w:t xml:space="preserve"> sem passar pelo Planejamento. Precisando de plano novo, o botão é o mesmo de sempre: </w:t>
-      </w:r>
-      <w:r>
-        <w:rPr>
-          <w:b/>
-          <w:bCs/>
-          <w:color w:val="23293D"/>
-          <w:sz w:val="21"/>
-          <w:szCs w:val="21"/>
-        </w:rPr>
-        <w:t xml:space="preserve">Enviar ao Centro de Planejamento</w:t>
-      </w:r>
-      <w:r>
-        <w:rPr>
-          <w:color w:val="23293D"/>
-          <w:sz w:val="21"/>
-          <w:szCs w:val="21"/>
-        </w:rPr>
-        <w:t xml:space="preserve">.</w:t>
-      </w:r>
-    </w:p>
-    <w:p>
-      <w:pPr>
-        <w:pStyle w:val="Heading2"/>
-      </w:pPr>
-      <w:r>
-        <w:rPr>
-          <w:color w:val="1F3253"/>
-        </w:rPr>
-        <w:t xml:space="preserve">6.3. Dentista Planner</w:t>
-      </w:r>
-    </w:p>
-    <w:p>
-      <w:pPr>
-        <w:spacing w:after="140" w:line="280"/>
-      </w:pPr>
-      <w:r>
-        <w:rPr>
-          <w:b/>
-          <w:bCs/>
-          <w:color w:val="23293D"/>
-          <w:sz w:val="21"/>
-          <w:szCs w:val="21"/>
-        </w:rPr>
-        <w:t xml:space="preserve">Objetivo:</w:t>
-      </w:r>
-      <w:r>
-        <w:rPr>
-          <w:color w:val="23293D"/>
-          <w:sz w:val="21"/>
-          <w:szCs w:val="21"/>
-        </w:rPr>
-        <w:t xml:space="preserve"> montar plano e orçamento. </w:t>
-      </w:r>
-      <w:r>
-        <w:rPr>
-          <w:b/>
-          <w:bCs/>
-          <w:color w:val="23293D"/>
-          <w:sz w:val="21"/>
-          <w:szCs w:val="21"/>
-        </w:rPr>
-        <w:t xml:space="preserve">Duração:</w:t>
-      </w:r>
-      <w:r>
-        <w:rPr>
-          <w:color w:val="23293D"/>
-          <w:sz w:val="21"/>
-          <w:szCs w:val="21"/>
-        </w:rPr>
-        <w:t xml:space="preserve"> 75 minutos.</w:t>
-      </w:r>
-    </w:p>
-    <w:p>
-      <w:pPr>
-        <w:pStyle w:val="ListParagraph"/>
-        <w:numPr>
-          <w:ilvl w:val="0"/>
-          <w:numId w:val="41"/>
-        </w:numPr>
-        <w:spacing w:after="80" w:line="270"/>
-      </w:pPr>
-      <w:r>
-        <w:rPr>
-          <w:color w:val="23293D"/>
-          <w:sz w:val="21"/>
-          <w:szCs w:val="21"/>
-        </w:rPr>
-        <w:t xml:space="preserve">Menu </w:t>
-      </w:r>
-      <w:r>
-        <w:rPr>
-          <w:b/>
-          <w:bCs/>
-          <w:color w:val="23293D"/>
-          <w:sz w:val="21"/>
-          <w:szCs w:val="21"/>
-        </w:rPr>
-        <w:t xml:space="preserve">Centro de Planejamento</w:t>
-      </w:r>
-      <w:r>
-        <w:rPr>
-          <w:color w:val="23293D"/>
-          <w:sz w:val="21"/>
-          <w:szCs w:val="21"/>
-        </w:rPr>
-        <w:t xml:space="preserve"> → a fila vem </w:t>
-      </w:r>
-      <w:r>
-        <w:rPr>
-          <w:b/>
-          <w:bCs/>
-          <w:color w:val="23293D"/>
-          <w:sz w:val="21"/>
-          <w:szCs w:val="21"/>
-        </w:rPr>
-        <w:t xml:space="preserve">priorizada</w:t>
-      </w:r>
-      <w:r>
-        <w:rPr>
-          <w:color w:val="23293D"/>
-          <w:sz w:val="21"/>
-          <w:szCs w:val="21"/>
-        </w:rPr>
-        <w:t xml:space="preserve"> (apresentação comercial mais próxima primeiro).</w:t>
-      </w:r>
-    </w:p>
-    <w:p>
-      <w:pPr>
-        <w:pStyle w:val="ListParagraph"/>
-        <w:numPr>
-          <w:ilvl w:val="0"/>
-          <w:numId w:val="41"/>
-        </w:numPr>
-        <w:spacing w:after="80" w:line="270"/>
-      </w:pPr>
-      <w:r>
-        <w:rPr>
-          <w:color w:val="23293D"/>
-          <w:sz w:val="21"/>
-          <w:szCs w:val="21"/>
-        </w:rPr>
-        <w:t xml:space="preserve">Abra o caso → cockpit em duas colunas: evidências à esquerda, plano à direita. No cartão </w:t>
-      </w:r>
-      <w:r>
-        <w:rPr>
-          <w:b/>
-          <w:bCs/>
-          <w:color w:val="23293D"/>
-          <w:sz w:val="21"/>
-          <w:szCs w:val="21"/>
-        </w:rPr>
-        <w:t xml:space="preserve">Anamnese</w:t>
-      </w:r>
-      <w:r>
-        <w:rPr>
-          <w:color w:val="23293D"/>
-          <w:sz w:val="21"/>
-          <w:szCs w:val="21"/>
-        </w:rPr>
-        <w:t xml:space="preserve">, os alertas vêm primeiro, dizendo </w:t>
-      </w:r>
-      <w:r>
-        <w:rPr>
-          <w:b/>
-          <w:bCs/>
-          <w:color w:val="23293D"/>
-          <w:sz w:val="21"/>
-          <w:szCs w:val="21"/>
-        </w:rPr>
-        <w:t xml:space="preserve">o que</w:t>
-      </w:r>
-      <w:r>
-        <w:rPr>
-          <w:color w:val="23293D"/>
-          <w:sz w:val="21"/>
-          <w:szCs w:val="21"/>
-        </w:rPr>
-        <w:t xml:space="preserve"> foi marcado (ex.: </w:t>
-      </w:r>
-      <w:r>
-        <w:rPr>
-          <w:b/>
-          <w:bCs/>
-          <w:color w:val="23293D"/>
-          <w:sz w:val="21"/>
-          <w:szCs w:val="21"/>
-        </w:rPr>
-        <w:t xml:space="preserve">Diabetes</w:t>
-      </w:r>
-      <w:r>
-        <w:rPr>
-          <w:color w:val="23293D"/>
-          <w:sz w:val="21"/>
-          <w:szCs w:val="21"/>
-        </w:rPr>
-        <w:t xml:space="preserve">, </w:t>
-      </w:r>
-      <w:r>
-        <w:rPr>
-          <w:b/>
-          <w:bCs/>
-          <w:color w:val="23293D"/>
-          <w:sz w:val="21"/>
-          <w:szCs w:val="21"/>
-        </w:rPr>
-        <w:t xml:space="preserve">AIDS</w:t>
-      </w:r>
-      <w:r>
-        <w:rPr>
-          <w:color w:val="23293D"/>
-          <w:sz w:val="21"/>
-          <w:szCs w:val="21"/>
-        </w:rPr>
-        <w:t xml:space="preserve">, </w:t>
-      </w:r>
-      <w:r>
-        <w:rPr>
-          <w:b/>
-          <w:bCs/>
-          <w:color w:val="23293D"/>
-          <w:sz w:val="21"/>
-          <w:szCs w:val="21"/>
-        </w:rPr>
-        <w:t xml:space="preserve">Dipirona</w:t>
-      </w:r>
-      <w:r>
-        <w:rPr>
-          <w:color w:val="23293D"/>
-          <w:sz w:val="21"/>
-          <w:szCs w:val="21"/>
-        </w:rPr>
-        <w:t xml:space="preserve">); abaixo, a ficha por seção, com pergunta e resposta lado a lado e </w:t>
-      </w:r>
-      <w:r>
-        <w:rPr>
-          <w:b/>
-          <w:bCs/>
-          <w:color w:val="23293D"/>
-          <w:sz w:val="21"/>
-          <w:szCs w:val="21"/>
-        </w:rPr>
-        <w:t xml:space="preserve">em vermelho só o que disparou alerta</w:t>
-      </w:r>
-      <w:r>
-        <w:rPr>
-          <w:color w:val="23293D"/>
-          <w:sz w:val="21"/>
-          <w:szCs w:val="21"/>
-        </w:rPr>
-        <w:t xml:space="preserve"> — as outras opções marcadas aparecem em cinza.</w:t>
-      </w:r>
-    </w:p>
-    <w:p>
-      <w:pPr>
-        <w:pStyle w:val="ListParagraph"/>
-        <w:numPr>
-          <w:ilvl w:val="0"/>
-          <w:numId w:val="41"/>
-        </w:numPr>
-        <w:spacing w:after="80" w:line="270"/>
-      </w:pPr>
-      <w:r>
-        <w:rPr>
-          <w:b/>
-          <w:bCs/>
-          <w:color w:val="23293D"/>
-          <w:sz w:val="21"/>
-          <w:szCs w:val="21"/>
-        </w:rPr>
-        <w:t xml:space="preserve">Iniciar plano de tratamento</w:t>
-      </w:r>
-      <w:r>
-        <w:rPr>
-          <w:color w:val="23293D"/>
-          <w:sz w:val="21"/>
-          <w:szCs w:val="21"/>
-        </w:rPr>
-        <w:t xml:space="preserve"> → escreva o </w:t>
-      </w:r>
-      <w:r>
-        <w:rPr>
-          <w:b/>
-          <w:bCs/>
-          <w:color w:val="23293D"/>
-          <w:sz w:val="21"/>
-          <w:szCs w:val="21"/>
-        </w:rPr>
-        <w:t xml:space="preserve">Diagnóstico</w:t>
-      </w:r>
-      <w:r>
-        <w:rPr>
-          <w:color w:val="23293D"/>
-          <w:sz w:val="21"/>
-          <w:szCs w:val="21"/>
-        </w:rPr>
-        <w:t xml:space="preserve">.</w:t>
-      </w:r>
-    </w:p>
-    <w:p>
-      <w:pPr>
-        <w:pStyle w:val="ListParagraph"/>
-        <w:numPr>
-          <w:ilvl w:val="0"/>
-          <w:numId w:val="41"/>
-        </w:numPr>
-        <w:spacing w:after="80" w:line="270"/>
-      </w:pPr>
-      <w:r>
-        <w:rPr>
-          <w:b/>
-          <w:bCs/>
-          <w:color w:val="23293D"/>
-          <w:sz w:val="21"/>
-          <w:szCs w:val="21"/>
-        </w:rPr>
-        <w:t xml:space="preserve">Adicionar opção de tratamento</w:t>
-      </w:r>
-      <w:r>
-        <w:rPr>
-          <w:color w:val="23293D"/>
-          <w:sz w:val="21"/>
-          <w:szCs w:val="21"/>
-        </w:rPr>
-        <w:t xml:space="preserve"> (marque uma como principal).</w:t>
-      </w:r>
-    </w:p>
-    <w:p>
-      <w:pPr>
-        <w:pStyle w:val="ListParagraph"/>
-        <w:numPr>
-          <w:ilvl w:val="0"/>
-          <w:numId w:val="41"/>
-        </w:numPr>
-        <w:spacing w:after="80" w:line="270"/>
-      </w:pPr>
-      <w:r>
-        <w:rPr>
-          <w:color w:val="23293D"/>
-          <w:sz w:val="21"/>
-          <w:szCs w:val="21"/>
-        </w:rPr>
-        <w:t xml:space="preserve">Dentro da opção, </w:t>
-      </w:r>
-      <w:r>
-        <w:rPr>
-          <w:b/>
-          <w:bCs/>
-          <w:color w:val="23293D"/>
-          <w:sz w:val="21"/>
-          <w:szCs w:val="21"/>
-        </w:rPr>
-        <w:t xml:space="preserve">Procedimento</w:t>
-      </w:r>
-      <w:r>
-        <w:rPr>
-          <w:color w:val="23293D"/>
-          <w:sz w:val="21"/>
-          <w:szCs w:val="21"/>
-        </w:rPr>
-        <w:t xml:space="preserve"> → escolha do catálogo → </w:t>
-      </w:r>
-      <w:r>
-        <w:rPr>
-          <w:b/>
-          <w:bCs/>
-          <w:color w:val="23293D"/>
-          <w:sz w:val="21"/>
-          <w:szCs w:val="21"/>
-        </w:rPr>
-        <w:t xml:space="preserve">Item</w:t>
-      </w:r>
-      <w:r>
-        <w:rPr>
-          <w:color w:val="23293D"/>
-          <w:sz w:val="21"/>
-          <w:szCs w:val="21"/>
-        </w:rPr>
-        <w:t xml:space="preserve">.</w:t>
-      </w:r>
-    </w:p>
-    <w:p>
-      <w:pPr>
-        <w:pStyle w:val="ListParagraph"/>
-        <w:numPr>
-          <w:ilvl w:val="0"/>
-          <w:numId w:val="41"/>
-        </w:numPr>
-        <w:spacing w:after="80" w:line="270"/>
-      </w:pPr>
-      <w:r>
-        <w:rPr>
-          <w:color w:val="23293D"/>
-          <w:sz w:val="21"/>
-          <w:szCs w:val="21"/>
-        </w:rPr>
-        <w:t xml:space="preserve">Classifique o </w:t>
-      </w:r>
-      <w:r>
-        <w:rPr>
-          <w:b/>
-          <w:bCs/>
-          <w:color w:val="23293D"/>
-          <w:sz w:val="21"/>
-          <w:szCs w:val="21"/>
-        </w:rPr>
-        <w:t xml:space="preserve">pilar</w:t>
-      </w:r>
-      <w:r>
-        <w:rPr>
-          <w:color w:val="23293D"/>
-          <w:sz w:val="21"/>
-          <w:szCs w:val="21"/>
-        </w:rPr>
-        <w:t xml:space="preserve"> (1 dos 6) → </w:t>
-      </w:r>
-      <w:r>
-        <w:rPr>
-          <w:b/>
-          <w:bCs/>
-          <w:color w:val="23293D"/>
-          <w:sz w:val="21"/>
-          <w:szCs w:val="21"/>
-        </w:rPr>
-        <w:t xml:space="preserve">Salvar pilar</w:t>
-      </w:r>
-      <w:r>
-        <w:rPr>
-          <w:color w:val="23293D"/>
-          <w:sz w:val="21"/>
-          <w:szCs w:val="21"/>
-        </w:rPr>
-        <w:t xml:space="preserve">.</w:t>
-      </w:r>
-    </w:p>
-    <w:p>
-      <w:pPr>
-        <w:pStyle w:val="ListParagraph"/>
-        <w:numPr>
-          <w:ilvl w:val="0"/>
-          <w:numId w:val="41"/>
-        </w:numPr>
-        <w:spacing w:after="80" w:line="270"/>
-      </w:pPr>
-      <w:r>
-        <w:rPr>
-          <w:b/>
-          <w:bCs/>
-          <w:color w:val="23293D"/>
-          <w:sz w:val="21"/>
-          <w:szCs w:val="21"/>
-        </w:rPr>
-        <w:t xml:space="preserve">Enviar para aprovação do Coordenador</w:t>
-      </w:r>
-      <w:r>
-        <w:rPr>
-          <w:color w:val="23293D"/>
-          <w:sz w:val="21"/>
-          <w:szCs w:val="21"/>
-        </w:rPr>
-        <w:t xml:space="preserve">.</w:t>
-      </w:r>
-    </w:p>
-    <w:p>
-      <w:pPr>
-        <w:pStyle w:val="ListParagraph"/>
-        <w:numPr>
-          <w:ilvl w:val="0"/>
-          <w:numId w:val="41"/>
-        </w:numPr>
-        <w:spacing w:after="80" w:line="270"/>
-      </w:pPr>
-      <w:r>
-        <w:rPr>
-          <w:color w:val="23293D"/>
-          <w:sz w:val="21"/>
-          <w:szCs w:val="21"/>
-        </w:rPr>
-        <w:t xml:space="preserve">Aprovado, </w:t>
-      </w:r>
-      <w:r>
-        <w:rPr>
-          <w:b/>
-          <w:bCs/>
-          <w:color w:val="23293D"/>
-          <w:sz w:val="21"/>
-          <w:szCs w:val="21"/>
-        </w:rPr>
-        <w:t xml:space="preserve">Enviar ao Comercial</w:t>
-      </w:r>
-      <w:r>
-        <w:rPr>
-          <w:color w:val="23293D"/>
-          <w:sz w:val="21"/>
-          <w:szCs w:val="21"/>
-        </w:rPr>
-        <w:t xml:space="preserve">.</w:t>
-      </w:r>
-    </w:p>
-    <w:p>
-      <w:pPr>
-        <w:spacing w:after="140" w:line="280"/>
-      </w:pPr>
-      <w:r>
-        <w:rPr>
-          <w:b/>
-          <w:bCs/>
-          <w:color w:val="23293D"/>
-          <w:sz w:val="21"/>
-          <w:szCs w:val="21"/>
-        </w:rPr>
-        <w:t xml:space="preserve">Cuidados:</w:t>
-      </w:r>
-      <w:r>
-        <w:rPr>
-          <w:color w:val="23293D"/>
-          <w:sz w:val="21"/>
-          <w:szCs w:val="21"/>
-        </w:rPr>
-        <w:t xml:space="preserve"> o sistema exige procedimentos lançados em cada opção para enviar; plano de tratamento </w:t>
-      </w:r>
-      <w:r>
-        <w:rPr>
-          <w:b/>
-          <w:bCs/>
-          <w:color w:val="23293D"/>
-          <w:sz w:val="21"/>
-          <w:szCs w:val="21"/>
-        </w:rPr>
-        <w:t xml:space="preserve">não tem acréscimo</w:t>
-      </w:r>
-      <w:r>
-        <w:rPr>
-          <w:color w:val="23293D"/>
-          <w:sz w:val="21"/>
-          <w:szCs w:val="21"/>
-        </w:rPr>
-        <w:t xml:space="preserve"> (o preço vem do orçamento aprovado); depois de aprovado o plano fica em leitura — há </w:t>
-      </w:r>
-      <w:r>
-        <w:rPr>
-          <w:b/>
-          <w:bCs/>
-          <w:color w:val="23293D"/>
-          <w:sz w:val="21"/>
-          <w:szCs w:val="21"/>
-        </w:rPr>
-        <w:t xml:space="preserve">Reabrir para edição</w:t>
-      </w:r>
-      <w:r>
-        <w:rPr>
-          <w:color w:val="23293D"/>
-          <w:sz w:val="21"/>
-          <w:szCs w:val="21"/>
-        </w:rPr>
-        <w:t xml:space="preserve">, que exige nova aprovação.</w:t>
-      </w:r>
-    </w:p>
-    <w:p>
-      <w:pPr>
-        <w:spacing w:after="140" w:line="280"/>
-      </w:pPr>
-      <w:r>
-        <w:rPr>
-          <w:b/>
-          <w:bCs/>
-          <w:color w:val="23293D"/>
-          <w:sz w:val="21"/>
-          <w:szCs w:val="21"/>
-        </w:rPr>
-        <w:t xml:space="preserve">Quando faltar informação para planejar</w:t>
-      </w:r>
-      <w:r>
-        <w:rPr>
-          <w:color w:val="23293D"/>
-          <w:sz w:val="21"/>
-          <w:szCs w:val="21"/>
-        </w:rPr>
-        <w:t xml:space="preserve">, não devolva o caso em silêncio: use </w:t>
-      </w:r>
-      <w:r>
-        <w:rPr>
-          <w:b/>
-          <w:bCs/>
-          <w:color w:val="23293D"/>
-          <w:sz w:val="21"/>
-          <w:szCs w:val="21"/>
-        </w:rPr>
-        <w:t xml:space="preserve">Devolver ao Coordenador</w:t>
-      </w:r>
-      <w:r>
-        <w:rPr>
-          <w:color w:val="23293D"/>
-          <w:sz w:val="21"/>
-          <w:szCs w:val="21"/>
-        </w:rPr>
-        <w:t xml:space="preserve">, na aba Plano, e escreva o que falta (foto, exame, consideração). Escolha </w:t>
-      </w:r>
-      <w:r>
-        <w:rPr>
-          <w:b/>
-          <w:bCs/>
-          <w:color w:val="23293D"/>
-          <w:sz w:val="21"/>
-          <w:szCs w:val="21"/>
-        </w:rPr>
-        <w:t xml:space="preserve">Conversão Clínica</w:t>
-      </w:r>
-      <w:r>
-        <w:rPr>
-          <w:color w:val="23293D"/>
-          <w:sz w:val="21"/>
-          <w:szCs w:val="21"/>
-        </w:rPr>
-        <w:t xml:space="preserve"> quando for só dado faltando, ou </w:t>
-      </w:r>
-      <w:r>
-        <w:rPr>
-          <w:b/>
-          <w:bCs/>
-          <w:color w:val="23293D"/>
-          <w:sz w:val="21"/>
-          <w:szCs w:val="21"/>
-        </w:rPr>
-        <w:t xml:space="preserve">Reavaliação</w:t>
-      </w:r>
-      <w:r>
-        <w:rPr>
-          <w:color w:val="23293D"/>
-          <w:sz w:val="21"/>
-          <w:szCs w:val="21"/>
-        </w:rPr>
-        <w:t xml:space="preserve"> quando o caso precisar ser examinado de novo. O Coordenador recebe o aviso com o seu motivo — sem ele, o caso volta igual.</w:t>
-      </w:r>
-    </w:p>
-    <w:p>
-      <w:pPr>
-        <w:pStyle w:val="Heading2"/>
-      </w:pPr>
-      <w:r>
-        <w:rPr>
-          <w:color w:val="1F3253"/>
-        </w:rPr>
-        <w:t xml:space="preserve">6.4. Dentista (executor)</w:t>
-      </w:r>
-    </w:p>
-    <w:p>
-      <w:pPr>
-        <w:spacing w:after="140" w:line="280"/>
-      </w:pPr>
-      <w:r>
-        <w:rPr>
-          <w:b/>
-          <w:bCs/>
-          <w:color w:val="23293D"/>
-          <w:sz w:val="21"/>
-          <w:szCs w:val="21"/>
-        </w:rPr>
-        <w:t xml:space="preserve">Objetivo:</w:t>
-      </w:r>
-      <w:r>
-        <w:rPr>
-          <w:color w:val="23293D"/>
-          <w:sz w:val="21"/>
-          <w:szCs w:val="21"/>
-        </w:rPr>
-        <w:t xml:space="preserve"> executar e registrar. </w:t>
-      </w:r>
-      <w:r>
-        <w:rPr>
-          <w:b/>
-          <w:bCs/>
-          <w:color w:val="23293D"/>
-          <w:sz w:val="21"/>
-          <w:szCs w:val="21"/>
-        </w:rPr>
-        <w:t xml:space="preserve">Duração:</w:t>
-      </w:r>
-      <w:r>
-        <w:rPr>
-          <w:color w:val="23293D"/>
-          <w:sz w:val="21"/>
-          <w:szCs w:val="21"/>
-        </w:rPr>
-        <w:t xml:space="preserve"> 40 minutos.</w:t>
-      </w:r>
-    </w:p>
-    <w:p>
-      <w:pPr>
-        <w:spacing w:after="140" w:line="280"/>
-      </w:pPr>
-      <w:r>
-        <w:rPr>
-          <w:color w:val="23293D"/>
-          <w:sz w:val="21"/>
-          <w:szCs w:val="21"/>
-        </w:rPr>
-        <w:t xml:space="preserve">Seu menu é diferente: </w:t>
-      </w:r>
-      <w:r>
-        <w:rPr>
-          <w:b/>
-          <w:bCs/>
-          <w:color w:val="23293D"/>
-          <w:sz w:val="21"/>
-          <w:szCs w:val="21"/>
-        </w:rPr>
-        <w:t xml:space="preserve">não tem Jornada</w:t>
-      </w:r>
-      <w:r>
-        <w:rPr>
-          <w:color w:val="23293D"/>
-          <w:sz w:val="21"/>
-          <w:szCs w:val="21"/>
-        </w:rPr>
-        <w:t xml:space="preserve">, e tem </w:t>
-      </w:r>
-      <w:r>
-        <w:rPr>
-          <w:b/>
-          <w:bCs/>
-          <w:color w:val="23293D"/>
-          <w:sz w:val="21"/>
-          <w:szCs w:val="21"/>
-        </w:rPr>
-        <w:t xml:space="preserve">Meu Dia</w:t>
-      </w:r>
-      <w:r>
-        <w:rPr>
-          <w:color w:val="23293D"/>
-          <w:sz w:val="21"/>
-          <w:szCs w:val="21"/>
-        </w:rPr>
-        <w:t xml:space="preserve"> e </w:t>
-      </w:r>
-      <w:r>
-        <w:rPr>
-          <w:b/>
-          <w:bCs/>
-          <w:color w:val="23293D"/>
-          <w:sz w:val="21"/>
-          <w:szCs w:val="21"/>
-        </w:rPr>
-        <w:t xml:space="preserve">Minha Agenda</w:t>
-      </w:r>
-      <w:r>
-        <w:rPr>
-          <w:color w:val="23293D"/>
-          <w:sz w:val="21"/>
-          <w:szCs w:val="21"/>
-        </w:rPr>
-        <w:t xml:space="preserve">.</w:t>
-      </w:r>
-    </w:p>
-    <w:p>
-      <w:pPr>
-        <w:pStyle w:val="ListParagraph"/>
-        <w:numPr>
-          <w:ilvl w:val="0"/>
-          <w:numId w:val="42"/>
-        </w:numPr>
-        <w:spacing w:after="80" w:line="270"/>
-      </w:pPr>
-      <w:r>
-        <w:rPr>
-          <w:b/>
-          <w:bCs/>
-          <w:color w:val="23293D"/>
-          <w:sz w:val="21"/>
-          <w:szCs w:val="21"/>
-        </w:rPr>
-        <w:t xml:space="preserve">Meu Dia</w:t>
-      </w:r>
-      <w:r>
-        <w:rPr>
-          <w:color w:val="23293D"/>
-          <w:sz w:val="21"/>
-          <w:szCs w:val="21"/>
-        </w:rPr>
-        <w:t xml:space="preserve"> → seus atendimentos.</w:t>
-      </w:r>
-    </w:p>
-    <w:p>
-      <w:pPr>
-        <w:pStyle w:val="ListParagraph"/>
-        <w:numPr>
-          <w:ilvl w:val="0"/>
-          <w:numId w:val="42"/>
-        </w:numPr>
-        <w:spacing w:after="80" w:line="270"/>
-      </w:pPr>
-      <w:r>
-        <w:rPr>
-          <w:b/>
-          <w:bCs/>
-          <w:color w:val="23293D"/>
-          <w:sz w:val="21"/>
-          <w:szCs w:val="21"/>
-        </w:rPr>
-        <w:t xml:space="preserve">Atendimento</w:t>
-      </w:r>
-      <w:r>
-        <w:rPr>
-          <w:color w:val="23293D"/>
-          <w:sz w:val="21"/>
-          <w:szCs w:val="21"/>
-        </w:rPr>
-        <w:t xml:space="preserve"> → </w:t>
-      </w:r>
-      <w:r>
-        <w:rPr>
-          <w:b/>
-          <w:bCs/>
-          <w:color w:val="23293D"/>
-          <w:sz w:val="21"/>
-          <w:szCs w:val="21"/>
-        </w:rPr>
-        <w:t xml:space="preserve">Chamar</w:t>
-      </w:r>
-      <w:r>
-        <w:rPr>
-          <w:color w:val="23293D"/>
-          <w:sz w:val="21"/>
-          <w:szCs w:val="21"/>
-        </w:rPr>
-        <w:t xml:space="preserve">.</w:t>
-      </w:r>
-    </w:p>
-    <w:p>
-      <w:pPr>
-        <w:pStyle w:val="ListParagraph"/>
-        <w:numPr>
-          <w:ilvl w:val="0"/>
-          <w:numId w:val="42"/>
-        </w:numPr>
-        <w:spacing w:after="80" w:line="270"/>
-      </w:pPr>
-      <w:r>
-        <w:rPr>
-          <w:color w:val="23293D"/>
-          <w:sz w:val="21"/>
-          <w:szCs w:val="21"/>
-        </w:rPr>
-        <w:t xml:space="preserve">Ficha do paciente → aba </w:t>
-      </w:r>
-      <w:r>
-        <w:rPr>
-          <w:b/>
-          <w:bCs/>
-          <w:color w:val="23293D"/>
-          <w:sz w:val="21"/>
-          <w:szCs w:val="21"/>
-        </w:rPr>
-        <w:t xml:space="preserve">Desenvolvimento Clínico</w:t>
-      </w:r>
-      <w:r>
-        <w:rPr>
-          <w:color w:val="23293D"/>
-          <w:sz w:val="21"/>
-          <w:szCs w:val="21"/>
-        </w:rPr>
-        <w:t xml:space="preserve"> → descreva o que foi feito. </w:t>
-      </w:r>
-      <w:r>
-        <w:rPr>
-          <w:b/>
-          <w:bCs/>
-          <w:color w:val="23293D"/>
-          <w:sz w:val="21"/>
-          <w:szCs w:val="21"/>
-        </w:rPr>
-        <w:t xml:space="preserve">Espere aparecer "Salvo às…"</w:t>
-      </w:r>
-      <w:r>
-        <w:rPr>
-          <w:color w:val="23293D"/>
-          <w:sz w:val="21"/>
-          <w:szCs w:val="21"/>
-        </w:rPr>
-        <w:t xml:space="preserve">.</w:t>
-      </w:r>
-    </w:p>
-    <w:p>
-      <w:pPr>
-        <w:pStyle w:val="ListParagraph"/>
-        <w:numPr>
-          <w:ilvl w:val="0"/>
-          <w:numId w:val="42"/>
-        </w:numPr>
-        <w:spacing w:after="80" w:line="270"/>
-      </w:pPr>
-      <w:r>
-        <w:rPr>
-          <w:b/>
-          <w:bCs/>
-          <w:color w:val="23293D"/>
-          <w:sz w:val="21"/>
-          <w:szCs w:val="21"/>
-        </w:rPr>
-        <w:t xml:space="preserve">Concluir atendimento</w:t>
-      </w:r>
-      <w:r>
-        <w:rPr>
-          <w:color w:val="23293D"/>
-          <w:sz w:val="21"/>
-          <w:szCs w:val="21"/>
-        </w:rPr>
-        <w:t xml:space="preserve"> → marque o que foi feito; o que não foi volta para "a agendar", com motivo.</w:t>
       </w:r>
     </w:p>
     <w:tbl>
@@ -33254,7 +32552,7 @@
                 <w:sz w:val="21"/>
                 <w:szCs w:val="21"/>
               </w:rPr>
-              <w:t xml:space="preserve">O botão de concluir só libera depois da anotação.</w:t>
+              <w:t xml:space="preserve">A gravação cuida de si mesma.</w:t>
             </w:r>
             <w:r>
               <w:rPr>
@@ -33262,7 +32560,220 @@
                 <w:sz w:val="21"/>
                 <w:szCs w:val="21"/>
               </w:rPr>
-              <w:t xml:space="preserve"> Não é travamento: é a regra de que atendimento sem registro não encerra.</w:t>
+              <w:t xml:space="preserve"> Ela </w:t>
+            </w:r>
+            <w:r>
+              <w:rPr>
+                <w:b/>
+                <w:bCs/>
+                <w:color w:val="23293D"/>
+                <w:sz w:val="21"/>
+                <w:szCs w:val="21"/>
+              </w:rPr>
+              <w:t xml:space="preserve">começa</w:t>
+            </w:r>
+            <w:r>
+              <w:rPr>
+                <w:color w:val="23293D"/>
+                <w:sz w:val="21"/>
+                <w:szCs w:val="21"/>
+              </w:rPr>
+              <w:t xml:space="preserve"> quando você chama o paciente para uma avaliação ou reavaliação e </w:t>
+            </w:r>
+            <w:r>
+              <w:rPr>
+                <w:b/>
+                <w:bCs/>
+                <w:color w:val="23293D"/>
+                <w:sz w:val="21"/>
+                <w:szCs w:val="21"/>
+              </w:rPr>
+              <w:t xml:space="preserve">para</w:t>
+            </w:r>
+            <w:r>
+              <w:rPr>
+                <w:color w:val="23293D"/>
+                <w:sz w:val="21"/>
+                <w:szCs w:val="21"/>
+              </w:rPr>
+              <w:t xml:space="preserve"> quando você envia ao Planejamento, conclui a reavaliação ou encerra sem enviar — não existe mais o risco de esquecer de ligar ou de desligar. E se a avaliação for enviada por </w:t>
+            </w:r>
+            <w:r>
+              <w:rPr>
+                <w:b/>
+                <w:bCs/>
+                <w:color w:val="23293D"/>
+                <w:sz w:val="21"/>
+                <w:szCs w:val="21"/>
+              </w:rPr>
+              <w:t xml:space="preserve">outra pessoa</w:t>
+            </w:r>
+            <w:r>
+              <w:rPr>
+                <w:color w:val="23293D"/>
+                <w:sz w:val="21"/>
+                <w:szCs w:val="21"/>
+              </w:rPr>
+              <w:t xml:space="preserve"> ou em </w:t>
+            </w:r>
+            <w:r>
+              <w:rPr>
+                <w:b/>
+                <w:bCs/>
+                <w:color w:val="23293D"/>
+                <w:sz w:val="21"/>
+                <w:szCs w:val="21"/>
+              </w:rPr>
+              <w:t xml:space="preserve">outra aba</w:t>
+            </w:r>
+            <w:r>
+              <w:rPr>
+                <w:color w:val="23293D"/>
+                <w:sz w:val="21"/>
+                <w:szCs w:val="21"/>
+              </w:rPr>
+              <w:t xml:space="preserve">, a gravação percebe em até um minuto que o paciente mudou de fase, e para e salva sozinha — inclusive a iniciada pelo botão </w:t>
+            </w:r>
+            <w:r>
+              <w:rPr>
+                <w:b/>
+                <w:bCs/>
+                <w:color w:val="23293D"/>
+                <w:sz w:val="21"/>
+                <w:szCs w:val="21"/>
+              </w:rPr>
+              <w:t xml:space="preserve">Gravar a consulta</w:t>
+            </w:r>
+            <w:r>
+              <w:rPr>
+                <w:color w:val="23293D"/>
+                <w:sz w:val="21"/>
+                <w:szCs w:val="21"/>
+              </w:rPr>
+              <w:t xml:space="preserve"> da ficha. A faixa do rodapé mostra o tempo e continua lá enquanto você navega: pode abrir a anamnese, subir fotos, ver o histórico, que a gravação não é cortada.</w:t>
+            </w:r>
+          </w:p>
+          <w:p>
+            <w:pPr>
+              <w:spacing w:after="140" w:line="280"/>
+            </w:pPr>
+            <w:r>
+              <w:rPr>
+                <w:b/>
+                <w:bCs/>
+                <w:color w:val="23293D"/>
+                <w:sz w:val="21"/>
+                <w:szCs w:val="21"/>
+              </w:rPr>
+              <w:t xml:space="preserve">Na primeira vez em cada computador</w:t>
+            </w:r>
+            <w:r>
+              <w:rPr>
+                <w:color w:val="23293D"/>
+                <w:sz w:val="21"/>
+                <w:szCs w:val="21"/>
+              </w:rPr>
+              <w:t xml:space="preserve">, o navegador pede permissão para o microfone — permita. Se você negar (ou se o microfone estiver desligado), o sistema avisa </w:t>
+            </w:r>
+            <w:r>
+              <w:rPr>
+                <w:b/>
+                <w:bCs/>
+                <w:color w:val="23293D"/>
+                <w:sz w:val="21"/>
+                <w:szCs w:val="21"/>
+              </w:rPr>
+              <w:t xml:space="preserve">em destaque</w:t>
+            </w:r>
+            <w:r>
+              <w:rPr>
+                <w:color w:val="23293D"/>
+                <w:sz w:val="21"/>
+                <w:szCs w:val="21"/>
+              </w:rPr>
+              <w:t xml:space="preserve"> que a consulta não está sendo gravada; ele não finge que gravou. Nesse caso, resolva o microfone e use o botão </w:t>
+            </w:r>
+            <w:r>
+              <w:rPr>
+                <w:b/>
+                <w:bCs/>
+                <w:color w:val="23293D"/>
+                <w:sz w:val="21"/>
+                <w:szCs w:val="21"/>
+              </w:rPr>
+              <w:t xml:space="preserve">Gravar a consulta</w:t>
+            </w:r>
+            <w:r>
+              <w:rPr>
+                <w:color w:val="23293D"/>
+                <w:sz w:val="21"/>
+                <w:szCs w:val="21"/>
+              </w:rPr>
+              <w:t xml:space="preserve">, na tela de avaliação.</w:t>
+            </w:r>
+          </w:p>
+          <w:p>
+            <w:pPr>
+              <w:spacing w:after="140" w:line="280"/>
+            </w:pPr>
+            <w:r>
+              <w:rPr>
+                <w:b/>
+                <w:bCs/>
+                <w:color w:val="23293D"/>
+                <w:sz w:val="21"/>
+                <w:szCs w:val="21"/>
+              </w:rPr>
+              <w:t xml:space="preserve">Se o paciente pedir para parar</w:t>
+            </w:r>
+            <w:r>
+              <w:rPr>
+                <w:color w:val="23293D"/>
+                <w:sz w:val="21"/>
+                <w:szCs w:val="21"/>
+              </w:rPr>
+              <w:t xml:space="preserve">, use </w:t>
+            </w:r>
+            <w:r>
+              <w:rPr>
+                <w:b/>
+                <w:bCs/>
+                <w:color w:val="23293D"/>
+                <w:sz w:val="21"/>
+                <w:szCs w:val="21"/>
+              </w:rPr>
+              <w:t xml:space="preserve">Parar e salvar</w:t>
+            </w:r>
+            <w:r>
+              <w:rPr>
+                <w:color w:val="23293D"/>
+                <w:sz w:val="21"/>
+                <w:szCs w:val="21"/>
+              </w:rPr>
+              <w:t xml:space="preserve"> na faixa: o que já foi gravado é guardado na ficha, e nada mais é registrado a partir dali.</w:t>
+            </w:r>
+          </w:p>
+          <w:p>
+            <w:pPr>
+              <w:spacing w:after="140" w:line="280"/>
+            </w:pPr>
+            <w:r>
+              <w:rPr>
+                <w:b/>
+                <w:bCs/>
+                <w:color w:val="23293D"/>
+                <w:sz w:val="21"/>
+                <w:szCs w:val="21"/>
+              </w:rPr>
+              <w:t xml:space="preserve">Sessões de tratamento, urgências e retornos não são gravados automaticamente</w:t>
+            </w:r>
+            <w:r>
+              <w:rPr>
+                <w:color w:val="23293D"/>
+                <w:sz w:val="21"/>
+                <w:szCs w:val="21"/>
+              </w:rPr>
+              <w:t xml:space="preserve"> — só avaliação e reavaliação, que são as que viram transcrição e resumo para o planejamento.</w:t>
             </w:r>
           </w:p>
         </w:tc>
@@ -33292,33 +32803,87 @@
           <w:sz w:val="21"/>
           <w:szCs w:val="21"/>
         </w:rPr>
-        <w:t xml:space="preserve">O que acontece automaticamente ao concluir:</w:t>
-      </w:r>
-      <w:r>
-        <w:rPr>
-          <w:color w:val="23293D"/>
-          <w:sz w:val="21"/>
-          <w:szCs w:val="21"/>
-        </w:rPr>
-        <w:t xml:space="preserve"> o material do kit </w:t>
-      </w:r>
-      <w:r>
-        <w:rPr>
-          <w:b/>
-          <w:bCs/>
-          <w:color w:val="23293D"/>
-          <w:sz w:val="21"/>
-          <w:szCs w:val="21"/>
-        </w:rPr>
-        <w:t xml:space="preserve">baixa do estoque</w:t>
-      </w:r>
-      <w:r>
-        <w:rPr>
-          <w:color w:val="23293D"/>
-          <w:sz w:val="21"/>
-          <w:szCs w:val="21"/>
-        </w:rPr>
-        <w:t xml:space="preserve"> e o repasse do procedimento é apurado. Você não digita nada disso.</w:t>
+        <w:t xml:space="preserve">Terceira tarefa — a reavaliação:</w:t>
+      </w:r>
+      <w:r>
+        <w:rPr>
+          <w:color w:val="23293D"/>
+          <w:sz w:val="21"/>
+          <w:szCs w:val="21"/>
+        </w:rPr>
+        <w:t xml:space="preserve"> quando o paciente volta para a revisão e </w:t>
+      </w:r>
+      <w:r>
+        <w:rPr>
+          <w:b/>
+          <w:bCs/>
+          <w:color w:val="23293D"/>
+          <w:sz w:val="21"/>
+          <w:szCs w:val="21"/>
+        </w:rPr>
+        <w:t xml:space="preserve">não precisa de plano novo</w:t>
+      </w:r>
+      <w:r>
+        <w:rPr>
+          <w:color w:val="23293D"/>
+          <w:sz w:val="21"/>
+          <w:szCs w:val="21"/>
+        </w:rPr>
+        <w:t xml:space="preserve">, use </w:t>
+      </w:r>
+      <w:r>
+        <w:rPr>
+          <w:b/>
+          <w:bCs/>
+          <w:color w:val="23293D"/>
+          <w:sz w:val="21"/>
+          <w:szCs w:val="21"/>
+        </w:rPr>
+        <w:t xml:space="preserve">Concluir a reavaliação</w:t>
+      </w:r>
+      <w:r>
+        <w:rPr>
+          <w:color w:val="23293D"/>
+          <w:sz w:val="21"/>
+          <w:szCs w:val="21"/>
+        </w:rPr>
+        <w:t xml:space="preserve"> na mesma tela de avaliação. Ele vai para o </w:t>
+      </w:r>
+      <w:r>
+        <w:rPr>
+          <w:b/>
+          <w:bCs/>
+          <w:color w:val="23293D"/>
+          <w:sz w:val="21"/>
+          <w:szCs w:val="21"/>
+        </w:rPr>
+        <w:t xml:space="preserve">Acompanhamento</w:t>
+      </w:r>
+      <w:r>
+        <w:rPr>
+          <w:color w:val="23293D"/>
+          <w:sz w:val="21"/>
+          <w:szCs w:val="21"/>
+        </w:rPr>
+        <w:t xml:space="preserve"> sem passar pelo Planejamento. Precisando de plano novo, o botão é o mesmo de sempre: </w:t>
+      </w:r>
+      <w:r>
+        <w:rPr>
+          <w:b/>
+          <w:bCs/>
+          <w:color w:val="23293D"/>
+          <w:sz w:val="21"/>
+          <w:szCs w:val="21"/>
+        </w:rPr>
+        <w:t xml:space="preserve">Enviar ao Centro de Planejamento</w:t>
+      </w:r>
+      <w:r>
+        <w:rPr>
+          <w:color w:val="23293D"/>
+          <w:sz w:val="21"/>
+          <w:szCs w:val="21"/>
+        </w:rPr>
+        <w:t xml:space="preserve">.</w:t>
       </w:r>
     </w:p>
     <w:p>
@@ -33329,7 +32894,7 @@
         <w:rPr>
           <w:color w:val="1F3253"/>
         </w:rPr>
-        <w:t xml:space="preserve">6.5. Consultor Comercial</w:t>
+        <w:t xml:space="preserve">6.3. Dentista Planner</w:t>
       </w:r>
     </w:p>
     <w:p>
@@ -33352,7 +32917,7 @@
           <w:sz w:val="21"/>
           <w:szCs w:val="21"/>
         </w:rPr>
-        <w:t xml:space="preserve"> negociar e fechar. </w:t>
+        <w:t xml:space="preserve"> montar plano e orçamento. </w:t>
       </w:r>
       <w:r>
         <w:rPr>
@@ -33370,53 +32935,7 @@
           <w:sz w:val="21"/>
           <w:szCs w:val="21"/>
         </w:rPr>
-        <w:t xml:space="preserve"> 60 minutos.</w:t>
-      </w:r>
-    </w:p>
-    <w:p>
-      <w:pPr>
-        <w:spacing w:after="140" w:line="280"/>
-      </w:pPr>
-      <w:r>
-        <w:rPr>
-          <w:b/>
-          <w:bCs/>
-          <w:color w:val="23293D"/>
-          <w:sz w:val="21"/>
-          <w:szCs w:val="21"/>
-        </w:rPr>
-        <w:t xml:space="preserve">Tarefa 1 — Enquanto a apresentação ainda não aconteceu</w:t>
-      </w:r>
-    </w:p>
-    <w:p>
-      <w:pPr>
-        <w:spacing w:after="140" w:line="280"/>
-      </w:pPr>
-      <w:r>
-        <w:rPr>
-          <w:color w:val="23293D"/>
-          <w:sz w:val="21"/>
-          <w:szCs w:val="21"/>
-        </w:rPr>
-        <w:t xml:space="preserve">Na coluna </w:t>
-      </w:r>
-      <w:r>
-        <w:rPr>
-          <w:b/>
-          <w:bCs/>
-          <w:color w:val="23293D"/>
-          <w:sz w:val="21"/>
-          <w:szCs w:val="21"/>
-        </w:rPr>
-        <w:t xml:space="preserve">A apresentar</w:t>
-      </w:r>
-      <w:r>
-        <w:rPr>
-          <w:color w:val="23293D"/>
-          <w:sz w:val="21"/>
-          <w:szCs w:val="21"/>
-        </w:rPr>
-        <w:t xml:space="preserve">, cada cartão mostra:</w:t>
+        <w:t xml:space="preserve"> 75 minutos.</w:t>
       </w:r>
     </w:p>
     <w:p>
@@ -33430,57 +32949,47 @@
       </w:pPr>
       <w:r>
         <w:rPr>
-          <w:b/>
-          <w:bCs/>
-          <w:color w:val="23293D"/>
-          <w:sz w:val="21"/>
-          <w:szCs w:val="21"/>
-        </w:rPr>
-        <w:t xml:space="preserve">quando é a apresentação</w:t>
-      </w:r>
-      <w:r>
-        <w:rPr>
-          <w:color w:val="23293D"/>
-          <w:sz w:val="21"/>
-          <w:szCs w:val="21"/>
-        </w:rPr>
-        <w:t xml:space="preserve"> e com quem — ou, em </w:t>
-      </w:r>
-      <w:r>
-        <w:rPr>
-          <w:b/>
-          <w:bCs/>
-          <w:color w:val="23293D"/>
-          <w:sz w:val="21"/>
-          <w:szCs w:val="21"/>
-        </w:rPr>
-        <w:t xml:space="preserve">vermelho</w:t>
-      </w:r>
-      <w:r>
-        <w:rPr>
-          <w:color w:val="23293D"/>
-          <w:sz w:val="21"/>
-          <w:szCs w:val="21"/>
-        </w:rPr>
-        <w:t xml:space="preserve">, </w:t>
-      </w:r>
-      <w:r>
-        <w:rPr>
-          <w:i/>
-          <w:iCs/>
-          <w:color w:val="23293D"/>
-          <w:sz w:val="21"/>
-          <w:szCs w:val="21"/>
-        </w:rPr>
-        <w:t xml:space="preserve">"Sem apresentação marcada"</w:t>
-      </w:r>
-      <w:r>
-        <w:rPr>
-          <w:color w:val="23293D"/>
-          <w:sz w:val="21"/>
-          <w:szCs w:val="21"/>
-        </w:rPr>
-        <w:t xml:space="preserve">, que é o caso que trava o funil;</w:t>
+          <w:color w:val="23293D"/>
+          <w:sz w:val="21"/>
+          <w:szCs w:val="21"/>
+        </w:rPr>
+        <w:t xml:space="preserve">Menu </w:t>
+      </w:r>
+      <w:r>
+        <w:rPr>
+          <w:b/>
+          <w:bCs/>
+          <w:color w:val="23293D"/>
+          <w:sz w:val="21"/>
+          <w:szCs w:val="21"/>
+        </w:rPr>
+        <w:t xml:space="preserve">Centro de Planejamento</w:t>
+      </w:r>
+      <w:r>
+        <w:rPr>
+          <w:color w:val="23293D"/>
+          <w:sz w:val="21"/>
+          <w:szCs w:val="21"/>
+        </w:rPr>
+        <w:t xml:space="preserve"> → a fila vem </w:t>
+      </w:r>
+      <w:r>
+        <w:rPr>
+          <w:b/>
+          <w:bCs/>
+          <w:color w:val="23293D"/>
+          <w:sz w:val="21"/>
+          <w:szCs w:val="21"/>
+        </w:rPr>
+        <w:t xml:space="preserve">priorizada</w:t>
+      </w:r>
+      <w:r>
+        <w:rPr>
+          <w:color w:val="23293D"/>
+          <w:sz w:val="21"/>
+          <w:szCs w:val="21"/>
+        </w:rPr>
+        <w:t xml:space="preserve"> (apresentação comercial mais próxima primeiro).</w:t>
       </w:r>
     </w:p>
     <w:p>
@@ -33498,43 +33007,115 @@
           <w:sz w:val="21"/>
           <w:szCs w:val="21"/>
         </w:rPr>
-        <w:t xml:space="preserve">o selo verde </w:t>
-      </w:r>
-      <w:r>
-        <w:rPr>
-          <w:b/>
-          <w:bCs/>
-          <w:color w:val="23293D"/>
-          <w:sz w:val="21"/>
-          <w:szCs w:val="21"/>
-        </w:rPr>
-        <w:t xml:space="preserve">Confirmado</w:t>
-      </w:r>
-      <w:r>
-        <w:rPr>
-          <w:color w:val="23293D"/>
-          <w:sz w:val="21"/>
-          <w:szCs w:val="21"/>
-        </w:rPr>
-        <w:t xml:space="preserve"> quando a Recepção confirmou a presença do cliente (na Agenda ou no Atendimento). </w:t>
-      </w:r>
-      <w:r>
-        <w:rPr>
-          <w:b/>
-          <w:bCs/>
-          <w:color w:val="23293D"/>
-          <w:sz w:val="21"/>
-          <w:szCs w:val="21"/>
-        </w:rPr>
-        <w:t xml:space="preserve">Sem o selo</w:t>
-      </w:r>
-      <w:r>
-        <w:rPr>
-          <w:color w:val="23293D"/>
-          <w:sz w:val="21"/>
-          <w:szCs w:val="21"/>
-        </w:rPr>
-        <w:t xml:space="preserve">, a apresentação está marcada mas ninguém confirmou ainda — vale uma mensagem antes;</w:t>
+        <w:t xml:space="preserve">Abra o caso → cockpit em duas colunas: evidências à esquerda, plano à direita. No cartão </w:t>
+      </w:r>
+      <w:r>
+        <w:rPr>
+          <w:b/>
+          <w:bCs/>
+          <w:color w:val="23293D"/>
+          <w:sz w:val="21"/>
+          <w:szCs w:val="21"/>
+        </w:rPr>
+        <w:t xml:space="preserve">Anamnese</w:t>
+      </w:r>
+      <w:r>
+        <w:rPr>
+          <w:color w:val="23293D"/>
+          <w:sz w:val="21"/>
+          <w:szCs w:val="21"/>
+        </w:rPr>
+        <w:t xml:space="preserve">, os alertas vêm primeiro, dizendo </w:t>
+      </w:r>
+      <w:r>
+        <w:rPr>
+          <w:b/>
+          <w:bCs/>
+          <w:color w:val="23293D"/>
+          <w:sz w:val="21"/>
+          <w:szCs w:val="21"/>
+        </w:rPr>
+        <w:t xml:space="preserve">o que</w:t>
+      </w:r>
+      <w:r>
+        <w:rPr>
+          <w:color w:val="23293D"/>
+          <w:sz w:val="21"/>
+          <w:szCs w:val="21"/>
+        </w:rPr>
+        <w:t xml:space="preserve"> foi marcado (ex.: </w:t>
+      </w:r>
+      <w:r>
+        <w:rPr>
+          <w:b/>
+          <w:bCs/>
+          <w:color w:val="23293D"/>
+          <w:sz w:val="21"/>
+          <w:szCs w:val="21"/>
+        </w:rPr>
+        <w:t xml:space="preserve">Diabetes</w:t>
+      </w:r>
+      <w:r>
+        <w:rPr>
+          <w:color w:val="23293D"/>
+          <w:sz w:val="21"/>
+          <w:szCs w:val="21"/>
+        </w:rPr>
+        <w:t xml:space="preserve">, </w:t>
+      </w:r>
+      <w:r>
+        <w:rPr>
+          <w:b/>
+          <w:bCs/>
+          <w:color w:val="23293D"/>
+          <w:sz w:val="21"/>
+          <w:szCs w:val="21"/>
+        </w:rPr>
+        <w:t xml:space="preserve">AIDS</w:t>
+      </w:r>
+      <w:r>
+        <w:rPr>
+          <w:color w:val="23293D"/>
+          <w:sz w:val="21"/>
+          <w:szCs w:val="21"/>
+        </w:rPr>
+        <w:t xml:space="preserve">, </w:t>
+      </w:r>
+      <w:r>
+        <w:rPr>
+          <w:b/>
+          <w:bCs/>
+          <w:color w:val="23293D"/>
+          <w:sz w:val="21"/>
+          <w:szCs w:val="21"/>
+        </w:rPr>
+        <w:t xml:space="preserve">Dipirona</w:t>
+      </w:r>
+      <w:r>
+        <w:rPr>
+          <w:color w:val="23293D"/>
+          <w:sz w:val="21"/>
+          <w:szCs w:val="21"/>
+        </w:rPr>
+        <w:t xml:space="preserve">); abaixo, a ficha por seção, com pergunta e resposta lado a lado e </w:t>
+      </w:r>
+      <w:r>
+        <w:rPr>
+          <w:b/>
+          <w:bCs/>
+          <w:color w:val="23293D"/>
+          <w:sz w:val="21"/>
+          <w:szCs w:val="21"/>
+        </w:rPr>
+        <w:t xml:space="preserve">em vermelho só o que disparou alerta</w:t>
+      </w:r>
+      <w:r>
+        <w:rPr>
+          <w:color w:val="23293D"/>
+          <w:sz w:val="21"/>
+          <w:szCs w:val="21"/>
+        </w:rPr>
+        <w:t xml:space="preserve"> — as outras opções marcadas aparecem em cinza.</w:t>
       </w:r>
     </w:p>
     <w:p>
@@ -33554,25 +33135,25 @@
           <w:sz w:val="21"/>
           <w:szCs w:val="21"/>
         </w:rPr>
-        <w:t xml:space="preserve">quantas tentativas</w:t>
-      </w:r>
-      <w:r>
-        <w:rPr>
-          <w:color w:val="23293D"/>
-          <w:sz w:val="21"/>
-          <w:szCs w:val="21"/>
-        </w:rPr>
-        <w:t xml:space="preserve"> já houve e </w:t>
-      </w:r>
-      <w:r>
-        <w:rPr>
-          <w:b/>
-          <w:bCs/>
-          <w:color w:val="23293D"/>
-          <w:sz w:val="21"/>
-          <w:szCs w:val="21"/>
-        </w:rPr>
-        <w:t xml:space="preserve">o que aconteceu da última vez</w:t>
+        <w:t xml:space="preserve">Iniciar plano de tratamento</w:t>
+      </w:r>
+      <w:r>
+        <w:rPr>
+          <w:color w:val="23293D"/>
+          <w:sz w:val="21"/>
+          <w:szCs w:val="21"/>
+        </w:rPr>
+        <w:t xml:space="preserve"> → escreva o </w:t>
+      </w:r>
+      <w:r>
+        <w:rPr>
+          <w:b/>
+          <w:bCs/>
+          <w:color w:val="23293D"/>
+          <w:sz w:val="21"/>
+          <w:szCs w:val="21"/>
+        </w:rPr>
+        <w:t xml:space="preserve">Diagnóstico</w:t>
       </w:r>
       <w:r>
         <w:rPr>
@@ -33585,51 +33166,613 @@
     </w:p>
     <w:p>
       <w:pPr>
+        <w:pStyle w:val="ListParagraph"/>
+        <w:numPr>
+          <w:ilvl w:val="0"/>
+          <w:numId w:val="43"/>
+        </w:numPr>
+        <w:spacing w:after="80" w:line="270"/>
+      </w:pPr>
+      <w:r>
+        <w:rPr>
+          <w:b/>
+          <w:bCs/>
+          <w:color w:val="23293D"/>
+          <w:sz w:val="21"/>
+          <w:szCs w:val="21"/>
+        </w:rPr>
+        <w:t xml:space="preserve">Adicionar opção de tratamento</w:t>
+      </w:r>
+      <w:r>
+        <w:rPr>
+          <w:color w:val="23293D"/>
+          <w:sz w:val="21"/>
+          <w:szCs w:val="21"/>
+        </w:rPr>
+        <w:t xml:space="preserve"> (marque uma como principal).</w:t>
+      </w:r>
+    </w:p>
+    <w:p>
+      <w:pPr>
+        <w:pStyle w:val="ListParagraph"/>
+        <w:numPr>
+          <w:ilvl w:val="0"/>
+          <w:numId w:val="43"/>
+        </w:numPr>
+        <w:spacing w:after="80" w:line="270"/>
+      </w:pPr>
+      <w:r>
+        <w:rPr>
+          <w:color w:val="23293D"/>
+          <w:sz w:val="21"/>
+          <w:szCs w:val="21"/>
+        </w:rPr>
+        <w:t xml:space="preserve">Dentro da opção, </w:t>
+      </w:r>
+      <w:r>
+        <w:rPr>
+          <w:b/>
+          <w:bCs/>
+          <w:color w:val="23293D"/>
+          <w:sz w:val="21"/>
+          <w:szCs w:val="21"/>
+        </w:rPr>
+        <w:t xml:space="preserve">Procedimento</w:t>
+      </w:r>
+      <w:r>
+        <w:rPr>
+          <w:color w:val="23293D"/>
+          <w:sz w:val="21"/>
+          <w:szCs w:val="21"/>
+        </w:rPr>
+        <w:t xml:space="preserve"> → escolha do catálogo → </w:t>
+      </w:r>
+      <w:r>
+        <w:rPr>
+          <w:b/>
+          <w:bCs/>
+          <w:color w:val="23293D"/>
+          <w:sz w:val="21"/>
+          <w:szCs w:val="21"/>
+        </w:rPr>
+        <w:t xml:space="preserve">Item</w:t>
+      </w:r>
+      <w:r>
+        <w:rPr>
+          <w:color w:val="23293D"/>
+          <w:sz w:val="21"/>
+          <w:szCs w:val="21"/>
+        </w:rPr>
+        <w:t xml:space="preserve">.</w:t>
+      </w:r>
+    </w:p>
+    <w:p>
+      <w:pPr>
+        <w:pStyle w:val="ListParagraph"/>
+        <w:numPr>
+          <w:ilvl w:val="0"/>
+          <w:numId w:val="43"/>
+        </w:numPr>
+        <w:spacing w:after="80" w:line="270"/>
+      </w:pPr>
+      <w:r>
+        <w:rPr>
+          <w:color w:val="23293D"/>
+          <w:sz w:val="21"/>
+          <w:szCs w:val="21"/>
+        </w:rPr>
+        <w:t xml:space="preserve">Classifique o </w:t>
+      </w:r>
+      <w:r>
+        <w:rPr>
+          <w:b/>
+          <w:bCs/>
+          <w:color w:val="23293D"/>
+          <w:sz w:val="21"/>
+          <w:szCs w:val="21"/>
+        </w:rPr>
+        <w:t xml:space="preserve">pilar</w:t>
+      </w:r>
+      <w:r>
+        <w:rPr>
+          <w:color w:val="23293D"/>
+          <w:sz w:val="21"/>
+          <w:szCs w:val="21"/>
+        </w:rPr>
+        <w:t xml:space="preserve"> (1 dos 6) → </w:t>
+      </w:r>
+      <w:r>
+        <w:rPr>
+          <w:b/>
+          <w:bCs/>
+          <w:color w:val="23293D"/>
+          <w:sz w:val="21"/>
+          <w:szCs w:val="21"/>
+        </w:rPr>
+        <w:t xml:space="preserve">Salvar pilar</w:t>
+      </w:r>
+      <w:r>
+        <w:rPr>
+          <w:color w:val="23293D"/>
+          <w:sz w:val="21"/>
+          <w:szCs w:val="21"/>
+        </w:rPr>
+        <w:t xml:space="preserve">.</w:t>
+      </w:r>
+    </w:p>
+    <w:p>
+      <w:pPr>
+        <w:pStyle w:val="ListParagraph"/>
+        <w:numPr>
+          <w:ilvl w:val="0"/>
+          <w:numId w:val="43"/>
+        </w:numPr>
+        <w:spacing w:after="80" w:line="270"/>
+      </w:pPr>
+      <w:r>
+        <w:rPr>
+          <w:b/>
+          <w:bCs/>
+          <w:color w:val="23293D"/>
+          <w:sz w:val="21"/>
+          <w:szCs w:val="21"/>
+        </w:rPr>
+        <w:t xml:space="preserve">Enviar para aprovação do Coordenador</w:t>
+      </w:r>
+      <w:r>
+        <w:rPr>
+          <w:color w:val="23293D"/>
+          <w:sz w:val="21"/>
+          <w:szCs w:val="21"/>
+        </w:rPr>
+        <w:t xml:space="preserve">.</w:t>
+      </w:r>
+    </w:p>
+    <w:p>
+      <w:pPr>
+        <w:pStyle w:val="ListParagraph"/>
+        <w:numPr>
+          <w:ilvl w:val="0"/>
+          <w:numId w:val="43"/>
+        </w:numPr>
+        <w:spacing w:after="80" w:line="270"/>
+      </w:pPr>
+      <w:r>
+        <w:rPr>
+          <w:color w:val="23293D"/>
+          <w:sz w:val="21"/>
+          <w:szCs w:val="21"/>
+        </w:rPr>
+        <w:t xml:space="preserve">Aprovado, </w:t>
+      </w:r>
+      <w:r>
+        <w:rPr>
+          <w:b/>
+          <w:bCs/>
+          <w:color w:val="23293D"/>
+          <w:sz w:val="21"/>
+          <w:szCs w:val="21"/>
+        </w:rPr>
+        <w:t xml:space="preserve">Enviar ao Comercial</w:t>
+      </w:r>
+      <w:r>
+        <w:rPr>
+          <w:color w:val="23293D"/>
+          <w:sz w:val="21"/>
+          <w:szCs w:val="21"/>
+        </w:rPr>
+        <w:t xml:space="preserve">.</w:t>
+      </w:r>
+    </w:p>
+    <w:p>
+      <w:pPr>
         <w:spacing w:after="140" w:line="280"/>
       </w:pPr>
       <w:r>
         <w:rPr>
-          <w:color w:val="23293D"/>
-          <w:sz w:val="21"/>
-          <w:szCs w:val="21"/>
-        </w:rPr>
-        <w:t xml:space="preserve">Quando o cliente não comparece, pede para remarcar, ou você fala com ele sem conseguir remarcar: </w:t>
-      </w:r>
-      <w:r>
-        <w:rPr>
-          <w:b/>
-          <w:bCs/>
-          <w:color w:val="23293D"/>
-          <w:sz w:val="21"/>
-          <w:szCs w:val="21"/>
-        </w:rPr>
-        <w:t xml:space="preserve">Registrar acontecimento</w:t>
-      </w:r>
-      <w:r>
-        <w:rPr>
-          <w:color w:val="23293D"/>
-          <w:sz w:val="21"/>
-          <w:szCs w:val="21"/>
-        </w:rPr>
-        <w:t xml:space="preserve">. Escolha o tipo, escreva o que houve, e pronto — entra no </w:t>
-      </w:r>
-      <w:r>
-        <w:rPr>
-          <w:i/>
-          <w:iCs/>
-          <w:color w:val="23293D"/>
-          <w:sz w:val="21"/>
-          <w:szCs w:val="21"/>
-        </w:rPr>
-        <w:t xml:space="preserve">Histórico do funil</w:t>
-      </w:r>
-      <w:r>
-        <w:rPr>
-          <w:color w:val="23293D"/>
-          <w:sz w:val="21"/>
-          <w:szCs w:val="21"/>
-        </w:rPr>
-        <w:t xml:space="preserve"> com data, hora e o seu nome.</w:t>
+          <w:b/>
+          <w:bCs/>
+          <w:color w:val="23293D"/>
+          <w:sz w:val="21"/>
+          <w:szCs w:val="21"/>
+        </w:rPr>
+        <w:t xml:space="preserve">Cuidados:</w:t>
+      </w:r>
+      <w:r>
+        <w:rPr>
+          <w:color w:val="23293D"/>
+          <w:sz w:val="21"/>
+          <w:szCs w:val="21"/>
+        </w:rPr>
+        <w:t xml:space="preserve"> o sistema exige procedimentos lançados em cada opção para enviar; plano de tratamento </w:t>
+      </w:r>
+      <w:r>
+        <w:rPr>
+          <w:b/>
+          <w:bCs/>
+          <w:color w:val="23293D"/>
+          <w:sz w:val="21"/>
+          <w:szCs w:val="21"/>
+        </w:rPr>
+        <w:t xml:space="preserve">não tem acréscimo</w:t>
+      </w:r>
+      <w:r>
+        <w:rPr>
+          <w:color w:val="23293D"/>
+          <w:sz w:val="21"/>
+          <w:szCs w:val="21"/>
+        </w:rPr>
+        <w:t xml:space="preserve"> (o preço vem do orçamento aprovado); depois de aprovado o plano fica em leitura — há </w:t>
+      </w:r>
+      <w:r>
+        <w:rPr>
+          <w:b/>
+          <w:bCs/>
+          <w:color w:val="23293D"/>
+          <w:sz w:val="21"/>
+          <w:szCs w:val="21"/>
+        </w:rPr>
+        <w:t xml:space="preserve">Reabrir para edição</w:t>
+      </w:r>
+      <w:r>
+        <w:rPr>
+          <w:color w:val="23293D"/>
+          <w:sz w:val="21"/>
+          <w:szCs w:val="21"/>
+        </w:rPr>
+        <w:t xml:space="preserve">, que exige nova aprovação.</w:t>
+      </w:r>
+    </w:p>
+    <w:p>
+      <w:pPr>
+        <w:spacing w:after="140" w:line="280"/>
+      </w:pPr>
+      <w:r>
+        <w:rPr>
+          <w:b/>
+          <w:bCs/>
+          <w:color w:val="23293D"/>
+          <w:sz w:val="21"/>
+          <w:szCs w:val="21"/>
+        </w:rPr>
+        <w:t xml:space="preserve">Quando faltar informação para planejar</w:t>
+      </w:r>
+      <w:r>
+        <w:rPr>
+          <w:color w:val="23293D"/>
+          <w:sz w:val="21"/>
+          <w:szCs w:val="21"/>
+        </w:rPr>
+        <w:t xml:space="preserve">, não devolva o caso em silêncio: use </w:t>
+      </w:r>
+      <w:r>
+        <w:rPr>
+          <w:b/>
+          <w:bCs/>
+          <w:color w:val="23293D"/>
+          <w:sz w:val="21"/>
+          <w:szCs w:val="21"/>
+        </w:rPr>
+        <w:t xml:space="preserve">Devolver ao Coordenador</w:t>
+      </w:r>
+      <w:r>
+        <w:rPr>
+          <w:color w:val="23293D"/>
+          <w:sz w:val="21"/>
+          <w:szCs w:val="21"/>
+        </w:rPr>
+        <w:t xml:space="preserve">, na aba Plano, e escreva o que falta (foto, exame, consideração). Escolha </w:t>
+      </w:r>
+      <w:r>
+        <w:rPr>
+          <w:b/>
+          <w:bCs/>
+          <w:color w:val="23293D"/>
+          <w:sz w:val="21"/>
+          <w:szCs w:val="21"/>
+        </w:rPr>
+        <w:t xml:space="preserve">Conversão Clínica</w:t>
+      </w:r>
+      <w:r>
+        <w:rPr>
+          <w:color w:val="23293D"/>
+          <w:sz w:val="21"/>
+          <w:szCs w:val="21"/>
+        </w:rPr>
+        <w:t xml:space="preserve"> quando for só dado faltando, ou </w:t>
+      </w:r>
+      <w:r>
+        <w:rPr>
+          <w:b/>
+          <w:bCs/>
+          <w:color w:val="23293D"/>
+          <w:sz w:val="21"/>
+          <w:szCs w:val="21"/>
+        </w:rPr>
+        <w:t xml:space="preserve">Reavaliação</w:t>
+      </w:r>
+      <w:r>
+        <w:rPr>
+          <w:color w:val="23293D"/>
+          <w:sz w:val="21"/>
+          <w:szCs w:val="21"/>
+        </w:rPr>
+        <w:t xml:space="preserve"> quando o caso precisar ser examinado de novo. O Coordenador recebe o aviso com o seu motivo — sem ele, o caso volta igual.</w:t>
+      </w:r>
+    </w:p>
+    <w:p>
+      <w:pPr>
+        <w:pStyle w:val="Heading2"/>
+      </w:pPr>
+      <w:r>
+        <w:rPr>
+          <w:color w:val="1F3253"/>
+        </w:rPr>
+        <w:t xml:space="preserve">6.4. Dentista (executor)</w:t>
+      </w:r>
+    </w:p>
+    <w:p>
+      <w:pPr>
+        <w:spacing w:after="140" w:line="280"/>
+      </w:pPr>
+      <w:r>
+        <w:rPr>
+          <w:b/>
+          <w:bCs/>
+          <w:color w:val="23293D"/>
+          <w:sz w:val="21"/>
+          <w:szCs w:val="21"/>
+        </w:rPr>
+        <w:t xml:space="preserve">Objetivo:</w:t>
+      </w:r>
+      <w:r>
+        <w:rPr>
+          <w:color w:val="23293D"/>
+          <w:sz w:val="21"/>
+          <w:szCs w:val="21"/>
+        </w:rPr>
+        <w:t xml:space="preserve"> executar e registrar. </w:t>
+      </w:r>
+      <w:r>
+        <w:rPr>
+          <w:b/>
+          <w:bCs/>
+          <w:color w:val="23293D"/>
+          <w:sz w:val="21"/>
+          <w:szCs w:val="21"/>
+        </w:rPr>
+        <w:t xml:space="preserve">Duração:</w:t>
+      </w:r>
+      <w:r>
+        <w:rPr>
+          <w:color w:val="23293D"/>
+          <w:sz w:val="21"/>
+          <w:szCs w:val="21"/>
+        </w:rPr>
+        <w:t xml:space="preserve"> 40 minutos.</w:t>
+      </w:r>
+    </w:p>
+    <w:p>
+      <w:pPr>
+        <w:spacing w:after="140" w:line="280"/>
+      </w:pPr>
+      <w:r>
+        <w:rPr>
+          <w:color w:val="23293D"/>
+          <w:sz w:val="21"/>
+          <w:szCs w:val="21"/>
+        </w:rPr>
+        <w:t xml:space="preserve">Seu menu é diferente: </w:t>
+      </w:r>
+      <w:r>
+        <w:rPr>
+          <w:b/>
+          <w:bCs/>
+          <w:color w:val="23293D"/>
+          <w:sz w:val="21"/>
+          <w:szCs w:val="21"/>
+        </w:rPr>
+        <w:t xml:space="preserve">não tem Jornada</w:t>
+      </w:r>
+      <w:r>
+        <w:rPr>
+          <w:color w:val="23293D"/>
+          <w:sz w:val="21"/>
+          <w:szCs w:val="21"/>
+        </w:rPr>
+        <w:t xml:space="preserve">, e tem </w:t>
+      </w:r>
+      <w:r>
+        <w:rPr>
+          <w:b/>
+          <w:bCs/>
+          <w:color w:val="23293D"/>
+          <w:sz w:val="21"/>
+          <w:szCs w:val="21"/>
+        </w:rPr>
+        <w:t xml:space="preserve">Meu Dia</w:t>
+      </w:r>
+      <w:r>
+        <w:rPr>
+          <w:color w:val="23293D"/>
+          <w:sz w:val="21"/>
+          <w:szCs w:val="21"/>
+        </w:rPr>
+        <w:t xml:space="preserve"> e </w:t>
+      </w:r>
+      <w:r>
+        <w:rPr>
+          <w:b/>
+          <w:bCs/>
+          <w:color w:val="23293D"/>
+          <w:sz w:val="21"/>
+          <w:szCs w:val="21"/>
+        </w:rPr>
+        <w:t xml:space="preserve">Minha Agenda</w:t>
+      </w:r>
+      <w:r>
+        <w:rPr>
+          <w:color w:val="23293D"/>
+          <w:sz w:val="21"/>
+          <w:szCs w:val="21"/>
+        </w:rPr>
+        <w:t xml:space="preserve">.</w:t>
+      </w:r>
+    </w:p>
+    <w:p>
+      <w:pPr>
+        <w:pStyle w:val="ListParagraph"/>
+        <w:numPr>
+          <w:ilvl w:val="0"/>
+          <w:numId w:val="44"/>
+        </w:numPr>
+        <w:spacing w:after="80" w:line="270"/>
+      </w:pPr>
+      <w:r>
+        <w:rPr>
+          <w:b/>
+          <w:bCs/>
+          <w:color w:val="23293D"/>
+          <w:sz w:val="21"/>
+          <w:szCs w:val="21"/>
+        </w:rPr>
+        <w:t xml:space="preserve">Meu Dia</w:t>
+      </w:r>
+      <w:r>
+        <w:rPr>
+          <w:color w:val="23293D"/>
+          <w:sz w:val="21"/>
+          <w:szCs w:val="21"/>
+        </w:rPr>
+        <w:t xml:space="preserve"> → seus atendimentos.</w:t>
+      </w:r>
+    </w:p>
+    <w:p>
+      <w:pPr>
+        <w:pStyle w:val="ListParagraph"/>
+        <w:numPr>
+          <w:ilvl w:val="0"/>
+          <w:numId w:val="44"/>
+        </w:numPr>
+        <w:spacing w:after="80" w:line="270"/>
+      </w:pPr>
+      <w:r>
+        <w:rPr>
+          <w:b/>
+          <w:bCs/>
+          <w:color w:val="23293D"/>
+          <w:sz w:val="21"/>
+          <w:szCs w:val="21"/>
+        </w:rPr>
+        <w:t xml:space="preserve">Atendimento</w:t>
+      </w:r>
+      <w:r>
+        <w:rPr>
+          <w:color w:val="23293D"/>
+          <w:sz w:val="21"/>
+          <w:szCs w:val="21"/>
+        </w:rPr>
+        <w:t xml:space="preserve"> → </w:t>
+      </w:r>
+      <w:r>
+        <w:rPr>
+          <w:b/>
+          <w:bCs/>
+          <w:color w:val="23293D"/>
+          <w:sz w:val="21"/>
+          <w:szCs w:val="21"/>
+        </w:rPr>
+        <w:t xml:space="preserve">Chamar</w:t>
+      </w:r>
+      <w:r>
+        <w:rPr>
+          <w:color w:val="23293D"/>
+          <w:sz w:val="21"/>
+          <w:szCs w:val="21"/>
+        </w:rPr>
+        <w:t xml:space="preserve">.</w:t>
+      </w:r>
+    </w:p>
+    <w:p>
+      <w:pPr>
+        <w:pStyle w:val="ListParagraph"/>
+        <w:numPr>
+          <w:ilvl w:val="0"/>
+          <w:numId w:val="44"/>
+        </w:numPr>
+        <w:spacing w:after="80" w:line="270"/>
+      </w:pPr>
+      <w:r>
+        <w:rPr>
+          <w:color w:val="23293D"/>
+          <w:sz w:val="21"/>
+          <w:szCs w:val="21"/>
+        </w:rPr>
+        <w:t xml:space="preserve">Ficha do paciente → aba </w:t>
+      </w:r>
+      <w:r>
+        <w:rPr>
+          <w:b/>
+          <w:bCs/>
+          <w:color w:val="23293D"/>
+          <w:sz w:val="21"/>
+          <w:szCs w:val="21"/>
+        </w:rPr>
+        <w:t xml:space="preserve">Desenvolvimento Clínico</w:t>
+      </w:r>
+      <w:r>
+        <w:rPr>
+          <w:color w:val="23293D"/>
+          <w:sz w:val="21"/>
+          <w:szCs w:val="21"/>
+        </w:rPr>
+        <w:t xml:space="preserve"> → descreva o que foi feito. </w:t>
+      </w:r>
+      <w:r>
+        <w:rPr>
+          <w:b/>
+          <w:bCs/>
+          <w:color w:val="23293D"/>
+          <w:sz w:val="21"/>
+          <w:szCs w:val="21"/>
+        </w:rPr>
+        <w:t xml:space="preserve">Espere aparecer "Salvo às…"</w:t>
+      </w:r>
+      <w:r>
+        <w:rPr>
+          <w:color w:val="23293D"/>
+          <w:sz w:val="21"/>
+          <w:szCs w:val="21"/>
+        </w:rPr>
+        <w:t xml:space="preserve">.</w:t>
+      </w:r>
+    </w:p>
+    <w:p>
+      <w:pPr>
+        <w:pStyle w:val="ListParagraph"/>
+        <w:numPr>
+          <w:ilvl w:val="0"/>
+          <w:numId w:val="44"/>
+        </w:numPr>
+        <w:spacing w:after="80" w:line="270"/>
+      </w:pPr>
+      <w:r>
+        <w:rPr>
+          <w:b/>
+          <w:bCs/>
+          <w:color w:val="23293D"/>
+          <w:sz w:val="21"/>
+          <w:szCs w:val="21"/>
+        </w:rPr>
+        <w:t xml:space="preserve">Concluir atendimento</w:t>
+      </w:r>
+      <w:r>
+        <w:rPr>
+          <w:color w:val="23293D"/>
+          <w:sz w:val="21"/>
+          <w:szCs w:val="21"/>
+        </w:rPr>
+        <w:t xml:space="preserve"> → marque o que foi feito; o que não foi volta para "a agendar", com motivo.</w:t>
       </w:r>
     </w:p>
     <w:tbl>
@@ -33671,7 +33814,7 @@
                 <w:sz w:val="21"/>
                 <w:szCs w:val="21"/>
               </w:rPr>
-              <w:t xml:space="preserve">O tipo é o que faz o sistema contar.</w:t>
+              <w:t xml:space="preserve">O botão de concluir só libera depois da anotação.</w:t>
             </w:r>
             <w:r>
               <w:rPr>
@@ -33679,25 +33822,7 @@
                 <w:sz w:val="21"/>
                 <w:szCs w:val="21"/>
               </w:rPr>
-              <w:t xml:space="preserve"> É por ele que o cartão diz </w:t>
-            </w:r>
-            <w:r>
-              <w:rPr>
-                <w:i/>
-                <w:iCs/>
-                <w:color w:val="23293D"/>
-                <w:sz w:val="21"/>
-                <w:szCs w:val="21"/>
-              </w:rPr>
-              <w:t xml:space="preserve">"3ª tentativa · 2 não comparecimentos"</w:t>
-            </w:r>
-            <w:r>
-              <w:rPr>
-                <w:color w:val="23293D"/>
-                <w:sz w:val="21"/>
-                <w:szCs w:val="21"/>
-              </w:rPr>
-              <w:t xml:space="preserve">. Se tudo fosse texto livre, ninguém saberia quais casos mais falham.</w:t>
+              <w:t xml:space="preserve"> Não é travamento: é a regra de que atendimento sem registro não encerra.</w:t>
             </w:r>
           </w:p>
         </w:tc>
@@ -33727,15 +33852,177 @@
           <w:sz w:val="21"/>
           <w:szCs w:val="21"/>
         </w:rPr>
-        <w:t xml:space="preserve">Quando não há mais o que tentar: Marcar como perdido</w:t>
-      </w:r>
-      <w:r>
-        <w:rPr>
-          <w:color w:val="23293D"/>
-          <w:sz w:val="21"/>
-          <w:szCs w:val="21"/>
-        </w:rPr>
-        <w:t xml:space="preserve"> (ou </w:t>
+        <w:t xml:space="preserve">O que acontece automaticamente ao concluir:</w:t>
+      </w:r>
+      <w:r>
+        <w:rPr>
+          <w:color w:val="23293D"/>
+          <w:sz w:val="21"/>
+          <w:szCs w:val="21"/>
+        </w:rPr>
+        <w:t xml:space="preserve"> o material do kit </w:t>
+      </w:r>
+      <w:r>
+        <w:rPr>
+          <w:b/>
+          <w:bCs/>
+          <w:color w:val="23293D"/>
+          <w:sz w:val="21"/>
+          <w:szCs w:val="21"/>
+        </w:rPr>
+        <w:t xml:space="preserve">baixa do estoque</w:t>
+      </w:r>
+      <w:r>
+        <w:rPr>
+          <w:color w:val="23293D"/>
+          <w:sz w:val="21"/>
+          <w:szCs w:val="21"/>
+        </w:rPr>
+        <w:t xml:space="preserve"> e o repasse do procedimento é apurado. Você não digita nada disso.</w:t>
+      </w:r>
+    </w:p>
+    <w:p>
+      <w:pPr>
+        <w:pStyle w:val="Heading2"/>
+      </w:pPr>
+      <w:r>
+        <w:rPr>
+          <w:color w:val="1F3253"/>
+        </w:rPr>
+        <w:t xml:space="preserve">6.5. Consultor Comercial</w:t>
+      </w:r>
+    </w:p>
+    <w:p>
+      <w:pPr>
+        <w:spacing w:after="140" w:line="280"/>
+      </w:pPr>
+      <w:r>
+        <w:rPr>
+          <w:b/>
+          <w:bCs/>
+          <w:color w:val="23293D"/>
+          <w:sz w:val="21"/>
+          <w:szCs w:val="21"/>
+        </w:rPr>
+        <w:t xml:space="preserve">Objetivo:</w:t>
+      </w:r>
+      <w:r>
+        <w:rPr>
+          <w:color w:val="23293D"/>
+          <w:sz w:val="21"/>
+          <w:szCs w:val="21"/>
+        </w:rPr>
+        <w:t xml:space="preserve"> negociar e fechar. </w:t>
+      </w:r>
+      <w:r>
+        <w:rPr>
+          <w:b/>
+          <w:bCs/>
+          <w:color w:val="23293D"/>
+          <w:sz w:val="21"/>
+          <w:szCs w:val="21"/>
+        </w:rPr>
+        <w:t xml:space="preserve">Duração:</w:t>
+      </w:r>
+      <w:r>
+        <w:rPr>
+          <w:color w:val="23293D"/>
+          <w:sz w:val="21"/>
+          <w:szCs w:val="21"/>
+        </w:rPr>
+        <w:t xml:space="preserve"> 60 minutos.</w:t>
+      </w:r>
+    </w:p>
+    <w:p>
+      <w:pPr>
+        <w:spacing w:after="140" w:line="280"/>
+      </w:pPr>
+      <w:r>
+        <w:rPr>
+          <w:b/>
+          <w:bCs/>
+          <w:color w:val="23293D"/>
+          <w:sz w:val="21"/>
+          <w:szCs w:val="21"/>
+        </w:rPr>
+        <w:t xml:space="preserve">Tarefa 1 — Enquanto a apresentação ainda não aconteceu</w:t>
+      </w:r>
+    </w:p>
+    <w:p>
+      <w:pPr>
+        <w:spacing w:after="140" w:line="280"/>
+      </w:pPr>
+      <w:r>
+        <w:rPr>
+          <w:color w:val="23293D"/>
+          <w:sz w:val="21"/>
+          <w:szCs w:val="21"/>
+        </w:rPr>
+        <w:t xml:space="preserve">Na coluna </w:t>
+      </w:r>
+      <w:r>
+        <w:rPr>
+          <w:b/>
+          <w:bCs/>
+          <w:color w:val="23293D"/>
+          <w:sz w:val="21"/>
+          <w:szCs w:val="21"/>
+        </w:rPr>
+        <w:t xml:space="preserve">A apresentar</w:t>
+      </w:r>
+      <w:r>
+        <w:rPr>
+          <w:color w:val="23293D"/>
+          <w:sz w:val="21"/>
+          <w:szCs w:val="21"/>
+        </w:rPr>
+        <w:t xml:space="preserve">, cada cartão mostra:</w:t>
+      </w:r>
+    </w:p>
+    <w:p>
+      <w:pPr>
+        <w:pStyle w:val="ListParagraph"/>
+        <w:numPr>
+          <w:ilvl w:val="0"/>
+          <w:numId w:val="45"/>
+        </w:numPr>
+        <w:spacing w:after="80" w:line="270"/>
+      </w:pPr>
+      <w:r>
+        <w:rPr>
+          <w:b/>
+          <w:bCs/>
+          <w:color w:val="23293D"/>
+          <w:sz w:val="21"/>
+          <w:szCs w:val="21"/>
+        </w:rPr>
+        <w:t xml:space="preserve">quando é a apresentação</w:t>
+      </w:r>
+      <w:r>
+        <w:rPr>
+          <w:color w:val="23293D"/>
+          <w:sz w:val="21"/>
+          <w:szCs w:val="21"/>
+        </w:rPr>
+        <w:t xml:space="preserve"> e com quem — ou, em </w:t>
+      </w:r>
+      <w:r>
+        <w:rPr>
+          <w:b/>
+          <w:bCs/>
+          <w:color w:val="23293D"/>
+          <w:sz w:val="21"/>
+          <w:szCs w:val="21"/>
+        </w:rPr>
+        <w:t xml:space="preserve">vermelho</w:t>
+      </w:r>
+      <w:r>
+        <w:rPr>
+          <w:color w:val="23293D"/>
+          <w:sz w:val="21"/>
+          <w:szCs w:val="21"/>
+        </w:rPr>
+        <w:t xml:space="preserve">, </w:t>
       </w:r>
       <w:r>
         <w:rPr>
@@ -33745,15 +34032,164 @@
           <w:sz w:val="21"/>
           <w:szCs w:val="21"/>
         </w:rPr>
-        <w:t xml:space="preserve">cancelado</w:t>
-      </w:r>
-      <w:r>
-        <w:rPr>
-          <w:color w:val="23293D"/>
-          <w:sz w:val="21"/>
-          <w:szCs w:val="21"/>
-        </w:rPr>
-        <w:t xml:space="preserve">), com o motivo — que é obrigatório.</w:t>
+        <w:t xml:space="preserve">"Sem apresentação marcada"</w:t>
+      </w:r>
+      <w:r>
+        <w:rPr>
+          <w:color w:val="23293D"/>
+          <w:sz w:val="21"/>
+          <w:szCs w:val="21"/>
+        </w:rPr>
+        <w:t xml:space="preserve">, que é o caso que trava o funil;</w:t>
+      </w:r>
+    </w:p>
+    <w:p>
+      <w:pPr>
+        <w:pStyle w:val="ListParagraph"/>
+        <w:numPr>
+          <w:ilvl w:val="0"/>
+          <w:numId w:val="45"/>
+        </w:numPr>
+        <w:spacing w:after="80" w:line="270"/>
+      </w:pPr>
+      <w:r>
+        <w:rPr>
+          <w:color w:val="23293D"/>
+          <w:sz w:val="21"/>
+          <w:szCs w:val="21"/>
+        </w:rPr>
+        <w:t xml:space="preserve">o selo verde </w:t>
+      </w:r>
+      <w:r>
+        <w:rPr>
+          <w:b/>
+          <w:bCs/>
+          <w:color w:val="23293D"/>
+          <w:sz w:val="21"/>
+          <w:szCs w:val="21"/>
+        </w:rPr>
+        <w:t xml:space="preserve">Confirmado</w:t>
+      </w:r>
+      <w:r>
+        <w:rPr>
+          <w:color w:val="23293D"/>
+          <w:sz w:val="21"/>
+          <w:szCs w:val="21"/>
+        </w:rPr>
+        <w:t xml:space="preserve"> quando a Recepção confirmou a presença do cliente (na Agenda ou no Atendimento). </w:t>
+      </w:r>
+      <w:r>
+        <w:rPr>
+          <w:b/>
+          <w:bCs/>
+          <w:color w:val="23293D"/>
+          <w:sz w:val="21"/>
+          <w:szCs w:val="21"/>
+        </w:rPr>
+        <w:t xml:space="preserve">Sem o selo</w:t>
+      </w:r>
+      <w:r>
+        <w:rPr>
+          <w:color w:val="23293D"/>
+          <w:sz w:val="21"/>
+          <w:szCs w:val="21"/>
+        </w:rPr>
+        <w:t xml:space="preserve">, a apresentação está marcada mas ninguém confirmou ainda — vale uma mensagem antes;</w:t>
+      </w:r>
+    </w:p>
+    <w:p>
+      <w:pPr>
+        <w:pStyle w:val="ListParagraph"/>
+        <w:numPr>
+          <w:ilvl w:val="0"/>
+          <w:numId w:val="45"/>
+        </w:numPr>
+        <w:spacing w:after="80" w:line="270"/>
+      </w:pPr>
+      <w:r>
+        <w:rPr>
+          <w:b/>
+          <w:bCs/>
+          <w:color w:val="23293D"/>
+          <w:sz w:val="21"/>
+          <w:szCs w:val="21"/>
+        </w:rPr>
+        <w:t xml:space="preserve">quantas tentativas</w:t>
+      </w:r>
+      <w:r>
+        <w:rPr>
+          <w:color w:val="23293D"/>
+          <w:sz w:val="21"/>
+          <w:szCs w:val="21"/>
+        </w:rPr>
+        <w:t xml:space="preserve"> já houve e </w:t>
+      </w:r>
+      <w:r>
+        <w:rPr>
+          <w:b/>
+          <w:bCs/>
+          <w:color w:val="23293D"/>
+          <w:sz w:val="21"/>
+          <w:szCs w:val="21"/>
+        </w:rPr>
+        <w:t xml:space="preserve">o que aconteceu da última vez</w:t>
+      </w:r>
+      <w:r>
+        <w:rPr>
+          <w:color w:val="23293D"/>
+          <w:sz w:val="21"/>
+          <w:szCs w:val="21"/>
+        </w:rPr>
+        <w:t xml:space="preserve">.</w:t>
+      </w:r>
+    </w:p>
+    <w:p>
+      <w:pPr>
+        <w:spacing w:after="140" w:line="280"/>
+      </w:pPr>
+      <w:r>
+        <w:rPr>
+          <w:color w:val="23293D"/>
+          <w:sz w:val="21"/>
+          <w:szCs w:val="21"/>
+        </w:rPr>
+        <w:t xml:space="preserve">Quando o cliente não comparece, pede para remarcar, ou você fala com ele sem conseguir remarcar: </w:t>
+      </w:r>
+      <w:r>
+        <w:rPr>
+          <w:b/>
+          <w:bCs/>
+          <w:color w:val="23293D"/>
+          <w:sz w:val="21"/>
+          <w:szCs w:val="21"/>
+        </w:rPr>
+        <w:t xml:space="preserve">Registrar acontecimento</w:t>
+      </w:r>
+      <w:r>
+        <w:rPr>
+          <w:color w:val="23293D"/>
+          <w:sz w:val="21"/>
+          <w:szCs w:val="21"/>
+        </w:rPr>
+        <w:t xml:space="preserve">. Escolha o tipo, escreva o que houve, e pronto — entra no </w:t>
+      </w:r>
+      <w:r>
+        <w:rPr>
+          <w:i/>
+          <w:iCs/>
+          <w:color w:val="23293D"/>
+          <w:sz w:val="21"/>
+          <w:szCs w:val="21"/>
+        </w:rPr>
+        <w:t xml:space="preserve">Histórico do funil</w:t>
+      </w:r>
+      <w:r>
+        <w:rPr>
+          <w:color w:val="23293D"/>
+          <w:sz w:val="21"/>
+          <w:szCs w:val="21"/>
+        </w:rPr>
+        <w:t xml:space="preserve"> com data, hora e o seu nome.</w:t>
       </w:r>
     </w:p>
     <w:tbl>
@@ -33789,6 +34225,130 @@
             </w:pPr>
             <w:r>
               <w:rPr>
+                <w:b/>
+                <w:bCs/>
+                <w:color w:val="23293D"/>
+                <w:sz w:val="21"/>
+                <w:szCs w:val="21"/>
+              </w:rPr>
+              <w:t xml:space="preserve">O tipo é o que faz o sistema contar.</w:t>
+            </w:r>
+            <w:r>
+              <w:rPr>
+                <w:color w:val="23293D"/>
+                <w:sz w:val="21"/>
+                <w:szCs w:val="21"/>
+              </w:rPr>
+              <w:t xml:space="preserve"> É por ele que o cartão diz </w:t>
+            </w:r>
+            <w:r>
+              <w:rPr>
+                <w:i/>
+                <w:iCs/>
+                <w:color w:val="23293D"/>
+                <w:sz w:val="21"/>
+                <w:szCs w:val="21"/>
+              </w:rPr>
+              <w:t xml:space="preserve">"3ª tentativa · 2 não comparecimentos"</w:t>
+            </w:r>
+            <w:r>
+              <w:rPr>
+                <w:color w:val="23293D"/>
+                <w:sz w:val="21"/>
+                <w:szCs w:val="21"/>
+              </w:rPr>
+              <w:t xml:space="preserve">. Se tudo fosse texto livre, ninguém saberia quais casos mais falham.</w:t>
+            </w:r>
+          </w:p>
+        </w:tc>
+      </w:tr>
+    </w:tbl>
+    <w:p>
+      <w:pPr>
+        <w:spacing w:after="140" w:line="120"/>
+      </w:pPr>
+      <w:r>
+        <w:rPr>
+          <w:sz w:val="2"/>
+          <w:szCs w:val="2"/>
+        </w:rPr>
+        <w:t xml:space="preserve"/>
+      </w:r>
+    </w:p>
+    <w:p>
+      <w:pPr>
+        <w:spacing w:after="140" w:line="280"/>
+      </w:pPr>
+      <w:r>
+        <w:rPr>
+          <w:b/>
+          <w:bCs/>
+          <w:color w:val="23293D"/>
+          <w:sz w:val="21"/>
+          <w:szCs w:val="21"/>
+        </w:rPr>
+        <w:t xml:space="preserve">Quando não há mais o que tentar: Marcar como perdido</w:t>
+      </w:r>
+      <w:r>
+        <w:rPr>
+          <w:color w:val="23293D"/>
+          <w:sz w:val="21"/>
+          <w:szCs w:val="21"/>
+        </w:rPr>
+        <w:t xml:space="preserve"> (ou </w:t>
+      </w:r>
+      <w:r>
+        <w:rPr>
+          <w:i/>
+          <w:iCs/>
+          <w:color w:val="23293D"/>
+          <w:sz w:val="21"/>
+          <w:szCs w:val="21"/>
+        </w:rPr>
+        <w:t xml:space="preserve">cancelado</w:t>
+      </w:r>
+      <w:r>
+        <w:rPr>
+          <w:color w:val="23293D"/>
+          <w:sz w:val="21"/>
+          <w:szCs w:val="21"/>
+        </w:rPr>
+        <w:t xml:space="preserve">), com o motivo — que é obrigatório.</w:t>
+      </w:r>
+    </w:p>
+    <w:tbl>
+      <w:tblPr>
+        <w:tblW w:type="dxa" w:w="9638"/>
+        <w:tblBorders>
+          <w:top w:val="single" w:color="F5F3EC" w:sz="2"/>
+          <w:left w:val="single" w:color="B98B2E" w:sz="18"/>
+          <w:bottom w:val="single" w:color="F5F3EC" w:sz="2"/>
+          <w:right w:val="single" w:color="F5F3EC" w:sz="2"/>
+          <w:insideH w:val="none" w:color="auto" w:sz="0"/>
+          <w:insideV w:val="none" w:color="auto" w:sz="0"/>
+        </w:tblBorders>
+      </w:tblPr>
+      <w:tblGrid>
+        <w:gridCol w:w="9638"/>
+      </w:tblGrid>
+      <w:tr>
+        <w:tc>
+          <w:tcPr>
+            <w:tcW w:type="dxa" w:w="9638"/>
+            <w:shd w:fill="F5F3EC" w:color="auto" w:val="clear"/>
+            <w:tcMar>
+              <w:top w:type="dxa" w:w="160"/>
+              <w:left w:type="dxa" w:w="220"/>
+              <w:bottom w:type="dxa" w:w="160"/>
+              <w:right w:type="dxa" w:w="200"/>
+            </w:tcMar>
+          </w:tcPr>
+          <w:p>
+            <w:pPr>
+              <w:spacing w:after="140" w:line="280"/>
+            </w:pPr>
+            <w:r>
+              <w:rPr>
                 <w:color w:val="23293D"/>
                 <w:sz w:val="21"/>
                 <w:szCs w:val="21"/>
@@ -34122,7 +34682,7 @@
         <w:pStyle w:val="ListParagraph"/>
         <w:numPr>
           <w:ilvl w:val="0"/>
-          <w:numId w:val="44"/>
+          <w:numId w:val="46"/>
         </w:numPr>
         <w:spacing w:after="80" w:line="270"/>
       </w:pPr>
@@ -34158,7 +34718,7 @@
         <w:pStyle w:val="ListParagraph"/>
         <w:numPr>
           <w:ilvl w:val="0"/>
-          <w:numId w:val="44"/>
+          <w:numId w:val="46"/>
         </w:numPr>
         <w:spacing w:after="80" w:line="270"/>
       </w:pPr>
@@ -34230,7 +34790,7 @@
         <w:pStyle w:val="ListParagraph"/>
         <w:numPr>
           <w:ilvl w:val="0"/>
-          <w:numId w:val="44"/>
+          <w:numId w:val="46"/>
         </w:numPr>
         <w:spacing w:after="80" w:line="270"/>
       </w:pPr>
@@ -34258,7 +34818,7 @@
         <w:pStyle w:val="ListParagraph"/>
         <w:numPr>
           <w:ilvl w:val="0"/>
-          <w:numId w:val="44"/>
+          <w:numId w:val="46"/>
         </w:numPr>
         <w:spacing w:after="80" w:line="270"/>
       </w:pPr>
@@ -35198,7 +35758,7 @@
         <w:pStyle w:val="ListParagraph"/>
         <w:numPr>
           <w:ilvl w:val="0"/>
-          <w:numId w:val="45"/>
+          <w:numId w:val="47"/>
         </w:numPr>
         <w:spacing w:after="80" w:line="270"/>
       </w:pPr>
@@ -35280,7 +35840,7 @@
         <w:pStyle w:val="ListParagraph"/>
         <w:numPr>
           <w:ilvl w:val="0"/>
-          <w:numId w:val="45"/>
+          <w:numId w:val="47"/>
         </w:numPr>
         <w:spacing w:after="80" w:line="270"/>
       </w:pPr>
@@ -35326,7 +35886,7 @@
         <w:pStyle w:val="ListParagraph"/>
         <w:numPr>
           <w:ilvl w:val="0"/>
-          <w:numId w:val="45"/>
+          <w:numId w:val="47"/>
         </w:numPr>
         <w:spacing w:after="80" w:line="270"/>
       </w:pPr>
@@ -38033,7 +38593,7 @@
         <w:pStyle w:val="ListParagraph"/>
         <w:numPr>
           <w:ilvl w:val="0"/>
-          <w:numId w:val="46"/>
+          <w:numId w:val="48"/>
         </w:numPr>
         <w:spacing w:after="80" w:line="270"/>
       </w:pPr>
@@ -38051,7 +38611,7 @@
         <w:pStyle w:val="ListParagraph"/>
         <w:numPr>
           <w:ilvl w:val="0"/>
-          <w:numId w:val="46"/>
+          <w:numId w:val="48"/>
         </w:numPr>
         <w:spacing w:after="80" w:line="270"/>
       </w:pPr>
@@ -38069,7 +38629,7 @@
         <w:pStyle w:val="ListParagraph"/>
         <w:numPr>
           <w:ilvl w:val="0"/>
-          <w:numId w:val="46"/>
+          <w:numId w:val="48"/>
         </w:numPr>
         <w:spacing w:after="80" w:line="270"/>
       </w:pPr>
@@ -38151,7 +38711,7 @@
         <w:pStyle w:val="ListParagraph"/>
         <w:numPr>
           <w:ilvl w:val="0"/>
-          <w:numId w:val="46"/>
+          <w:numId w:val="48"/>
         </w:numPr>
         <w:spacing w:after="80" w:line="270"/>
       </w:pPr>
@@ -38262,7 +38822,7 @@
         <w:pStyle w:val="ListParagraph"/>
         <w:numPr>
           <w:ilvl w:val="0"/>
-          <w:numId w:val="47"/>
+          <w:numId w:val="49"/>
         </w:numPr>
         <w:spacing w:after="80" w:line="270"/>
       </w:pPr>
@@ -38308,7 +38868,7 @@
         <w:pStyle w:val="ListParagraph"/>
         <w:numPr>
           <w:ilvl w:val="0"/>
-          <w:numId w:val="47"/>
+          <w:numId w:val="49"/>
         </w:numPr>
         <w:spacing w:after="80" w:line="270"/>
       </w:pPr>
@@ -38372,7 +38932,7 @@
         <w:pStyle w:val="ListParagraph"/>
         <w:numPr>
           <w:ilvl w:val="0"/>
-          <w:numId w:val="47"/>
+          <w:numId w:val="49"/>
         </w:numPr>
         <w:spacing w:after="80" w:line="270"/>
       </w:pPr>
@@ -38436,7 +38996,7 @@
         <w:pStyle w:val="ListParagraph"/>
         <w:numPr>
           <w:ilvl w:val="0"/>
-          <w:numId w:val="47"/>
+          <w:numId w:val="49"/>
         </w:numPr>
         <w:spacing w:after="80" w:line="270"/>
       </w:pPr>
@@ -38482,7 +39042,7 @@
         <w:pStyle w:val="ListParagraph"/>
         <w:numPr>
           <w:ilvl w:val="0"/>
-          <w:numId w:val="47"/>
+          <w:numId w:val="49"/>
         </w:numPr>
         <w:spacing w:after="80" w:line="270"/>
       </w:pPr>
@@ -38510,7 +39070,7 @@
         <w:pStyle w:val="ListParagraph"/>
         <w:numPr>
           <w:ilvl w:val="0"/>
-          <w:numId w:val="47"/>
+          <w:numId w:val="49"/>
         </w:numPr>
         <w:spacing w:after="80" w:line="270"/>
       </w:pPr>
@@ -38574,7 +39134,7 @@
         <w:pStyle w:val="ListParagraph"/>
         <w:numPr>
           <w:ilvl w:val="0"/>
-          <w:numId w:val="47"/>
+          <w:numId w:val="49"/>
         </w:numPr>
         <w:spacing w:after="80" w:line="270"/>
       </w:pPr>
@@ -38674,7 +39234,7 @@
         <w:pStyle w:val="ListParagraph"/>
         <w:numPr>
           <w:ilvl w:val="0"/>
-          <w:numId w:val="47"/>
+          <w:numId w:val="49"/>
         </w:numPr>
         <w:spacing w:after="80" w:line="270"/>
       </w:pPr>
@@ -38702,7 +39262,7 @@
         <w:pStyle w:val="ListParagraph"/>
         <w:numPr>
           <w:ilvl w:val="0"/>
-          <w:numId w:val="47"/>
+          <w:numId w:val="49"/>
         </w:numPr>
         <w:spacing w:after="80" w:line="270"/>
       </w:pPr>
@@ -40887,7 +41447,7 @@
         <w:pStyle w:val="ListParagraph"/>
         <w:numPr>
           <w:ilvl w:val="0"/>
-          <w:numId w:val="48"/>
+          <w:numId w:val="50"/>
         </w:numPr>
         <w:spacing w:after="80" w:line="270"/>
       </w:pPr>
@@ -40969,7 +41529,7 @@
         <w:pStyle w:val="ListParagraph"/>
         <w:numPr>
           <w:ilvl w:val="0"/>
-          <w:numId w:val="48"/>
+          <w:numId w:val="50"/>
         </w:numPr>
         <w:spacing w:after="80" w:line="270"/>
       </w:pPr>
@@ -41041,7 +41601,7 @@
         <w:pStyle w:val="ListParagraph"/>
         <w:numPr>
           <w:ilvl w:val="0"/>
-          <w:numId w:val="48"/>
+          <w:numId w:val="50"/>
         </w:numPr>
         <w:spacing w:after="80" w:line="270"/>
       </w:pPr>
@@ -41131,7 +41691,7 @@
         <w:pStyle w:val="ListParagraph"/>
         <w:numPr>
           <w:ilvl w:val="0"/>
-          <w:numId w:val="48"/>
+          <w:numId w:val="50"/>
         </w:numPr>
         <w:spacing w:after="80" w:line="270"/>
       </w:pPr>
@@ -41177,7 +41737,7 @@
         <w:pStyle w:val="ListParagraph"/>
         <w:numPr>
           <w:ilvl w:val="0"/>
-          <w:numId w:val="48"/>
+          <w:numId w:val="50"/>
         </w:numPr>
         <w:spacing w:after="80" w:line="270"/>
       </w:pPr>
@@ -41213,7 +41773,7 @@
         <w:pStyle w:val="ListParagraph"/>
         <w:numPr>
           <w:ilvl w:val="0"/>
-          <w:numId w:val="48"/>
+          <w:numId w:val="50"/>
         </w:numPr>
         <w:spacing w:after="80" w:line="270"/>
       </w:pPr>
@@ -41857,7 +42417,7 @@
         <w:pStyle w:val="ListParagraph"/>
         <w:numPr>
           <w:ilvl w:val="0"/>
-          <w:numId w:val="49"/>
+          <w:numId w:val="51"/>
         </w:numPr>
         <w:spacing w:after="80" w:line="270"/>
       </w:pPr>
@@ -41885,7 +42445,7 @@
         <w:pStyle w:val="ListParagraph"/>
         <w:numPr>
           <w:ilvl w:val="0"/>
-          <w:numId w:val="49"/>
+          <w:numId w:val="51"/>
         </w:numPr>
         <w:spacing w:after="80" w:line="270"/>
       </w:pPr>
@@ -41929,7 +42489,7 @@
         <w:pStyle w:val="ListParagraph"/>
         <w:numPr>
           <w:ilvl w:val="0"/>
-          <w:numId w:val="49"/>
+          <w:numId w:val="51"/>
         </w:numPr>
         <w:spacing w:after="80" w:line="270"/>
       </w:pPr>
@@ -41957,7 +42517,7 @@
         <w:pStyle w:val="ListParagraph"/>
         <w:numPr>
           <w:ilvl w:val="0"/>
-          <w:numId w:val="49"/>
+          <w:numId w:val="51"/>
         </w:numPr>
         <w:spacing w:after="80" w:line="270"/>
       </w:pPr>
@@ -41985,7 +42545,7 @@
         <w:pStyle w:val="ListParagraph"/>
         <w:numPr>
           <w:ilvl w:val="0"/>
-          <w:numId w:val="49"/>
+          <w:numId w:val="51"/>
         </w:numPr>
         <w:spacing w:after="80" w:line="270"/>
       </w:pPr>
@@ -42031,7 +42591,7 @@
         <w:pStyle w:val="ListParagraph"/>
         <w:numPr>
           <w:ilvl w:val="0"/>
-          <w:numId w:val="49"/>
+          <w:numId w:val="51"/>
         </w:numPr>
         <w:spacing w:after="80" w:line="270"/>
       </w:pPr>
@@ -42336,7 +42896,7 @@
         <w:pStyle w:val="ListParagraph"/>
         <w:numPr>
           <w:ilvl w:val="0"/>
-          <w:numId w:val="50"/>
+          <w:numId w:val="52"/>
         </w:numPr>
         <w:spacing w:after="80" w:line="270"/>
       </w:pPr>
@@ -42382,7 +42942,7 @@
         <w:pStyle w:val="ListParagraph"/>
         <w:numPr>
           <w:ilvl w:val="0"/>
-          <w:numId w:val="50"/>
+          <w:numId w:val="52"/>
         </w:numPr>
         <w:spacing w:after="80" w:line="270"/>
       </w:pPr>
@@ -42420,7 +42980,7 @@
         <w:pStyle w:val="ListParagraph"/>
         <w:numPr>
           <w:ilvl w:val="0"/>
-          <w:numId w:val="50"/>
+          <w:numId w:val="52"/>
         </w:numPr>
         <w:spacing w:after="80" w:line="270"/>
       </w:pPr>
@@ -43799,7 +44359,7 @@
         <w:pStyle w:val="ListParagraph"/>
         <w:numPr>
           <w:ilvl w:val="0"/>
-          <w:numId w:val="51"/>
+          <w:numId w:val="53"/>
         </w:numPr>
         <w:spacing w:after="80" w:line="270"/>
       </w:pPr>
@@ -43835,7 +44395,7 @@
         <w:pStyle w:val="ListParagraph"/>
         <w:numPr>
           <w:ilvl w:val="0"/>
-          <w:numId w:val="51"/>
+          <w:numId w:val="53"/>
         </w:numPr>
         <w:spacing w:after="80" w:line="270"/>
       </w:pPr>
@@ -43889,7 +44449,7 @@
         <w:pStyle w:val="ListParagraph"/>
         <w:numPr>
           <w:ilvl w:val="0"/>
-          <w:numId w:val="51"/>
+          <w:numId w:val="53"/>
         </w:numPr>
         <w:spacing w:after="80" w:line="270"/>
       </w:pPr>
@@ -43979,7 +44539,7 @@
         <w:pStyle w:val="ListParagraph"/>
         <w:numPr>
           <w:ilvl w:val="0"/>
-          <w:numId w:val="51"/>
+          <w:numId w:val="53"/>
         </w:numPr>
         <w:spacing w:after="80" w:line="270"/>
       </w:pPr>
@@ -44307,7 +44867,7 @@
         <w:pStyle w:val="ListParagraph"/>
         <w:numPr>
           <w:ilvl w:val="0"/>
-          <w:numId w:val="52"/>
+          <w:numId w:val="54"/>
         </w:numPr>
         <w:spacing w:after="80" w:line="270"/>
       </w:pPr>
@@ -44389,7 +44949,7 @@
         <w:pStyle w:val="ListParagraph"/>
         <w:numPr>
           <w:ilvl w:val="0"/>
-          <w:numId w:val="52"/>
+          <w:numId w:val="54"/>
         </w:numPr>
         <w:spacing w:after="80" w:line="270"/>
       </w:pPr>
@@ -44417,7 +44977,7 @@
         <w:pStyle w:val="ListParagraph"/>
         <w:numPr>
           <w:ilvl w:val="0"/>
-          <w:numId w:val="52"/>
+          <w:numId w:val="54"/>
         </w:numPr>
         <w:spacing w:after="80" w:line="270"/>
       </w:pPr>
@@ -48005,7 +48565,7 @@
         <w:pStyle w:val="ListParagraph"/>
         <w:numPr>
           <w:ilvl w:val="0"/>
-          <w:numId w:val="53"/>
+          <w:numId w:val="55"/>
         </w:numPr>
         <w:spacing w:after="80" w:line="270"/>
       </w:pPr>
@@ -48033,7 +48593,7 @@
         <w:pStyle w:val="ListParagraph"/>
         <w:numPr>
           <w:ilvl w:val="0"/>
-          <w:numId w:val="53"/>
+          <w:numId w:val="55"/>
         </w:numPr>
         <w:spacing w:after="80" w:line="270"/>
       </w:pPr>
@@ -48061,7 +48621,7 @@
         <w:pStyle w:val="ListParagraph"/>
         <w:numPr>
           <w:ilvl w:val="0"/>
-          <w:numId w:val="53"/>
+          <w:numId w:val="55"/>
         </w:numPr>
         <w:spacing w:after="80" w:line="270"/>
       </w:pPr>
@@ -48089,7 +48649,7 @@
         <w:pStyle w:val="ListParagraph"/>
         <w:numPr>
           <w:ilvl w:val="0"/>
-          <w:numId w:val="53"/>
+          <w:numId w:val="55"/>
         </w:numPr>
         <w:spacing w:after="80" w:line="270"/>
       </w:pPr>
@@ -48117,7 +48677,7 @@
         <w:pStyle w:val="ListParagraph"/>
         <w:numPr>
           <w:ilvl w:val="0"/>
-          <w:numId w:val="53"/>
+          <w:numId w:val="55"/>
         </w:numPr>
         <w:spacing w:after="80" w:line="270"/>
       </w:pPr>
@@ -48145,7 +48705,7 @@
         <w:pStyle w:val="ListParagraph"/>
         <w:numPr>
           <w:ilvl w:val="0"/>
-          <w:numId w:val="53"/>
+          <w:numId w:val="55"/>
         </w:numPr>
         <w:spacing w:after="80" w:line="270"/>
       </w:pPr>
@@ -48173,7 +48733,7 @@
         <w:pStyle w:val="ListParagraph"/>
         <w:numPr>
           <w:ilvl w:val="0"/>
-          <w:numId w:val="53"/>
+          <w:numId w:val="55"/>
         </w:numPr>
         <w:spacing w:after="80" w:line="270"/>
       </w:pPr>
@@ -48201,7 +48761,7 @@
         <w:pStyle w:val="ListParagraph"/>
         <w:numPr>
           <w:ilvl w:val="0"/>
-          <w:numId w:val="53"/>
+          <w:numId w:val="55"/>
         </w:numPr>
         <w:spacing w:after="80" w:line="270"/>
       </w:pPr>
@@ -48287,7 +48847,7 @@
         <w:pStyle w:val="ListParagraph"/>
         <w:numPr>
           <w:ilvl w:val="0"/>
-          <w:numId w:val="54"/>
+          <w:numId w:val="56"/>
         </w:numPr>
         <w:spacing w:after="80" w:line="270"/>
       </w:pPr>
@@ -48323,7 +48883,7 @@
         <w:pStyle w:val="ListParagraph"/>
         <w:numPr>
           <w:ilvl w:val="0"/>
-          <w:numId w:val="54"/>
+          <w:numId w:val="56"/>
         </w:numPr>
         <w:spacing w:after="80" w:line="270"/>
       </w:pPr>
@@ -48341,7 +48901,7 @@
         <w:pStyle w:val="ListParagraph"/>
         <w:numPr>
           <w:ilvl w:val="0"/>
-          <w:numId w:val="54"/>
+          <w:numId w:val="56"/>
         </w:numPr>
         <w:spacing w:after="80" w:line="270"/>
       </w:pPr>
@@ -48377,7 +48937,7 @@
         <w:pStyle w:val="ListParagraph"/>
         <w:numPr>
           <w:ilvl w:val="0"/>
-          <w:numId w:val="54"/>
+          <w:numId w:val="56"/>
         </w:numPr>
         <w:spacing w:after="80" w:line="270"/>
       </w:pPr>
@@ -48395,7 +48955,7 @@
         <w:pStyle w:val="ListParagraph"/>
         <w:numPr>
           <w:ilvl w:val="0"/>
-          <w:numId w:val="54"/>
+          <w:numId w:val="56"/>
         </w:numPr>
         <w:spacing w:after="80" w:line="270"/>
       </w:pPr>
@@ -50547,7 +51107,7 @@
         <w:pStyle w:val="ListParagraph"/>
         <w:numPr>
           <w:ilvl w:val="0"/>
-          <w:numId w:val="55"/>
+          <w:numId w:val="57"/>
         </w:numPr>
         <w:spacing w:after="80" w:line="270"/>
       </w:pPr>
@@ -50575,7 +51135,7 @@
         <w:pStyle w:val="ListParagraph"/>
         <w:numPr>
           <w:ilvl w:val="0"/>
-          <w:numId w:val="55"/>
+          <w:numId w:val="57"/>
         </w:numPr>
         <w:spacing w:after="80" w:line="270"/>
       </w:pPr>
@@ -50603,7 +51163,7 @@
         <w:pStyle w:val="ListParagraph"/>
         <w:numPr>
           <w:ilvl w:val="0"/>
-          <w:numId w:val="55"/>
+          <w:numId w:val="57"/>
         </w:numPr>
         <w:spacing w:after="80" w:line="270"/>
       </w:pPr>
@@ -51931,7 +52491,7 @@
         <w:pStyle w:val="ListParagraph"/>
         <w:numPr>
           <w:ilvl w:val="0"/>
-          <w:numId w:val="56"/>
+          <w:numId w:val="58"/>
         </w:numPr>
         <w:spacing w:after="80" w:line="270"/>
       </w:pPr>
@@ -51959,7 +52519,7 @@
         <w:pStyle w:val="ListParagraph"/>
         <w:numPr>
           <w:ilvl w:val="0"/>
-          <w:numId w:val="56"/>
+          <w:numId w:val="58"/>
         </w:numPr>
         <w:spacing w:after="80" w:line="270"/>
       </w:pPr>
@@ -51987,7 +52547,7 @@
         <w:pStyle w:val="ListParagraph"/>
         <w:numPr>
           <w:ilvl w:val="0"/>
-          <w:numId w:val="56"/>
+          <w:numId w:val="58"/>
         </w:numPr>
         <w:spacing w:after="80" w:line="270"/>
       </w:pPr>
@@ -52015,7 +52575,7 @@
         <w:pStyle w:val="ListParagraph"/>
         <w:numPr>
           <w:ilvl w:val="0"/>
-          <w:numId w:val="56"/>
+          <w:numId w:val="58"/>
         </w:numPr>
         <w:spacing w:after="80" w:line="270"/>
       </w:pPr>
@@ -52330,7 +52890,7 @@
         <w:pStyle w:val="ListParagraph"/>
         <w:numPr>
           <w:ilvl w:val="0"/>
-          <w:numId w:val="57"/>
+          <w:numId w:val="59"/>
         </w:numPr>
         <w:spacing w:after="80" w:line="270"/>
       </w:pPr>
@@ -52358,7 +52918,7 @@
         <w:pStyle w:val="ListParagraph"/>
         <w:numPr>
           <w:ilvl w:val="0"/>
-          <w:numId w:val="57"/>
+          <w:numId w:val="59"/>
         </w:numPr>
         <w:spacing w:after="80" w:line="270"/>
       </w:pPr>
@@ -52386,7 +52946,7 @@
         <w:pStyle w:val="ListParagraph"/>
         <w:numPr>
           <w:ilvl w:val="0"/>
-          <w:numId w:val="57"/>
+          <w:numId w:val="59"/>
         </w:numPr>
         <w:spacing w:after="80" w:line="270"/>
       </w:pPr>
@@ -52455,7 +53015,7 @@
         <w:pStyle w:val="ListParagraph"/>
         <w:numPr>
           <w:ilvl w:val="0"/>
-          <w:numId w:val="58"/>
+          <w:numId w:val="60"/>
         </w:numPr>
         <w:spacing w:after="80" w:line="270"/>
       </w:pPr>
@@ -52501,7 +53061,7 @@
         <w:pStyle w:val="ListParagraph"/>
         <w:numPr>
           <w:ilvl w:val="0"/>
-          <w:numId w:val="58"/>
+          <w:numId w:val="60"/>
         </w:numPr>
         <w:spacing w:after="80" w:line="270"/>
       </w:pPr>
@@ -54329,7 +54889,7 @@
         <w:pStyle w:val="ListParagraph"/>
         <w:numPr>
           <w:ilvl w:val="0"/>
-          <w:numId w:val="59"/>
+          <w:numId w:val="61"/>
         </w:numPr>
         <w:spacing w:after="80" w:line="270"/>
       </w:pPr>
@@ -54357,7 +54917,7 @@
         <w:pStyle w:val="ListParagraph"/>
         <w:numPr>
           <w:ilvl w:val="0"/>
-          <w:numId w:val="59"/>
+          <w:numId w:val="61"/>
         </w:numPr>
         <w:spacing w:after="80" w:line="270"/>
       </w:pPr>
@@ -54385,7 +54945,7 @@
         <w:pStyle w:val="ListParagraph"/>
         <w:numPr>
           <w:ilvl w:val="0"/>
-          <w:numId w:val="59"/>
+          <w:numId w:val="61"/>
         </w:numPr>
         <w:spacing w:after="80" w:line="270"/>
       </w:pPr>
@@ -54606,7 +55166,7 @@
         <w:pStyle w:val="ListParagraph"/>
         <w:numPr>
           <w:ilvl w:val="0"/>
-          <w:numId w:val="60"/>
+          <w:numId w:val="62"/>
         </w:numPr>
         <w:spacing w:after="80" w:line="270"/>
       </w:pPr>
@@ -54670,7 +55230,7 @@
         <w:pStyle w:val="ListParagraph"/>
         <w:numPr>
           <w:ilvl w:val="0"/>
-          <w:numId w:val="60"/>
+          <w:numId w:val="62"/>
         </w:numPr>
         <w:spacing w:after="80" w:line="270"/>
       </w:pPr>
@@ -56452,7 +57012,7 @@
         <w:pStyle w:val="ListParagraph"/>
         <w:numPr>
           <w:ilvl w:val="0"/>
-          <w:numId w:val="61"/>
+          <w:numId w:val="63"/>
         </w:numPr>
         <w:spacing w:after="80" w:line="270"/>
       </w:pPr>
@@ -56488,7 +57048,7 @@
         <w:pStyle w:val="ListParagraph"/>
         <w:numPr>
           <w:ilvl w:val="0"/>
-          <w:numId w:val="61"/>
+          <w:numId w:val="63"/>
         </w:numPr>
         <w:spacing w:after="80" w:line="270"/>
       </w:pPr>
@@ -56524,7 +57084,7 @@
         <w:pStyle w:val="ListParagraph"/>
         <w:numPr>
           <w:ilvl w:val="0"/>
-          <w:numId w:val="61"/>
+          <w:numId w:val="63"/>
         </w:numPr>
         <w:spacing w:after="80" w:line="270"/>
       </w:pPr>
@@ -56570,7 +57130,7 @@
         <w:pStyle w:val="ListParagraph"/>
         <w:numPr>
           <w:ilvl w:val="0"/>
-          <w:numId w:val="61"/>
+          <w:numId w:val="63"/>
         </w:numPr>
         <w:spacing w:after="80" w:line="270"/>
       </w:pPr>
@@ -57757,7 +58317,7 @@
         <w:pStyle w:val="ListParagraph"/>
         <w:numPr>
           <w:ilvl w:val="0"/>
-          <w:numId w:val="62"/>
+          <w:numId w:val="64"/>
         </w:numPr>
         <w:spacing w:after="80" w:line="270"/>
       </w:pPr>
@@ -57785,7 +58345,7 @@
         <w:pStyle w:val="ListParagraph"/>
         <w:numPr>
           <w:ilvl w:val="0"/>
-          <w:numId w:val="62"/>
+          <w:numId w:val="64"/>
         </w:numPr>
         <w:spacing w:after="80" w:line="270"/>
       </w:pPr>
@@ -57813,7 +58373,7 @@
         <w:pStyle w:val="ListParagraph"/>
         <w:numPr>
           <w:ilvl w:val="0"/>
-          <w:numId w:val="62"/>
+          <w:numId w:val="64"/>
         </w:numPr>
         <w:spacing w:after="80" w:line="270"/>
       </w:pPr>
@@ -57841,7 +58401,7 @@
         <w:pStyle w:val="ListParagraph"/>
         <w:numPr>
           <w:ilvl w:val="0"/>
-          <w:numId w:val="62"/>
+          <w:numId w:val="64"/>
         </w:numPr>
         <w:spacing w:after="80" w:line="270"/>
       </w:pPr>
@@ -58407,7 +58967,7 @@
     </w:lvlOverride>
   </w:num>
   <w:num w:numId="41">
-    <w:abstractNumId w:val="2"/>
+    <w:abstractNumId w:val="3"/>
     <w:lvlOverride w:ilvl="0">
       <w:startOverride w:val="1"/>
     </w:lvlOverride>
@@ -58419,7 +58979,7 @@
     </w:lvlOverride>
   </w:num>
   <w:num w:numId="43">
-    <w:abstractNumId w:val="3"/>
+    <w:abstractNumId w:val="2"/>
     <w:lvlOverride w:ilvl="0">
       <w:startOverride w:val="1"/>
     </w:lvlOverride>
@@ -58431,7 +58991,7 @@
     </w:lvlOverride>
   </w:num>
   <w:num w:numId="45">
-    <w:abstractNumId w:val="2"/>
+    <w:abstractNumId w:val="3"/>
     <w:lvlOverride w:ilvl="0">
       <w:startOverride w:val="1"/>
     </w:lvlOverride>
@@ -58473,13 +59033,13 @@
     </w:lvlOverride>
   </w:num>
   <w:num w:numId="52">
-    <w:abstractNumId w:val="3"/>
+    <w:abstractNumId w:val="2"/>
     <w:lvlOverride w:ilvl="0">
       <w:startOverride w:val="1"/>
     </w:lvlOverride>
   </w:num>
   <w:num w:numId="53">
-    <w:abstractNumId w:val="3"/>
+    <w:abstractNumId w:val="2"/>
     <w:lvlOverride w:ilvl="0">
       <w:startOverride w:val="1"/>
     </w:lvlOverride>
@@ -58491,7 +59051,7 @@
     </w:lvlOverride>
   </w:num>
   <w:num w:numId="55">
-    <w:abstractNumId w:val="2"/>
+    <w:abstractNumId w:val="3"/>
     <w:lvlOverride w:ilvl="0">
       <w:startOverride w:val="1"/>
     </w:lvlOverride>
@@ -58503,7 +59063,7 @@
     </w:lvlOverride>
   </w:num>
   <w:num w:numId="57">
-    <w:abstractNumId w:val="3"/>
+    <w:abstractNumId w:val="2"/>
     <w:lvlOverride w:ilvl="0">
       <w:startOverride w:val="1"/>
     </w:lvlOverride>
@@ -58533,6 +59093,18 @@
     </w:lvlOverride>
   </w:num>
   <w:num w:numId="62">
+    <w:abstractNumId w:val="3"/>
+    <w:lvlOverride w:ilvl="0">
+      <w:startOverride w:val="1"/>
+    </w:lvlOverride>
+  </w:num>
+  <w:num w:numId="63">
+    <w:abstractNumId w:val="3"/>
+    <w:lvlOverride w:ilvl="0">
+      <w:startOverride w:val="1"/>
+    </w:lvlOverride>
+  </w:num>
+  <w:num w:numId="64">
     <w:abstractNumId w:val="3"/>
     <w:lvlOverride w:ilvl="0">
       <w:startOverride w:val="1"/>

</xml_diff>

<commit_message>
fix(core): 0288 na produção; Dentista e Planner fora do Estoque é de propósito (AP30) — 0.306.1
0288 APLICADA NA PRODUÇÃO (dono, 09/10/2026): gatilho preso em 195 tabelas.
Conferido de fora, só leitura: sem login as funções recusam e ninguém lê a
trilha nem a lista de exclusões; 44 tabelas declaradas fora.

AP30 — RESPOSTA DO DONO: "Foi de propósito. Dentista e Planner não precisam
ver o estoque." A matriz gravada nos dois bancos já estava assim desde 28/09;
quem dizia o contrário era o resto, e foi corrigido:
- permissions.ts: o padrão do módulo Estoque e do consumo avulso deixa de
  incluir dentist e planner_dentist (o "devolver ao padrão" desfaria a decisão);
- screen-rules.mjs: a varredura esperava o Dentista DENTRO do Estoque e
  acusava falha onde a regra estava certa;
- manual: dois perfis, a tabela-resumo e a tabela de ações.
Nada muda na tela.

Supabase Pro renovado até 30/10/2026 (registrado no CLAUDE.md).

Co-Authored-By: Claude Opus 5.5 <noreply@anthropic.com>
</commit_message>
<xml_diff>
--- a/docs/treinamento/Manual-de-Treinamento-riSZon.docx
+++ b/docs/treinamento/Manual-de-Treinamento-riSZon.docx
@@ -21287,7 +21287,7 @@
           <w:sz w:val="21"/>
           <w:szCs w:val="21"/>
         </w:rPr>
-        <w:t xml:space="preserve"> Procedimentos (catálogo), Relatórios, Planos de Tratamento, Estoque (papel clínico).</w:t>
+        <w:t xml:space="preserve"> Procedimentos (catálogo), Relatórios, Planos de Tratamento.</w:t>
       </w:r>
     </w:p>
     <w:p>
@@ -21307,15 +21307,15 @@
           <w:sz w:val="21"/>
           <w:szCs w:val="21"/>
         </w:rPr>
-        <w:t xml:space="preserve">Não pode:</w:t>
-      </w:r>
-      <w:r>
-        <w:rPr>
-          <w:color w:val="23293D"/>
-          <w:sz w:val="21"/>
-          <w:szCs w:val="21"/>
-        </w:rPr>
-        <w:t xml:space="preserve"> avaliar paciente, agendar, negociar.</w:t>
+        <w:t xml:space="preserve">Não vê:</w:t>
+      </w:r>
+      <w:r>
+        <w:rPr>
+          <w:color w:val="23293D"/>
+          <w:sz w:val="21"/>
+          <w:szCs w:val="21"/>
+        </w:rPr>
+        <w:t xml:space="preserve"> Estoque (de propósito: material é com o Coordenador, a TSB e a ASB).</w:t>
       </w:r>
     </w:p>
     <w:p>
@@ -21335,15 +21335,15 @@
           <w:sz w:val="21"/>
           <w:szCs w:val="21"/>
         </w:rPr>
-        <w:t xml:space="preserve">Riscos:</w:t>
-      </w:r>
-      <w:r>
-        <w:rPr>
-          <w:color w:val="23293D"/>
-          <w:sz w:val="21"/>
-          <w:szCs w:val="21"/>
-        </w:rPr>
-        <w:t xml:space="preserve"> enviar ao Comercial sem aprovação — o sistema barra.</w:t>
+        <w:t xml:space="preserve">Não pode:</w:t>
+      </w:r>
+      <w:r>
+        <w:rPr>
+          <w:color w:val="23293D"/>
+          <w:sz w:val="21"/>
+          <w:szCs w:val="21"/>
+        </w:rPr>
+        <w:t xml:space="preserve"> avaliar paciente, agendar, negociar.</w:t>
       </w:r>
     </w:p>
     <w:p>
@@ -21363,6 +21363,34 @@
           <w:sz w:val="21"/>
           <w:szCs w:val="21"/>
         </w:rPr>
+        <w:t xml:space="preserve">Riscos:</w:t>
+      </w:r>
+      <w:r>
+        <w:rPr>
+          <w:color w:val="23293D"/>
+          <w:sz w:val="21"/>
+          <w:szCs w:val="21"/>
+        </w:rPr>
+        <w:t xml:space="preserve"> enviar ao Comercial sem aprovação — o sistema barra.</w:t>
+      </w:r>
+    </w:p>
+    <w:p>
+      <w:pPr>
+        <w:pStyle w:val="ListParagraph"/>
+        <w:numPr>
+          <w:ilvl w:val="0"/>
+          <w:numId w:val="22"/>
+        </w:numPr>
+        <w:spacing w:after="80" w:line="270"/>
+      </w:pPr>
+      <w:r>
+        <w:rPr>
+          <w:b/>
+          <w:bCs/>
+          <w:color w:val="23293D"/>
+          <w:sz w:val="21"/>
+          <w:szCs w:val="21"/>
+        </w:rPr>
         <w:t xml:space="preserve">Depende de:</w:t>
       </w:r>
       <w:r>
@@ -21528,7 +21556,7 @@
           <w:sz w:val="21"/>
           <w:szCs w:val="21"/>
         </w:rPr>
-        <w:t xml:space="preserve"> ver a agenda dele, chamar o paciente, escrever o Desenvolvimento Clínico e concluir o atendimento; consumo avulso de estoque.</w:t>
+        <w:t xml:space="preserve"> ver a agenda dele, chamar o paciente, escrever o Desenvolvimento Clínico e concluir o atendimento.</w:t>
       </w:r>
     </w:p>
     <w:p>
@@ -21556,7 +21584,25 @@
           <w:sz w:val="21"/>
           <w:szCs w:val="21"/>
         </w:rPr>
-        <w:t xml:space="preserve"> Financeiro, Comercial, Compras, Relatórios.</w:t>
+        <w:t xml:space="preserve"> Financeiro, Comercial, Compras, Relatórios, </w:t>
+      </w:r>
+      <w:r>
+        <w:rPr>
+          <w:b/>
+          <w:bCs/>
+          <w:color w:val="23293D"/>
+          <w:sz w:val="21"/>
+          <w:szCs w:val="21"/>
+        </w:rPr>
+        <w:t xml:space="preserve">Estoque</w:t>
+      </w:r>
+      <w:r>
+        <w:rPr>
+          <w:color w:val="23293D"/>
+          <w:sz w:val="21"/>
+          <w:szCs w:val="21"/>
+        </w:rPr>
+        <w:t xml:space="preserve"> (de propósito: o material do procedimento é baixado sozinho ao concluir a sessão; o que sair fora do previsto é lançado pela TSB, pela ASB ou pelo Coordenador).</w:t>
       </w:r>
     </w:p>
     <w:p>
@@ -26123,7 +26169,7 @@
                 <w:sz w:val="20"/>
                 <w:szCs w:val="20"/>
               </w:rPr>
-              <w:t xml:space="preserve">SIM</w:t>
+              <w:t xml:space="preserve">não</w:t>
             </w:r>
           </w:p>
         </w:tc>
@@ -26535,7 +26581,7 @@
                 <w:sz w:val="20"/>
                 <w:szCs w:val="20"/>
               </w:rPr>
-              <w:t xml:space="preserve">SIM</w:t>
+              <w:t xml:space="preserve">não</w:t>
             </w:r>
           </w:p>
         </w:tc>
@@ -28094,7 +28140,7 @@
                 <w:sz w:val="20"/>
                 <w:szCs w:val="20"/>
               </w:rPr>
-              <w:t xml:space="preserve">+ Dentista, Coordenador, Planner, TSB, ASB</w:t>
+              <w:t xml:space="preserve">+ Coordenador, TSB, ASB</w:t>
             </w:r>
           </w:p>
         </w:tc>

</xml_diff>